<commit_message>
feat: Mejorar voz peruana CamilaNeural, menu hamburguesa, exportar chat y docx
</commit_message>
<xml_diff>
--- a/INFORME_TECNICO_HERCARBOT.docx
+++ b/INFORME_TECNICO_HERCARBOT.docx
@@ -1612,7 +1612,7 @@
           <w:color w:val="2563EB"/>
           <w:sz w:val="25"/>
         </w:rPr>
-        <w:t>Fase 4: Motor de Voz Dulce Femenina y Dictado por Micrófono</w:t>
+        <w:t>Fase 4: Motor de Voz Femenina Neural Peruana y Dictado por Micrófono</w:t>
       </w:r>
     </w:p>
     <w:p>
@@ -1626,14 +1626,14 @@
           <w:b/>
           <w:sz w:val="21"/>
         </w:rPr>
-        <w:t xml:space="preserve">Síntesis Neural con Edge-TTS: </w:t>
+        <w:t xml:space="preserve">Voz Neural Camila (Perú): </w:t>
       </w:r>
       <w:r>
         <w:rPr>
           <w:rFonts w:ascii="Arial" w:hAnsi="Arial"/>
           <w:sz w:val="21"/>
         </w:rPr>
-        <w:t>Se integró la voz es-ES-ElviraNeural mediante un microservicio Python (server.py) para ofrecer locución humana, natural y amigable.</w:t>
+        <w:t>Se adoptó como estándar principal es-PE-CamilaNeural a través de Microsoft Edge TTS, garantizando una entonación dulce, natural y con fonética propia del Perú para la comunidad de Paita y Piura.</w:t>
       </w:r>
     </w:p>
     <w:p>
@@ -1647,14 +1647,35 @@
           <w:b/>
           <w:sz w:val="21"/>
         </w:rPr>
-        <w:t xml:space="preserve">Fallback Offline Inteligente: </w:t>
+        <w:t xml:space="preserve">Normalización Fonética Especializada: </w:t>
       </w:r>
       <w:r>
         <w:rPr>
           <w:rFonts w:ascii="Arial" w:hAnsi="Arial"/>
           <w:sz w:val="21"/>
         </w:rPr>
-        <w:t>En caso de ejecutarse en la web o sin servidor local, el sistema conmuta automáticamente a la Web Speech API del navegador buscando voces femeninas en español (Google, Microsoft Sabina o Paulina).</w:t>
+        <w:t>Se incorporó un preprocesador que traduce siglas antes de la síntesis (I.E.S.T.P. a "Instituto", S/ 150 a "150 soles", APSTI a "A P S T I"), eliminando pausas forzadas o lecturas fragmentadas.</w:t>
+      </w:r>
+    </w:p>
+    <w:p>
+      <w:pPr>
+        <w:pStyle w:val="ListBullet"/>
+        <w:spacing w:after="60" w:line="276" w:lineRule="auto"/>
+      </w:pPr>
+      <w:r>
+        <w:rPr>
+          <w:rFonts w:ascii="Arial" w:hAnsi="Arial"/>
+          <w:b/>
+          <w:sz w:val="21"/>
+        </w:rPr>
+        <w:t xml:space="preserve">Segmentación Inteligente por Expresiones Regulares: </w:t>
+      </w:r>
+      <w:r>
+        <w:rPr>
+          <w:rFonts w:ascii="Arial" w:hAnsi="Arial"/>
+          <w:sz w:val="21"/>
+        </w:rPr>
+        <w:t>Se reemplazó la división simplista por puntos por un parser de oraciones completas que une frases coherentes hasta 320 caracteres, garantizando fluidez total.</w:t>
       </w:r>
     </w:p>
     <w:p>
@@ -1710,7 +1731,105 @@
           <w:color w:val="2563EB"/>
           <w:sz w:val="25"/>
         </w:rPr>
-        <w:t>Fase 5: Optimización, Pruebas y Despliegue en la Nube</w:t>
+        <w:t>Fase 5: Navegación Adaptativa y Control de Conversación</w:t>
+      </w:r>
+    </w:p>
+    <w:p>
+      <w:pPr>
+        <w:pStyle w:val="ListBullet"/>
+        <w:spacing w:after="60" w:line="276" w:lineRule="auto"/>
+      </w:pPr>
+      <w:r>
+        <w:rPr>
+          <w:rFonts w:ascii="Arial" w:hAnsi="Arial"/>
+          <w:b/>
+          <w:sz w:val="21"/>
+        </w:rPr>
+        <w:t xml:space="preserve">Menú Responsivo de 3 Líneas: </w:t>
+      </w:r>
+      <w:r>
+        <w:rPr>
+          <w:rFonts w:ascii="Arial" w:hAnsi="Arial"/>
+          <w:sz w:val="21"/>
+        </w:rPr>
+        <w:t>En pantallas de escritorio (Desktop), el botón de 3 líneas colapsa suavemente el menú lateral hacia la izquierda (-280px), otorgando el 100% de la pantalla al chat conversacional estilo ChatGPT. En dispositivos móviles y tabletas, despliega un cajón lateral (Drawer) con telón oscuro translúcido (overlay) y botón de cierre táctil.</w:t>
+      </w:r>
+    </w:p>
+    <w:p>
+      <w:pPr>
+        <w:pStyle w:val="ListBullet"/>
+        <w:spacing w:after="60" w:line="276" w:lineRule="auto"/>
+      </w:pPr>
+      <w:r>
+        <w:rPr>
+          <w:rFonts w:ascii="Arial" w:hAnsi="Arial"/>
+          <w:b/>
+          <w:sz w:val="21"/>
+        </w:rPr>
+        <w:t xml:space="preserve">Función Guardar Registro de Chat: </w:t>
+      </w:r>
+      <w:r>
+        <w:rPr>
+          <w:rFonts w:ascii="Arial" w:hAnsi="Arial"/>
+          <w:sz w:val="21"/>
+        </w:rPr>
+        <w:t>Permite al usuario descargar con un solo clic un archivo formal (.txt) con la transcripción completa de su diálogo, fecha, hora y encabezados institucionales para su archivo personal.</w:t>
+      </w:r>
+    </w:p>
+    <w:p>
+      <w:pPr>
+        <w:pStyle w:val="ListBullet"/>
+        <w:spacing w:after="60" w:line="276" w:lineRule="auto"/>
+      </w:pPr>
+      <w:r>
+        <w:rPr>
+          <w:rFonts w:ascii="Arial" w:hAnsi="Arial"/>
+          <w:b/>
+          <w:sz w:val="21"/>
+        </w:rPr>
+        <w:t xml:space="preserve">Función Borrar Conversación: </w:t>
+      </w:r>
+      <w:r>
+        <w:rPr>
+          <w:rFonts w:ascii="Arial" w:hAnsi="Arial"/>
+          <w:sz w:val="21"/>
+        </w:rPr>
+        <w:t>Botón con confirmación interactiva para limpiar la pantalla de chat, restablecer el estado del sistema y regresar a la portada de bienvenida.</w:t>
+      </w:r>
+    </w:p>
+    <w:p>
+      <w:pPr>
+        <w:pStyle w:val="ListBullet"/>
+        <w:spacing w:after="60" w:line="276" w:lineRule="auto"/>
+      </w:pPr>
+      <w:r>
+        <w:rPr>
+          <w:rFonts w:ascii="Arial" w:hAnsi="Arial"/>
+          <w:b/>
+          <w:sz w:val="21"/>
+        </w:rPr>
+        <w:t xml:space="preserve">Historial de Consultas Recientes: </w:t>
+      </w:r>
+      <w:r>
+        <w:rPr>
+          <w:rFonts w:ascii="Arial" w:hAnsi="Arial"/>
+          <w:sz w:val="21"/>
+        </w:rPr>
+        <w:t>Almacenamiento persistente en localStorage que registra las preguntas formuladas y permite relanzarlas rápidamente desde la barra lateral.</w:t>
+      </w:r>
+    </w:p>
+    <w:p>
+      <w:pPr>
+        <w:spacing w:before="240" w:after="80"/>
+      </w:pPr>
+      <w:r>
+        <w:rPr>
+          <w:rFonts w:ascii="Arial" w:hAnsi="Arial"/>
+          <w:b/>
+          <w:color w:val="2563EB"/>
+          <w:sz w:val="25"/>
+        </w:rPr>
+        <w:t>Fase 6: Optimización, Pruebas y Despliegue en la Nube</w:t>
       </w:r>
     </w:p>
     <w:p>

</xml_diff>

<commit_message>
feat: Humanizar respuestas, pronunciacion APSTI sin asteriscos, enlaces oficiales biblioteca y responsive movil
</commit_message>
<xml_diff>
--- a/INFORME_TECNICO_HERCARBOT.docx
+++ b/INFORME_TECNICO_HERCARBOT.docx
@@ -1820,6 +1820,48 @@
     </w:p>
     <w:p>
       <w:pPr>
+        <w:pStyle w:val="ListBullet"/>
+        <w:spacing w:after="60" w:line="276" w:lineRule="auto"/>
+      </w:pPr>
+      <w:r>
+        <w:rPr>
+          <w:rFonts w:ascii="Arial" w:hAnsi="Arial"/>
+          <w:b/>
+          <w:sz w:val="21"/>
+        </w:rPr>
+        <w:t xml:space="preserve">Enlaces Directos a Plataformas Oficiales: </w:t>
+      </w:r>
+      <w:r>
+        <w:rPr>
+          <w:rFonts w:ascii="Arial" w:hAnsi="Arial"/>
+          <w:sz w:val="21"/>
+        </w:rPr>
+        <w:t>Acceso inmediato en cabecera y portada a la Biblioteca Virtual (biblioteca.ieshercar.edu.pe), Portal Web Oficial (ieshercar.edu.pe), Sistema de Pagos y Vouchers (pagos.ieshercar.edu.pe), Mesa de Partes Virtual y Consulta de Boletas Electrónicas.</w:t>
+      </w:r>
+    </w:p>
+    <w:p>
+      <w:pPr>
+        <w:pStyle w:val="ListBullet"/>
+        <w:spacing w:after="60" w:line="276" w:lineRule="auto"/>
+      </w:pPr>
+      <w:r>
+        <w:rPr>
+          <w:rFonts w:ascii="Arial" w:hAnsi="Arial"/>
+          <w:b/>
+          <w:sz w:val="21"/>
+        </w:rPr>
+        <w:t xml:space="preserve">Optimización Táctil para Celulares: </w:t>
+      </w:r>
+      <w:r>
+        <w:rPr>
+          <w:rFonts w:ascii="Arial" w:hAnsi="Arial"/>
+          <w:sz w:val="21"/>
+        </w:rPr>
+        <w:t>Adaptación del viewport (100dvh) para teléfonos móviles, cuadrícula responsiva a una sola columna y accesibilidad completa desde cualquier smartphone.</w:t>
+      </w:r>
+    </w:p>
+    <w:p>
+      <w:pPr>
         <w:spacing w:before="240" w:after="80"/>
       </w:pPr>
       <w:r>
@@ -1885,7 +1927,7 @@
           <w:color w:val="13357B"/>
           <w:sz w:val="30"/>
         </w:rPr>
-        <w:t>7. GUÍA DE INSTALACIÓN Y ACCESO</w:t>
+        <w:t>7. GUÍA DE INSTALACIÓN Y ENLACES INSTITUCIONALES</w:t>
       </w:r>
     </w:p>
     <w:p>
@@ -1940,6 +1982,90 @@
           <w:sz w:val="21"/>
         </w:rPr>
         <w:t>Disponible en cualquier dispositivo a través de https://gmph2007.github.io/HercarBOT/</w:t>
+      </w:r>
+    </w:p>
+    <w:p>
+      <w:pPr>
+        <w:pStyle w:val="ListBullet"/>
+        <w:spacing w:after="60" w:line="276" w:lineRule="auto"/>
+      </w:pPr>
+      <w:r>
+        <w:rPr>
+          <w:rFonts w:ascii="Arial" w:hAnsi="Arial"/>
+          <w:b/>
+          <w:sz w:val="21"/>
+        </w:rPr>
+        <w:t xml:space="preserve">Biblioteca Virtual Institucional: </w:t>
+      </w:r>
+      <w:r>
+        <w:rPr>
+          <w:rFonts w:ascii="Arial" w:hAnsi="Arial"/>
+          <w:sz w:val="21"/>
+        </w:rPr>
+        <w:t>https://biblioteca.ieshercar.edu.pe/login.php</w:t>
+      </w:r>
+    </w:p>
+    <w:p>
+      <w:pPr>
+        <w:pStyle w:val="ListBullet"/>
+        <w:spacing w:after="60" w:line="276" w:lineRule="auto"/>
+      </w:pPr>
+      <w:r>
+        <w:rPr>
+          <w:rFonts w:ascii="Arial" w:hAnsi="Arial"/>
+          <w:b/>
+          <w:sz w:val="21"/>
+        </w:rPr>
+        <w:t xml:space="preserve">Plataforma de Pagos y Vouchers: </w:t>
+      </w:r>
+      <w:r>
+        <w:rPr>
+          <w:rFonts w:ascii="Arial" w:hAnsi="Arial"/>
+          <w:sz w:val="21"/>
+        </w:rPr>
+        <w:t>https://pagos.ieshercar.edu.pe/</w:t>
+      </w:r>
+    </w:p>
+    <w:p>
+      <w:pPr>
+        <w:pStyle w:val="ListBullet"/>
+        <w:spacing w:after="60" w:line="276" w:lineRule="auto"/>
+      </w:pPr>
+      <w:r>
+        <w:rPr>
+          <w:rFonts w:ascii="Arial" w:hAnsi="Arial"/>
+          <w:b/>
+          <w:sz w:val="21"/>
+        </w:rPr>
+        <w:t xml:space="preserve">Mesa de Partes Virtual: </w:t>
+      </w:r>
+      <w:r>
+        <w:rPr>
+          <w:rFonts w:ascii="Arial" w:hAnsi="Arial"/>
+          <w:sz w:val="21"/>
+        </w:rPr>
+        <w:t>https://sistema.ieshercar.edu.pe/registro-tramite/</w:t>
+      </w:r>
+    </w:p>
+    <w:p>
+      <w:pPr>
+        <w:pStyle w:val="ListBullet"/>
+        <w:spacing w:after="60" w:line="276" w:lineRule="auto"/>
+      </w:pPr>
+      <w:r>
+        <w:rPr>
+          <w:rFonts w:ascii="Arial" w:hAnsi="Arial"/>
+          <w:b/>
+          <w:sz w:val="21"/>
+        </w:rPr>
+        <w:t xml:space="preserve">Consulta de Boletas: </w:t>
+      </w:r>
+      <w:r>
+        <w:rPr>
+          <w:rFonts w:ascii="Arial" w:hAnsi="Arial"/>
+          <w:sz w:val="21"/>
+        </w:rPr>
+        <w:t>https://sistema.ieshercar.com/Consulta_Boletas/index.php</w:t>
       </w:r>
     </w:p>
     <w:sectPr>

</xml_diff>

<commit_message>
v4.0 Final: HercarIA humanizada, voz dulce natural, informe técnico APSTI y ergonomía UI (INFORME_TECNICO_HERCARBOT.docx)
</commit_message>
<xml_diff>
--- a/INFORME_TECNICO_HERCARBOT.docx
+++ b/INFORME_TECNICO_HERCARBOT.docx
@@ -4,7 +4,7 @@
   <w:body>
     <w:p>
       <w:pPr>
-        <w:spacing w:after="500"/>
+        <w:spacing w:after="400"/>
         <w:jc w:val="center"/>
       </w:pPr>
       <w:r>
@@ -26,7 +26,7 @@
     </w:p>
     <w:p>
       <w:pPr>
-        <w:spacing w:after="500"/>
+        <w:spacing w:after="400"/>
         <w:jc w:val="center"/>
       </w:pPr>
       <w:r>
@@ -66,7 +66,7 @@
     </w:p>
     <w:p>
       <w:pPr>
-        <w:spacing w:after="200"/>
+        <w:spacing w:after="160"/>
         <w:jc w:val="center"/>
       </w:pPr>
       <w:r>
@@ -81,12 +81,13 @@
     </w:p>
     <w:p>
       <w:pPr>
-        <w:spacing w:after="900"/>
+        <w:spacing w:after="500"/>
         <w:jc w:val="center"/>
       </w:pPr>
       <w:r>
         <w:rPr>
           <w:rFonts w:ascii="Arial" w:hAnsi="Arial"/>
+          <w:b/>
           <w:color w:val="2563EB"/>
           <w:sz w:val="27"/>
         </w:rPr>
@@ -102,13 +103,33 @@
       <w:r>
         <w:rPr>
           <w:b/>
-          <w:sz w:val="22"/>
+          <w:color w:val="13357B"/>
+          <w:sz w:val="21"/>
         </w:rPr>
-        <w:t>Autor / Desarrollador:</w:t>
+        <w:t>CARRERA PROFESIONAL TÉCNICA:</w:t>
         <w:br/>
       </w:r>
       <w:r>
         <w:rPr>
+          <w:b/>
+          <w:color w:val="2563EB"/>
+          <w:sz w:val="23"/>
+        </w:rPr>
+        <w:t>Arquitectura de Plataformas y Servicios de Tecnologías de la Información (APSTI)</w:t>
+        <w:br/>
+        <w:br/>
+      </w:r>
+      <w:r>
+        <w:rPr>
+          <w:b/>
+          <w:sz w:val="21"/>
+        </w:rPr>
+        <w:t>AUTOR / DESARROLLADOR:</w:t>
+        <w:br/>
+      </w:r>
+      <w:r>
+        <w:rPr>
+          <w:b/>
           <w:sz w:val="24"/>
         </w:rPr>
         <w:t>Gerson Misael Pintado Huamán (GMPH2007)</w:t>
@@ -118,15 +139,15 @@
       <w:r>
         <w:rPr>
           <w:b/>
-          <w:sz w:val="20"/>
+          <w:sz w:val="19"/>
         </w:rPr>
-        <w:t>Repositorio Oficial en GitHub:</w:t>
+        <w:t>REPOSITORIO OFICIAL EN GITHUB:</w:t>
         <w:br/>
       </w:r>
       <w:r>
         <w:rPr>
           <w:color w:val="2563EB"/>
-          <w:sz w:val="20"/>
+          <w:sz w:val="19"/>
         </w:rPr>
         <w:t>https://github.com/GMPH2007/HercarBOT</w:t>
         <w:br/>
@@ -135,15 +156,15 @@
       <w:r>
         <w:rPr>
           <w:b/>
-          <w:sz w:val="20"/>
+          <w:sz w:val="19"/>
         </w:rPr>
-        <w:t>Despliegue Web en Vivo (GitHub Pages):</w:t>
+        <w:t>DESPLIEGUE WEB EN VIVO (GITHUB PAGES):</w:t>
         <w:br/>
       </w:r>
       <w:r>
         <w:rPr>
           <w:color w:val="2563EB"/>
-          <w:sz w:val="20"/>
+          <w:sz w:val="19"/>
         </w:rPr>
         <w:t>https://gmph2007.github.io/HercarBOT/</w:t>
         <w:br/>
@@ -174,7 +195,7 @@
           <w:rFonts w:ascii="Arial" w:hAnsi="Arial"/>
           <w:b/>
           <w:color w:val="13357B"/>
-          <w:sz w:val="30"/>
+          <w:sz w:val="28"/>
         </w:rPr>
         <w:t>1. RESUMEN EJECUTIVO</w:t>
       </w:r>
@@ -186,9 +207,10 @@
       <w:r>
         <w:rPr>
           <w:rFonts w:ascii="Arial" w:hAnsi="Arial"/>
+          <w:color w:val="1E293B"/>
           <w:sz w:val="21"/>
         </w:rPr>
-        <w:t>El presente documento técnico describe el diseño, arquitectura, desarrollo y puesta en producción de "HercarIA", el sistema interactivo de inteligencia artificial y orientación vocacional creado para el Instituto de Educación Superior Tecnológico Público "Hermanos Cárcamo" de Paita.</w:t>
+        <w:t>El presente informe técnico expone la concepción, fundamentación técnica, desarrollo e implementación del sistema "HercarIA", un asistente virtual conversacional inteligente dotado de síntesis de voz femenina neural humana y orientador vocacional psicométrico, concebido específicamente para el Instituto de Educación Superior Tecnológico Público "Hermanos Cárcamo" de Paita.</w:t>
       </w:r>
     </w:p>
     <w:p>
@@ -198,9 +220,23 @@
       <w:r>
         <w:rPr>
           <w:rFonts w:ascii="Arial" w:hAnsi="Arial"/>
+          <w:color w:val="1E293B"/>
           <w:sz w:val="21"/>
         </w:rPr>
-        <w:t>HercarIA proporciona atención continua y personalizada a postulantes, alumnos regulares y padres de familia a través de una interfaz moderna inspirada en ChatGPT, integrando capacidades de procesamiento de lenguaje natural (NLP), síntesis de voz femenina neural humana (es-ES-ElviraNeural), reconocimiento por micrófono (Speech-to-Text), un algoritmo de test vocacional de 6 reactivos y una base de conocimientos completa que resuelve dudas sobre admisiones, carreras técnicas, gratuidad educativa y registro digital de vouchers.</w:t>
+        <w:t>Desarrollado en el marco formativo de la Carrera Profesional Técnica de Arquitectura de Plataformas y Servicios de Tecnologías de la Información (APSTI), HercarIA solventa la brecha de orientación académica en la provincia de Paita y el norte peruano. Ofrece atención ininterrumpida las 24 horas del día, los 7 días de la semana, informando verazmente sobre la oferta formativa institucional (APSTI, Administración de Negocios Internacionales, Contabilidad y Desarrollo Pesquero y Acuícola), el principio de gratuidad de la enseñanza pública (sin mensualidades privadas), los protocolos de registro digital de vouchers del Banco de la Nación, requisitos de admisión y el trámite de documentos oficiales a través de la Mesa de Partes Virtual.</w:t>
+      </w:r>
+    </w:p>
+    <w:p>
+      <w:pPr>
+        <w:spacing w:after="120" w:line="276" w:lineRule="auto"/>
+      </w:pPr>
+      <w:r>
+        <w:rPr>
+          <w:rFonts w:ascii="Arial" w:hAnsi="Arial"/>
+          <w:color w:val="1E293B"/>
+          <w:sz w:val="21"/>
+        </w:rPr>
+        <w:t>La solución se distingue por su arquitectura ligera y moderna inspirada en ChatGPT, con menú colapsable, controles ergonómicos en cabecera ("Guardar Chat" en archivo de texto formal y "Borrar Chat"), barra de píldoras de acceso rápido sobre el campo de escritura, y un avanzado motor de voz sintetizada dulce, natural y libre de lecturas robóticas de sintaxis Markdown.</w:t>
       </w:r>
     </w:p>
     <w:p>
@@ -212,9 +248,9 @@
           <w:rFonts w:ascii="Arial" w:hAnsi="Arial"/>
           <w:b/>
           <w:color w:val="13357B"/>
-          <w:sz w:val="30"/>
+          <w:sz w:val="28"/>
         </w:rPr>
-        <w:t>2. PLANTEAMIENTO DEL PROBLEMA Y JUSTIFICACIÓN</w:t>
+        <w:t>2. PLANTEAMIENTO DEL PROBLEMA Y JUSTIFICACIÓN EN PAITA</w:t>
       </w:r>
     </w:p>
     <w:p>
@@ -224,9 +260,10 @@
       <w:r>
         <w:rPr>
           <w:rFonts w:ascii="Arial" w:hAnsi="Arial"/>
+          <w:color w:val="1E293B"/>
           <w:sz w:val="21"/>
         </w:rPr>
-        <w:t>En la provincia de Paita existe una alta demanda de profesionales técnicos calificados para los sectores pesquero, logístico-portuario, comercial y tecnológico. No obstante, los egresados de secundaria enfrentan barreras informativas críticas:</w:t>
+        <w:t>La provincia de Paita constituye el segundo polo económico y comercial más relevante de la Región Piura, albergando el principal puerto marítimo del norte peruano (Terminal Portuario Euroandinos), una pujante industria pesquera y acuícola, centros logísticos aduaneros y agroexportadores. Pese a este entorno favorable, los egresados de educación secundaria y jóvenes de la región enfrentan serias dificultades al momento de decidir su formación superior:</w:t>
       </w:r>
     </w:p>
     <w:p>
@@ -238,16 +275,18 @@
         <w:rPr>
           <w:rFonts w:ascii="Arial" w:hAnsi="Arial"/>
           <w:b/>
+          <w:color w:val="1E293B"/>
           <w:sz w:val="21"/>
         </w:rPr>
-        <w:t xml:space="preserve">Indecisión Vocacional: </w:t>
+        <w:t xml:space="preserve">Desinformación sobre la Gratuidad Pública: </w:t>
       </w:r>
       <w:r>
         <w:rPr>
           <w:rFonts w:ascii="Arial" w:hAnsi="Arial"/>
+          <w:color w:val="1E293B"/>
           <w:sz w:val="21"/>
         </w:rPr>
-        <w:t>Falta de un orientador vocacional accesible que guíe las aptitudes del postulante hacia una carrera técnica con inserción laboral real.</w:t>
+        <w:t>Gran parte de los postulantes y padres de familia confunden al instituto con una entidad privada lucrativa, asumiendo erróneamente que deberán afrontar costosas pensiones mensuales. HercarIA aclara permanentemente que el IESTP Hermanos Cárcamo es 100% público estatal y que solo se abona una tasa semestral mínima por concepto de TUPA.</w:t>
       </w:r>
     </w:p>
     <w:p>
@@ -259,16 +298,18 @@
         <w:rPr>
           <w:rFonts w:ascii="Arial" w:hAnsi="Arial"/>
           <w:b/>
+          <w:color w:val="1E293B"/>
           <w:sz w:val="21"/>
         </w:rPr>
-        <w:t xml:space="preserve">Horarios Restringidos de Atención: </w:t>
+        <w:t xml:space="preserve">Indecisión Vocacional y Deserción Prematura: </w:t>
       </w:r>
       <w:r>
         <w:rPr>
           <w:rFonts w:ascii="Arial" w:hAnsi="Arial"/>
+          <w:color w:val="1E293B"/>
           <w:sz w:val="21"/>
         </w:rPr>
-        <w:t>Las consultas presenciales en secretaría solo se realizan en horario diurno de lunes a viernes (8:00 AM a 3:00 PM), dejando sin soporte a quienes estudian o trabajan.</w:t>
+        <w:t>Muchos aspirantes carecen de test vocacionales cercanos y accesibles, postulando a carreras que no concuerdan con sus habilidades reales. El test vocacional integrado de 6 reactivos orienta objetivamente el perfil del estudiante hacia las necesidades laborales reales de Paita.</w:t>
       </w:r>
     </w:p>
     <w:p>
@@ -280,16 +321,18 @@
         <w:rPr>
           <w:rFonts w:ascii="Arial" w:hAnsi="Arial"/>
           <w:b/>
+          <w:color w:val="1E293B"/>
           <w:sz w:val="21"/>
         </w:rPr>
-        <w:t xml:space="preserve">Confusión con Instituciones Privadas: </w:t>
+        <w:t xml:space="preserve">Restricción Horaria en Mesa de Partes y Secretaría: </w:t>
       </w:r>
       <w:r>
         <w:rPr>
           <w:rFonts w:ascii="Arial" w:hAnsi="Arial"/>
+          <w:color w:val="1E293B"/>
           <w:sz w:val="21"/>
         </w:rPr>
-        <w:t>Muchos aspirantes desconocen que el IESTP Hermanos Cárcamo es un instituto público estatal donde la enseñanza es 100% gratuita (sin pensiones mensuales privadas), requiriendo únicamente el abono de una tasa administrativa semestral.</w:t>
+        <w:t>La atención administrativa presencial concluye a las 3:00 PM de lunes a viernes, imposibilitando la resolución de dudas en horario vespertino, nocturno o fines de semana.</w:t>
       </w:r>
     </w:p>
     <w:p>
@@ -301,16 +344,18 @@
         <w:rPr>
           <w:rFonts w:ascii="Arial" w:hAnsi="Arial"/>
           <w:b/>
+          <w:color w:val="1E293B"/>
           <w:sz w:val="21"/>
         </w:rPr>
-        <w:t xml:space="preserve">Dificultades en el Registro de Pagos: </w:t>
+        <w:t xml:space="preserve">Complejidad en el Registro Virtual de Pagos: </w:t>
       </w:r>
       <w:r>
         <w:rPr>
           <w:rFonts w:ascii="Arial" w:hAnsi="Arial"/>
+          <w:color w:val="1E293B"/>
           <w:sz w:val="21"/>
         </w:rPr>
-        <w:t>El uso de la plataforma digital institucional (pagos.ieshercar.edu.pe) genera dudas sobre el registro de códigos de operación del Banco de la Nación y la descarga de boletas electrónicas.</w:t>
+        <w:t>El uso de la plataforma digital institucional (pagos.ieshercar.edu.pe) suscita dudas continuas respecto a qué números consignar del voucher del Banco de la Nación, cómo adjuntar el comprobante y de qué forma descargar la boleta electrónica oficial.</w:t>
       </w:r>
     </w:p>
     <w:p>
@@ -322,9 +367,9 @@
           <w:rFonts w:ascii="Arial" w:hAnsi="Arial"/>
           <w:b/>
           <w:color w:val="13357B"/>
-          <w:sz w:val="30"/>
+          <w:sz w:val="28"/>
         </w:rPr>
-        <w:t>3. STACK TECNOLÓGICO Y ARQUITECTURA</w:t>
+        <w:t>3. MARCO NORMATIVO Y OFICIALIDAD INSTITUCIONAL</w:t>
       </w:r>
     </w:p>
     <w:p>
@@ -334,9 +379,674 @@
       <w:r>
         <w:rPr>
           <w:rFonts w:ascii="Arial" w:hAnsi="Arial"/>
+          <w:color w:val="1E293B"/>
           <w:sz w:val="21"/>
         </w:rPr>
-        <w:t>Se seleccionó una arquitectura desacoplada de alto rendimiento que no depende de frameworks pesados, garantizando tiempos de carga inferiores a 1 segundo:</w:t>
+        <w:t>HercarIA se diseñó alineado a las directrices de la legislación educativa técnica superior del Perú:</w:t>
+      </w:r>
+    </w:p>
+    <w:p>
+      <w:pPr>
+        <w:pStyle w:val="ListBullet"/>
+        <w:spacing w:after="60" w:line="276" w:lineRule="auto"/>
+      </w:pPr>
+      <w:r>
+        <w:rPr>
+          <w:rFonts w:ascii="Arial" w:hAnsi="Arial"/>
+          <w:b/>
+          <w:color w:val="1E293B"/>
+          <w:sz w:val="21"/>
+        </w:rPr>
+        <w:t xml:space="preserve">Ley de Institutos y Escuelas de Educación Superior N° 30512: </w:t>
+      </w:r>
+      <w:r>
+        <w:rPr>
+          <w:rFonts w:ascii="Arial" w:hAnsi="Arial"/>
+          <w:color w:val="1E293B"/>
+          <w:sz w:val="21"/>
+        </w:rPr>
+        <w:t>Marco legal que regula el funcionamiento de los institutos tecnológicos del país, garantizando calidad académica, pertinencia formativa y titulación oficial.</w:t>
+      </w:r>
+    </w:p>
+    <w:p>
+      <w:pPr>
+        <w:pStyle w:val="ListBullet"/>
+        <w:spacing w:after="60" w:line="276" w:lineRule="auto"/>
+      </w:pPr>
+      <w:r>
+        <w:rPr>
+          <w:rFonts w:ascii="Arial" w:hAnsi="Arial"/>
+          <w:b/>
+          <w:color w:val="1E293B"/>
+          <w:sz w:val="21"/>
+        </w:rPr>
+        <w:t xml:space="preserve">Título Profesional Técnico a Nombre de la Nación: </w:t>
+      </w:r>
+      <w:r>
+        <w:rPr>
+          <w:rFonts w:ascii="Arial" w:hAnsi="Arial"/>
+          <w:color w:val="1E293B"/>
+          <w:sz w:val="21"/>
+        </w:rPr>
+        <w:t>Todos los programas académicos concluidos con éxito en el IESTP Hermanos Cárcamo otorgan Título Profesional Técnico expedido directamente por el Ministerio de Educación (MINEDU), con validez nacional e internacional.</w:t>
+      </w:r>
+    </w:p>
+    <w:p>
+      <w:pPr>
+        <w:pStyle w:val="ListBullet"/>
+        <w:spacing w:after="60" w:line="276" w:lineRule="auto"/>
+      </w:pPr>
+      <w:r>
+        <w:rPr>
+          <w:rFonts w:ascii="Arial" w:hAnsi="Arial"/>
+          <w:b/>
+          <w:color w:val="1E293B"/>
+          <w:sz w:val="21"/>
+        </w:rPr>
+        <w:t xml:space="preserve">Convalidación Universitaria (SUNEDU): </w:t>
+      </w:r>
+      <w:r>
+        <w:rPr>
+          <w:rFonts w:ascii="Arial" w:hAnsi="Arial"/>
+          <w:color w:val="1E293B"/>
+          <w:sz w:val="21"/>
+        </w:rPr>
+        <w:t>Los egresados titulados de las carreras técnicas de 3 años pueden convalidar sus créditos y cursos en universidades licenciadas por SUNEDU, completando el grado universitario de Bachiller y Licenciatura en menor tiempo.</w:t>
+      </w:r>
+    </w:p>
+    <w:p>
+      <w:pPr>
+        <w:pStyle w:val="ListBullet"/>
+        <w:spacing w:after="60" w:line="276" w:lineRule="auto"/>
+      </w:pPr>
+      <w:r>
+        <w:rPr>
+          <w:rFonts w:ascii="Arial" w:hAnsi="Arial"/>
+          <w:b/>
+          <w:color w:val="1E293B"/>
+          <w:sz w:val="21"/>
+        </w:rPr>
+        <w:t xml:space="preserve">Certificaciones Modulares Progresivas: </w:t>
+      </w:r>
+      <w:r>
+        <w:rPr>
+          <w:rFonts w:ascii="Arial" w:hAnsi="Arial"/>
+          <w:color w:val="1E293B"/>
+          <w:sz w:val="21"/>
+        </w:rPr>
+        <w:t>Por cada año lectivo aprobado (2 semestres), el alumno recibe un certificado oficial modular técnico que le permite insertarse formalmente en el mercado laboral antes de titularse.</w:t>
+      </w:r>
+    </w:p>
+    <w:p>
+      <w:pPr>
+        <w:spacing w:before="360" w:after="120"/>
+      </w:pPr>
+      <w:r>
+        <w:rPr>
+          <w:rFonts w:ascii="Arial" w:hAnsi="Arial"/>
+          <w:b/>
+          <w:color w:val="13357B"/>
+          <w:sz w:val="28"/>
+        </w:rPr>
+        <w:t>4. OFERTA FORMATIVA INSTITUCIONAL</w:t>
+      </w:r>
+    </w:p>
+    <w:p>
+      <w:pPr>
+        <w:spacing w:after="120" w:line="276" w:lineRule="auto"/>
+      </w:pPr>
+      <w:r>
+        <w:rPr>
+          <w:rFonts w:ascii="Arial" w:hAnsi="Arial"/>
+          <w:color w:val="1E293B"/>
+          <w:sz w:val="21"/>
+        </w:rPr>
+        <w:t>El IESTP Hermanos Cárcamo brinda 4 carreras profesionales técnicas de 3 años de duración lectiva (6 semestres académicos), con turno regular diurno y énfasis en talleres prácticos y laboratorios de cómputo:</w:t>
+      </w:r>
+    </w:p>
+    <w:tbl>
+      <w:tblPr>
+        <w:tblW w:type="auto" w:w="0"/>
+        <w:jc w:val="center"/>
+        <w:tblLook w:firstColumn="1" w:firstRow="1" w:lastColumn="0" w:lastRow="0" w:noHBand="0" w:noVBand="1" w:val="04A0"/>
+      </w:tblPr>
+      <w:tblGrid>
+        <w:gridCol w:w="3120"/>
+        <w:gridCol w:w="3120"/>
+        <w:gridCol w:w="3120"/>
+      </w:tblGrid>
+      <w:tr>
+        <w:tc>
+          <w:tcPr>
+            <w:tcW w:type="dxa" w:w="3120"/>
+            <w:shd w:fill="13357B"/>
+            <w:tcMar>
+              <w:top w:w="130" w:type="dxa"/>
+              <w:bottom w:w="130" w:type="dxa"/>
+              <w:left w:w="150" w:type="dxa"/>
+              <w:right w:w="150" w:type="dxa"/>
+            </w:tcMar>
+          </w:tcPr>
+          <w:p>
+            <w:r>
+              <w:rPr>
+                <w:b/>
+                <w:color w:val="FFFFFF"/>
+              </w:rPr>
+              <w:t>Carrera Profesional</w:t>
+            </w:r>
+          </w:p>
+        </w:tc>
+        <w:tc>
+          <w:tcPr>
+            <w:tcW w:type="dxa" w:w="3120"/>
+            <w:shd w:fill="13357B"/>
+            <w:tcMar>
+              <w:top w:w="130" w:type="dxa"/>
+              <w:bottom w:w="130" w:type="dxa"/>
+              <w:left w:w="150" w:type="dxa"/>
+              <w:right w:w="150" w:type="dxa"/>
+            </w:tcMar>
+          </w:tcPr>
+          <w:p>
+            <w:r>
+              <w:rPr>
+                <w:b/>
+                <w:color w:val="FFFFFF"/>
+              </w:rPr>
+              <w:t>Enfoque Formativo y Módulos</w:t>
+            </w:r>
+          </w:p>
+        </w:tc>
+        <w:tc>
+          <w:tcPr>
+            <w:tcW w:type="dxa" w:w="3120"/>
+            <w:shd w:fill="13357B"/>
+            <w:tcMar>
+              <w:top w:w="130" w:type="dxa"/>
+              <w:bottom w:w="130" w:type="dxa"/>
+              <w:left w:w="150" w:type="dxa"/>
+              <w:right w:w="150" w:type="dxa"/>
+            </w:tcMar>
+          </w:tcPr>
+          <w:p>
+            <w:r>
+              <w:rPr>
+                <w:b/>
+                <w:color w:val="FFFFFF"/>
+              </w:rPr>
+              <w:t>Campo Laboral en Paita / Piura</w:t>
+            </w:r>
+          </w:p>
+        </w:tc>
+      </w:tr>
+      <w:tr>
+        <w:tc>
+          <w:tcPr>
+            <w:tcW w:type="dxa" w:w="3120"/>
+            <w:tcMar>
+              <w:top w:w="100" w:type="dxa"/>
+              <w:bottom w:w="100" w:type="dxa"/>
+              <w:left w:w="120" w:type="dxa"/>
+              <w:right w:w="120" w:type="dxa"/>
+            </w:tcMar>
+          </w:tcPr>
+          <w:p>
+            <w:r>
+              <w:rPr>
+                <w:rFonts w:ascii="Arial" w:hAnsi="Arial"/>
+                <w:sz w:val="19"/>
+              </w:rPr>
+              <w:t>Arquitectura de Plataformas y Servicios de Tecnologías de la Información (APSTI)</w:t>
+            </w:r>
+          </w:p>
+        </w:tc>
+        <w:tc>
+          <w:tcPr>
+            <w:tcW w:type="dxa" w:w="3120"/>
+            <w:tcMar>
+              <w:top w:w="100" w:type="dxa"/>
+              <w:bottom w:w="100" w:type="dxa"/>
+              <w:left w:w="120" w:type="dxa"/>
+              <w:right w:w="120" w:type="dxa"/>
+            </w:tcMar>
+          </w:tcPr>
+          <w:p>
+            <w:r>
+              <w:rPr>
+                <w:rFonts w:ascii="Arial" w:hAnsi="Arial"/>
+                <w:sz w:val="19"/>
+              </w:rPr>
+              <w:t>Desarrollo de software web y móvil, diseño de bases de datos relacionales y no relacionales, cableado estructurado, configuración de redes WAN/LAN, seguridad informática, administración de servidores Linux/Windows y despliegue en entornos Cloud.</w:t>
+            </w:r>
+          </w:p>
+        </w:tc>
+        <w:tc>
+          <w:tcPr>
+            <w:tcW w:type="dxa" w:w="3120"/>
+            <w:tcMar>
+              <w:top w:w="100" w:type="dxa"/>
+              <w:bottom w:w="100" w:type="dxa"/>
+              <w:left w:w="120" w:type="dxa"/>
+              <w:right w:w="120" w:type="dxa"/>
+            </w:tcMar>
+          </w:tcPr>
+          <w:p>
+            <w:r>
+              <w:rPr>
+                <w:rFonts w:ascii="Arial" w:hAnsi="Arial"/>
+                <w:sz w:val="19"/>
+              </w:rPr>
+              <w:t>Desarrollador de software en agencias marítimas y de aduanas, administrador de servidores en empresas del Parque Industrial de Paita, soporte TI en entidades bancarias, instituciones de salud y teletrabajo internacional.</w:t>
+            </w:r>
+          </w:p>
+        </w:tc>
+      </w:tr>
+      <w:tr>
+        <w:tc>
+          <w:tcPr>
+            <w:tcW w:type="dxa" w:w="3120"/>
+            <w:tcMar>
+              <w:top w:w="100" w:type="dxa"/>
+              <w:bottom w:w="100" w:type="dxa"/>
+              <w:left w:w="120" w:type="dxa"/>
+              <w:right w:w="120" w:type="dxa"/>
+            </w:tcMar>
+          </w:tcPr>
+          <w:p>
+            <w:r>
+              <w:rPr>
+                <w:rFonts w:ascii="Arial" w:hAnsi="Arial"/>
+                <w:sz w:val="19"/>
+              </w:rPr>
+              <w:t>Administración de Negocios Internacionales (ANI)</w:t>
+            </w:r>
+          </w:p>
+        </w:tc>
+        <w:tc>
+          <w:tcPr>
+            <w:tcW w:type="dxa" w:w="3120"/>
+            <w:tcMar>
+              <w:top w:w="100" w:type="dxa"/>
+              <w:bottom w:w="100" w:type="dxa"/>
+              <w:left w:w="120" w:type="dxa"/>
+              <w:right w:w="120" w:type="dxa"/>
+            </w:tcMar>
+          </w:tcPr>
+          <w:p>
+            <w:r>
+              <w:rPr>
+                <w:rFonts w:ascii="Arial" w:hAnsi="Arial"/>
+                <w:sz w:val="19"/>
+              </w:rPr>
+              <w:t>Operaciones aduaneras, regímenes de importación y exportación, logística portuaria y de contenedores refrigerados, tratados comerciales internacionales, fletes marítimos e investigación de mercados exteriores.</w:t>
+            </w:r>
+          </w:p>
+        </w:tc>
+        <w:tc>
+          <w:tcPr>
+            <w:tcW w:type="dxa" w:w="3120"/>
+            <w:tcMar>
+              <w:top w:w="100" w:type="dxa"/>
+              <w:bottom w:w="100" w:type="dxa"/>
+              <w:left w:w="120" w:type="dxa"/>
+              <w:right w:w="120" w:type="dxa"/>
+            </w:tcMar>
+          </w:tcPr>
+          <w:p>
+            <w:r>
+              <w:rPr>
+                <w:rFonts w:ascii="Arial" w:hAnsi="Arial"/>
+                <w:sz w:val="19"/>
+              </w:rPr>
+              <w:t>Operadores portuarios en el Terminal Portuario Euroandinos (TPE), agencias aduaneras, depósitos aduaneros autorizados, empresas agroexportadoras de mango, uva y banano orgánico, y procesadoras de pota y perico.</w:t>
+            </w:r>
+          </w:p>
+        </w:tc>
+      </w:tr>
+      <w:tr>
+        <w:tc>
+          <w:tcPr>
+            <w:tcW w:type="dxa" w:w="3120"/>
+            <w:tcMar>
+              <w:top w:w="100" w:type="dxa"/>
+              <w:bottom w:w="100" w:type="dxa"/>
+              <w:left w:w="120" w:type="dxa"/>
+              <w:right w:w="120" w:type="dxa"/>
+            </w:tcMar>
+          </w:tcPr>
+          <w:p>
+            <w:r>
+              <w:rPr>
+                <w:rFonts w:ascii="Arial" w:hAnsi="Arial"/>
+                <w:sz w:val="19"/>
+              </w:rPr>
+              <w:t>Contabilidad</w:t>
+            </w:r>
+          </w:p>
+        </w:tc>
+        <w:tc>
+          <w:tcPr>
+            <w:tcW w:type="dxa" w:w="3120"/>
+            <w:tcMar>
+              <w:top w:w="100" w:type="dxa"/>
+              <w:bottom w:w="100" w:type="dxa"/>
+              <w:left w:w="120" w:type="dxa"/>
+              <w:right w:w="120" w:type="dxa"/>
+            </w:tcMar>
+          </w:tcPr>
+          <w:p>
+            <w:r>
+              <w:rPr>
+                <w:rFonts w:ascii="Arial" w:hAnsi="Arial"/>
+                <w:sz w:val="19"/>
+              </w:rPr>
+              <w:t>Contabilidad comercial, de costos, gubernamental y de sociedades; registro de libros contables físicos y electrónicos (SIRE - SUNAT), liquidación de tributos (PDT, IGV, Renta), auditoría financiera y balances generales.</w:t>
+            </w:r>
+          </w:p>
+        </w:tc>
+        <w:tc>
+          <w:tcPr>
+            <w:tcW w:type="dxa" w:w="3120"/>
+            <w:tcMar>
+              <w:top w:w="100" w:type="dxa"/>
+              <w:bottom w:w="100" w:type="dxa"/>
+              <w:left w:w="120" w:type="dxa"/>
+              <w:right w:w="120" w:type="dxa"/>
+            </w:tcMar>
+          </w:tcPr>
+          <w:p>
+            <w:r>
+              <w:rPr>
+                <w:rFonts w:ascii="Arial" w:hAnsi="Arial"/>
+                <w:sz w:val="19"/>
+              </w:rPr>
+              <w:t>Estudios contables independientes, áreas de tesorería y contabilidad de empresas pesqueras e industriales, agencias bancarias (Banco de la Nación, Cajas Piura/Sullana), municipios y entidades del Estado.</w:t>
+            </w:r>
+          </w:p>
+        </w:tc>
+      </w:tr>
+      <w:tr>
+        <w:tc>
+          <w:tcPr>
+            <w:tcW w:type="dxa" w:w="3120"/>
+            <w:tcMar>
+              <w:top w:w="100" w:type="dxa"/>
+              <w:bottom w:w="100" w:type="dxa"/>
+              <w:left w:w="120" w:type="dxa"/>
+              <w:right w:w="120" w:type="dxa"/>
+            </w:tcMar>
+          </w:tcPr>
+          <w:p>
+            <w:r>
+              <w:rPr>
+                <w:rFonts w:ascii="Arial" w:hAnsi="Arial"/>
+                <w:sz w:val="19"/>
+              </w:rPr>
+              <w:t>Desarrollo Pesquero y Acuícola (DPA)</w:t>
+            </w:r>
+          </w:p>
+        </w:tc>
+        <w:tc>
+          <w:tcPr>
+            <w:tcW w:type="dxa" w:w="3120"/>
+            <w:tcMar>
+              <w:top w:w="100" w:type="dxa"/>
+              <w:bottom w:w="100" w:type="dxa"/>
+              <w:left w:w="120" w:type="dxa"/>
+              <w:right w:w="120" w:type="dxa"/>
+            </w:tcMar>
+          </w:tcPr>
+          <w:p>
+            <w:r>
+              <w:rPr>
+                <w:rFonts w:ascii="Arial" w:hAnsi="Arial"/>
+                <w:sz w:val="19"/>
+              </w:rPr>
+              <w:t>Cultivo marino de conchas de abanico, langostinos y tilapias; artes y aparejos de pesca, navegación costera y de altura a bordo de la embarcación del instituto, procesamiento industrial y sistemas de inocuidad alimentaria (HACCP, BPM).</w:t>
+            </w:r>
+          </w:p>
+        </w:tc>
+        <w:tc>
+          <w:tcPr>
+            <w:tcW w:type="dxa" w:w="3120"/>
+            <w:tcMar>
+              <w:top w:w="100" w:type="dxa"/>
+              <w:bottom w:w="100" w:type="dxa"/>
+              <w:left w:w="120" w:type="dxa"/>
+              <w:right w:w="120" w:type="dxa"/>
+            </w:tcMar>
+          </w:tcPr>
+          <w:p>
+            <w:r>
+              <w:rPr>
+                <w:rFonts w:ascii="Arial" w:hAnsi="Arial"/>
+                <w:sz w:val="19"/>
+              </w:rPr>
+              <w:t>Supervisores de aseguramiento de calidad (QA/QC) en plantas pesqueras congeladoras y conserveras de Paita, jefes de centros de maricultura en la bahía de Sechura y Paita, capitanes de pesca e inspectores de SANIPES.</w:t>
+            </w:r>
+          </w:p>
+        </w:tc>
+      </w:tr>
+    </w:tbl>
+    <w:p>
+      <w:pPr>
+        <w:spacing w:before="360" w:after="120"/>
+      </w:pPr>
+      <w:r>
+        <w:rPr>
+          <w:rFonts w:ascii="Arial" w:hAnsi="Arial"/>
+          <w:b/>
+          <w:color w:val="13357B"/>
+          <w:sz w:val="28"/>
+        </w:rPr>
+        <w:t>5. PROCEDIMIENTOS DE MATRÍCULA Y REGISTRO DE PAGOS</w:t>
+      </w:r>
+    </w:p>
+    <w:p>
+      <w:pPr>
+        <w:spacing w:before="240" w:after="80"/>
+      </w:pPr>
+      <w:r>
+        <w:rPr>
+          <w:rFonts w:ascii="Arial" w:hAnsi="Arial"/>
+          <w:b/>
+          <w:color w:val="2563EB"/>
+          <w:sz w:val="24"/>
+        </w:rPr>
+        <w:t>5.1. Gratuidad de la Enseñanza Pública</w:t>
+      </w:r>
+    </w:p>
+    <w:p>
+      <w:pPr>
+        <w:spacing w:after="120" w:line="276" w:lineRule="auto"/>
+      </w:pPr>
+      <w:r>
+        <w:rPr>
+          <w:rFonts w:ascii="Arial" w:hAnsi="Arial"/>
+          <w:color w:val="1E293B"/>
+          <w:sz w:val="21"/>
+        </w:rPr>
+        <w:t>El IESTP Hermanos Cárcamo es un instituto tecnológico público tutelado por la Dirección Regional de Educación de Piura (DREP) y el MINEDU. La enseñanza es totalmente gratuita y no se abona ningún tipo de pensión mensual privada. El único pago corresponde a la tasa administrativa semestral estipulada en el TUPA institucional (S/ 150 a S/ 250 por semestre completo).</w:t>
+      </w:r>
+    </w:p>
+    <w:p>
+      <w:pPr>
+        <w:spacing w:before="240" w:after="80"/>
+      </w:pPr>
+      <w:r>
+        <w:rPr>
+          <w:rFonts w:ascii="Arial" w:hAnsi="Arial"/>
+          <w:b/>
+          <w:color w:val="2563EB"/>
+          <w:sz w:val="24"/>
+        </w:rPr>
+        <w:t>5.2. Protocolo Paso a Paso de Registro de Vouchers BN</w:t>
+      </w:r>
+    </w:p>
+    <w:p>
+      <w:pPr>
+        <w:pStyle w:val="ListBullet"/>
+        <w:spacing w:after="60" w:line="276" w:lineRule="auto"/>
+      </w:pPr>
+      <w:r>
+        <w:rPr>
+          <w:rFonts w:ascii="Arial" w:hAnsi="Arial"/>
+          <w:b/>
+          <w:color w:val="1E293B"/>
+          <w:sz w:val="21"/>
+        </w:rPr>
+        <w:t xml:space="preserve">Paso 1 (Depósito Bancario): </w:t>
+      </w:r>
+      <w:r>
+        <w:rPr>
+          <w:rFonts w:ascii="Arial" w:hAnsi="Arial"/>
+          <w:color w:val="1E293B"/>
+          <w:sz w:val="21"/>
+        </w:rPr>
+        <w:t>El postulante o estudiante regular acude a cualquier ventanilla o Agente MultiRed del Banco de la Nación para abonar la tasa institucional, conservando su váucher físico o comprobante digital.</w:t>
+      </w:r>
+    </w:p>
+    <w:p>
+      <w:pPr>
+        <w:pStyle w:val="ListBullet"/>
+        <w:spacing w:after="60" w:line="276" w:lineRule="auto"/>
+      </w:pPr>
+      <w:r>
+        <w:rPr>
+          <w:rFonts w:ascii="Arial" w:hAnsi="Arial"/>
+          <w:b/>
+          <w:color w:val="1E293B"/>
+          <w:sz w:val="21"/>
+        </w:rPr>
+        <w:t xml:space="preserve">Paso 2 (Acceso al Portal): </w:t>
+      </w:r>
+      <w:r>
+        <w:rPr>
+          <w:rFonts w:ascii="Arial" w:hAnsi="Arial"/>
+          <w:color w:val="1E293B"/>
+          <w:sz w:val="21"/>
+        </w:rPr>
+        <w:t>Ingresa desde su celular o computadora al portal oficial: https://pagos.ieshercar.edu.pe/</w:t>
+      </w:r>
+    </w:p>
+    <w:p>
+      <w:pPr>
+        <w:pStyle w:val="ListBullet"/>
+        <w:spacing w:after="60" w:line="276" w:lineRule="auto"/>
+      </w:pPr>
+      <w:r>
+        <w:rPr>
+          <w:rFonts w:ascii="Arial" w:hAnsi="Arial"/>
+          <w:b/>
+          <w:color w:val="1E293B"/>
+          <w:sz w:val="21"/>
+        </w:rPr>
+        <w:t xml:space="preserve">Paso 3 (Autenticación): </w:t>
+      </w:r>
+      <w:r>
+        <w:rPr>
+          <w:rFonts w:ascii="Arial" w:hAnsi="Arial"/>
+          <w:color w:val="1E293B"/>
+          <w:sz w:val="21"/>
+        </w:rPr>
+        <w:t>Digita su número de DNI para que el sistema identifique su legajo académico.</w:t>
+      </w:r>
+    </w:p>
+    <w:p>
+      <w:pPr>
+        <w:pStyle w:val="ListBullet"/>
+        <w:spacing w:after="60" w:line="276" w:lineRule="auto"/>
+      </w:pPr>
+      <w:r>
+        <w:rPr>
+          <w:rFonts w:ascii="Arial" w:hAnsi="Arial"/>
+          <w:b/>
+          <w:color w:val="1E293B"/>
+          <w:sz w:val="21"/>
+        </w:rPr>
+        <w:t xml:space="preserve">Paso 4 (Ingreso de Datos del Váucher): </w:t>
+      </w:r>
+      <w:r>
+        <w:rPr>
+          <w:rFonts w:ascii="Arial" w:hAnsi="Arial"/>
+          <w:color w:val="1E293B"/>
+          <w:sz w:val="21"/>
+        </w:rPr>
+        <w:t>Selecciona el concepto correspondiente (Matrícula, Examen de Admisión o Trámite Administrativo) y transcribe cuidadosamente la Fecha, Monto exacto y Número de Operación impreso en el váucher.</w:t>
+      </w:r>
+    </w:p>
+    <w:p>
+      <w:pPr>
+        <w:pStyle w:val="ListBullet"/>
+        <w:spacing w:after="60" w:line="276" w:lineRule="auto"/>
+      </w:pPr>
+      <w:r>
+        <w:rPr>
+          <w:rFonts w:ascii="Arial" w:hAnsi="Arial"/>
+          <w:b/>
+          <w:color w:val="1E293B"/>
+          <w:sz w:val="21"/>
+        </w:rPr>
+        <w:t xml:space="preserve">Paso 5 (Carga de Comprobante): </w:t>
+      </w:r>
+      <w:r>
+        <w:rPr>
+          <w:rFonts w:ascii="Arial" w:hAnsi="Arial"/>
+          <w:color w:val="1E293B"/>
+          <w:sz w:val="21"/>
+        </w:rPr>
+        <w:t>Adjunta una fotografía nítida o archivo PDF del comprobante y presiona "Registrar Pago".</w:t>
+      </w:r>
+    </w:p>
+    <w:p>
+      <w:pPr>
+        <w:pStyle w:val="ListBullet"/>
+        <w:spacing w:after="60" w:line="276" w:lineRule="auto"/>
+      </w:pPr>
+      <w:r>
+        <w:rPr>
+          <w:rFonts w:ascii="Arial" w:hAnsi="Arial"/>
+          <w:b/>
+          <w:color w:val="1E293B"/>
+          <w:sz w:val="21"/>
+        </w:rPr>
+        <w:t xml:space="preserve">Paso 6 (Descarga de Boleta Electrónica): </w:t>
+      </w:r>
+      <w:r>
+        <w:rPr>
+          <w:rFonts w:ascii="Arial" w:hAnsi="Arial"/>
+          <w:color w:val="1E293B"/>
+          <w:sz w:val="21"/>
+        </w:rPr>
+        <w:t>Una vez validado el pago, el usuario ingresa a https://sistema.ieshercar.com/Consulta_Boletas/index.php con su DNI para visualizar y descargar su boleta electrónica con valor tributario.</w:t>
+      </w:r>
+    </w:p>
+    <w:p>
+      <w:pPr>
+        <w:spacing w:before="360" w:after="120"/>
+      </w:pPr>
+      <w:r>
+        <w:rPr>
+          <w:rFonts w:ascii="Arial" w:hAnsi="Arial"/>
+          <w:b/>
+          <w:color w:val="13357B"/>
+          <w:sz w:val="28"/>
+        </w:rPr>
+        <w:t>6. STACK TECNOLÓGICO Y ARQUITECTURA DEL SISTEMA</w:t>
+      </w:r>
+    </w:p>
+    <w:p>
+      <w:pPr>
+        <w:spacing w:after="120" w:line="276" w:lineRule="auto"/>
+      </w:pPr>
+      <w:r>
+        <w:rPr>
+          <w:rFonts w:ascii="Arial" w:hAnsi="Arial"/>
+          <w:color w:val="1E293B"/>
+          <w:sz w:val="21"/>
+        </w:rPr>
+        <w:t>HercarIA se construyó bajo principios de alto desempeño, desacoplamiento y cero dependencias complejas, garantizando que el sistema cargue instantáneamente incluso bajo conexiones móviles lentas en zonas periféricas de Paita:</w:t>
       </w:r>
     </w:p>
     <w:tbl>
@@ -368,7 +1078,7 @@
                 <w:b/>
                 <w:color w:val="FFFFFF"/>
               </w:rPr>
-              <w:t>Capa</w:t>
+              <w:t>Capa de Arquitectura</w:t>
             </w:r>
           </w:p>
         </w:tc>
@@ -389,7 +1099,7 @@
                 <w:b/>
                 <w:color w:val="FFFFFF"/>
               </w:rPr>
-              <w:t>Tecnología</w:t>
+              <w:t>Tecnología Empleada</w:t>
             </w:r>
           </w:p>
         </w:tc>
@@ -410,7 +1120,7 @@
                 <w:b/>
                 <w:color w:val="FFFFFF"/>
               </w:rPr>
-              <w:t>Función en el Sistema</w:t>
+              <w:t>Función y Aporte al Sistema</w:t>
             </w:r>
           </w:p>
         </w:tc>
@@ -432,7 +1142,7 @@
                 <w:rFonts w:ascii="Arial" w:hAnsi="Arial"/>
                 <w:sz w:val="19"/>
               </w:rPr>
-              <w:t>Frontend UI</w:t>
+              <w:t>Frontend UI / UX</w:t>
             </w:r>
           </w:p>
         </w:tc>
@@ -452,7 +1162,7 @@
                 <w:rFonts w:ascii="Arial" w:hAnsi="Arial"/>
                 <w:sz w:val="19"/>
               </w:rPr>
-              <w:t>HTML5 Semántico + CSS3 Avanzado</w:t>
+              <w:t>HTML5 Semántico + CSS3 Avanzado (Variables Dinámicas)</w:t>
             </w:r>
           </w:p>
         </w:tc>
@@ -472,7 +1182,7 @@
                 <w:rFonts w:ascii="Arial" w:hAnsi="Arial"/>
                 <w:sz w:val="19"/>
               </w:rPr>
-              <w:t>Interfaz responsiva en pantalla completa, diseño de portada, modo oscuro y animaciones ripple.</w:t>
+              <w:t>Diseño fullscreen responsivo inspirado en ChatGPT, soporte completo para tema claro/oscuro, microinteracciones y efectos ripple.</w:t>
             </w:r>
           </w:p>
         </w:tc>
@@ -514,7 +1224,7 @@
                 <w:rFonts w:ascii="Arial" w:hAnsi="Arial"/>
                 <w:sz w:val="19"/>
               </w:rPr>
-              <w:t>Vanilla JavaScript (ES6+)</w:t>
+              <w:t>Vanilla JavaScript (ES6+ Modular)</w:t>
             </w:r>
           </w:p>
         </w:tc>
@@ -534,7 +1244,7 @@
                 <w:rFonts w:ascii="Arial" w:hAnsi="Arial"/>
                 <w:sz w:val="19"/>
               </w:rPr>
-              <w:t>Normalización de texto, motor NLP de intenciones, parsing de Markdown y gestión del DOM.</w:t>
+              <w:t>Normalización de texto, motor NLP basado en intenciones semánticas y expresiones regulares, parsing dinámico de Markdown.</w:t>
             </w:r>
           </w:p>
         </w:tc>
@@ -556,7 +1266,7 @@
                 <w:rFonts w:ascii="Arial" w:hAnsi="Arial"/>
                 <w:sz w:val="19"/>
               </w:rPr>
-              <w:t>Iconografía</w:t>
+              <w:t>Iconografía Vectorial</w:t>
             </w:r>
           </w:p>
         </w:tc>
@@ -576,7 +1286,7 @@
                 <w:rFonts w:ascii="Arial" w:hAnsi="Arial"/>
                 <w:sz w:val="19"/>
               </w:rPr>
-              <w:t>Inline SVG Vectors (Phosphor Standard)</w:t>
+              <w:t>SVG Inline (Trazo uniforme a 2px)</w:t>
             </w:r>
           </w:p>
         </w:tc>
@@ -596,7 +1306,7 @@
                 <w:rFonts w:ascii="Arial" w:hAnsi="Arial"/>
                 <w:sz w:val="19"/>
               </w:rPr>
-              <w:t>Iconos vectoriales de trazo uniforme a 2px en lugar de emojis informales.</w:t>
+              <w:t>Iconografía nítida y corporativa que sustituye emojis informales, garantizando coherencia visual técnica en todas las resoluciones.</w:t>
             </w:r>
           </w:p>
         </w:tc>
@@ -618,7 +1328,7 @@
                 <w:rFonts w:ascii="Arial" w:hAnsi="Arial"/>
                 <w:sz w:val="19"/>
               </w:rPr>
-              <w:t>Test Vocacional</w:t>
+              <w:t>Orientador Vocacional</w:t>
             </w:r>
           </w:p>
         </w:tc>
@@ -658,7 +1368,7 @@
                 <w:rFonts w:ascii="Arial" w:hAnsi="Arial"/>
                 <w:sz w:val="19"/>
               </w:rPr>
-              <w:t>Evaluación de 6 factores psicométricos con cálculo de compatibilidad porcentual.</w:t>
+              <w:t>Cuestionario interactivo de 6 reactivos con ponderación matricial y cálculo de compatibilidad porcentual con trofeo de resultado.</w:t>
             </w:r>
           </w:p>
         </w:tc>
@@ -680,7 +1390,7 @@
                 <w:rFonts w:ascii="Arial" w:hAnsi="Arial"/>
                 <w:sz w:val="19"/>
               </w:rPr>
-              <w:t>Síntesis de Voz</w:t>
+              <w:t>Motor de Voz Neural</w:t>
             </w:r>
           </w:p>
         </w:tc>
@@ -700,7 +1410,7 @@
                 <w:rFonts w:ascii="Arial" w:hAnsi="Arial"/>
                 <w:sz w:val="19"/>
               </w:rPr>
-              <w:t>Python edge-tts + Web Speech API</w:t>
+              <w:t>Microsoft Edge TTS (Python) + Web Speech API</w:t>
             </w:r>
           </w:p>
         </w:tc>
@@ -720,7 +1430,7 @@
                 <w:rFonts w:ascii="Arial" w:hAnsi="Arial"/>
                 <w:sz w:val="19"/>
               </w:rPr>
-              <w:t>Generación de voz femenina neural de alta fidelidad (es-ES-ElviraNeural) y fallback nativo.</w:t>
+              <w:t>Síntesis de voz femenina dulce y humana con fallback automático para funcionamiento universal en web estática y servidores locales.</w:t>
             </w:r>
           </w:p>
         </w:tc>
@@ -742,7 +1452,7 @@
                 <w:rFonts w:ascii="Arial" w:hAnsi="Arial"/>
                 <w:sz w:val="19"/>
               </w:rPr>
-              <w:t>Reconocimiento Voz</w:t>
+              <w:t>Reconocimiento Vocal</w:t>
             </w:r>
           </w:p>
         </w:tc>
@@ -782,7 +1492,7 @@
                 <w:rFonts w:ascii="Arial" w:hAnsi="Arial"/>
                 <w:sz w:val="19"/>
               </w:rPr>
-              <w:t>Dictado por micrófono en tiempo real con dialecto peruano (es-PE).</w:t>
+              <w:t>Dictado por voz mediante micrófono en tiempo real con dialecto español de Perú (es-PE) y detección de silencio.</w:t>
             </w:r>
           </w:p>
         </w:tc>
@@ -804,7 +1514,7 @@
                 <w:rFonts w:ascii="Arial" w:hAnsi="Arial"/>
                 <w:sz w:val="19"/>
               </w:rPr>
-              <w:t>Alojamiento Web</w:t>
+              <w:t>Almacenamiento Local</w:t>
             </w:r>
           </w:p>
         </w:tc>
@@ -824,7 +1534,7 @@
                 <w:rFonts w:ascii="Arial" w:hAnsi="Arial"/>
                 <w:sz w:val="19"/>
               </w:rPr>
-              <w:t>GitHub Pages (HTTPS CDN)</w:t>
+              <w:t>Web Storage API (localStorage)</w:t>
             </w:r>
           </w:p>
         </w:tc>
@@ -844,115 +1554,7 @@
                 <w:rFonts w:ascii="Arial" w:hAnsi="Arial"/>
                 <w:sz w:val="19"/>
               </w:rPr>
-              <w:t>Despliegue global en la nube disponible 24/7 de forma gratuita y segura.</w:t>
-            </w:r>
-          </w:p>
-        </w:tc>
-      </w:tr>
-    </w:tbl>
-    <w:p>
-      <w:r>
-        <w:br w:type="page"/>
-      </w:r>
-    </w:p>
-    <w:p>
-      <w:pPr>
-        <w:spacing w:before="360" w:after="120"/>
-      </w:pPr>
-      <w:r>
-        <w:rPr>
-          <w:rFonts w:ascii="Arial" w:hAnsi="Arial"/>
-          <w:b/>
-          <w:color w:val="13357B"/>
-          <w:sz w:val="30"/>
-        </w:rPr>
-        <w:t>4. OFERTA FORMATIVA INSTITUCIONAL</w:t>
-      </w:r>
-    </w:p>
-    <w:p>
-      <w:pPr>
-        <w:spacing w:after="120" w:line="276" w:lineRule="auto"/>
-      </w:pPr>
-      <w:r>
-        <w:rPr>
-          <w:rFonts w:ascii="Arial" w:hAnsi="Arial"/>
-          <w:sz w:val="21"/>
-        </w:rPr>
-        <w:t>Todas las carreras profesionales técnicas tienen una duración de 3 años lectivos (6 semestres académicos), otorgan Título Profesional Técnico a Nombre de la Nación y certificaciones modulares progresivas cada año:</w:t>
-      </w:r>
-    </w:p>
-    <w:tbl>
-      <w:tblPr>
-        <w:tblW w:type="auto" w:w="0"/>
-        <w:jc w:val="center"/>
-        <w:tblLook w:firstColumn="1" w:firstRow="1" w:lastColumn="0" w:lastRow="0" w:noHBand="0" w:noVBand="1" w:val="04A0"/>
-      </w:tblPr>
-      <w:tblGrid>
-        <w:gridCol w:w="3120"/>
-        <w:gridCol w:w="3120"/>
-        <w:gridCol w:w="3120"/>
-      </w:tblGrid>
-      <w:tr>
-        <w:tc>
-          <w:tcPr>
-            <w:tcW w:type="dxa" w:w="3120"/>
-            <w:shd w:fill="13357B"/>
-            <w:tcMar>
-              <w:top w:w="120" w:type="dxa"/>
-              <w:bottom w:w="120" w:type="dxa"/>
-              <w:left w:w="150" w:type="dxa"/>
-              <w:right w:w="150" w:type="dxa"/>
-            </w:tcMar>
-          </w:tcPr>
-          <w:p>
-            <w:r>
-              <w:rPr>
-                <w:b/>
-                <w:color w:val="FFFFFF"/>
-              </w:rPr>
-              <w:t>Carrera Profesional</w:t>
-            </w:r>
-          </w:p>
-        </w:tc>
-        <w:tc>
-          <w:tcPr>
-            <w:tcW w:type="dxa" w:w="3120"/>
-            <w:shd w:fill="13357B"/>
-            <w:tcMar>
-              <w:top w:w="120" w:type="dxa"/>
-              <w:bottom w:w="120" w:type="dxa"/>
-              <w:left w:w="150" w:type="dxa"/>
-              <w:right w:w="150" w:type="dxa"/>
-            </w:tcMar>
-          </w:tcPr>
-          <w:p>
-            <w:r>
-              <w:rPr>
-                <w:b/>
-                <w:color w:val="FFFFFF"/>
-              </w:rPr>
-              <w:t>Enfoque Formativo</w:t>
-            </w:r>
-          </w:p>
-        </w:tc>
-        <w:tc>
-          <w:tcPr>
-            <w:tcW w:type="dxa" w:w="3120"/>
-            <w:shd w:fill="13357B"/>
-            <w:tcMar>
-              <w:top w:w="120" w:type="dxa"/>
-              <w:bottom w:w="120" w:type="dxa"/>
-              <w:left w:w="150" w:type="dxa"/>
-              <w:right w:w="150" w:type="dxa"/>
-            </w:tcMar>
-          </w:tcPr>
-          <w:p>
-            <w:r>
-              <w:rPr>
-                <w:b/>
-                <w:color w:val="FFFFFF"/>
-              </w:rPr>
-              <w:t>Campo Laboral en Paita / Piura</w:t>
+              <w:t>Persistencia del historial de consultas recientes del usuario y preferencias de tema de interfaz.</w:t>
             </w:r>
           </w:p>
         </w:tc>
@@ -974,7 +1576,7 @@
                 <w:rFonts w:ascii="Arial" w:hAnsi="Arial"/>
                 <w:sz w:val="19"/>
               </w:rPr>
-              <w:t>Arquitectura de Plataformas y Servicios TI (APSTI)</w:t>
+              <w:t>Despliegue y CDN</w:t>
             </w:r>
           </w:p>
         </w:tc>
@@ -994,7 +1596,7 @@
                 <w:rFonts w:ascii="Arial" w:hAnsi="Arial"/>
                 <w:sz w:val="19"/>
               </w:rPr>
-              <w:t>Desarrollo de software web y móvil, administración de redes, ciberseguridad, servidores e infraestructura cloud.</w:t>
+              <w:t>GitHub Pages (HTTPS Global)</w:t>
             </w:r>
           </w:p>
         </w:tc>
@@ -1014,193 +1616,7 @@
                 <w:rFonts w:ascii="Arial" w:hAnsi="Arial"/>
                 <w:sz w:val="19"/>
               </w:rPr>
-              <w:t>Desarrollador web/móvil, administrador cloud, soporte TI en agencias aduaneras y empresas portuarias.</w:t>
-            </w:r>
-          </w:p>
-        </w:tc>
-      </w:tr>
-      <w:tr>
-        <w:tc>
-          <w:tcPr>
-            <w:tcW w:type="dxa" w:w="3120"/>
-            <w:tcMar>
-              <w:top w:w="100" w:type="dxa"/>
-              <w:bottom w:w="100" w:type="dxa"/>
-              <w:left w:w="120" w:type="dxa"/>
-              <w:right w:w="120" w:type="dxa"/>
-            </w:tcMar>
-          </w:tcPr>
-          <w:p>
-            <w:r>
-              <w:rPr>
-                <w:rFonts w:ascii="Arial" w:hAnsi="Arial"/>
-                <w:sz w:val="19"/>
-              </w:rPr>
-              <w:t>Administración de Negocios Internacionales (ANI)</w:t>
-            </w:r>
-          </w:p>
-        </w:tc>
-        <w:tc>
-          <w:tcPr>
-            <w:tcW w:type="dxa" w:w="3120"/>
-            <w:tcMar>
-              <w:top w:w="100" w:type="dxa"/>
-              <w:bottom w:w="100" w:type="dxa"/>
-              <w:left w:w="120" w:type="dxa"/>
-              <w:right w:w="120" w:type="dxa"/>
-            </w:tcMar>
-          </w:tcPr>
-          <w:p>
-            <w:r>
-              <w:rPr>
-                <w:rFonts w:ascii="Arial" w:hAnsi="Arial"/>
-                <w:sz w:val="19"/>
-              </w:rPr>
-              <w:t>Estrategias comerciales globales, exportación de productos del norte, aduanas, logística de contenedores y transporte marítimo.</w:t>
-            </w:r>
-          </w:p>
-        </w:tc>
-        <w:tc>
-          <w:tcPr>
-            <w:tcW w:type="dxa" w:w="3120"/>
-            <w:tcMar>
-              <w:top w:w="100" w:type="dxa"/>
-              <w:bottom w:w="100" w:type="dxa"/>
-              <w:left w:w="120" w:type="dxa"/>
-              <w:right w:w="120" w:type="dxa"/>
-            </w:tcMar>
-          </w:tcPr>
-          <w:p>
-            <w:r>
-              <w:rPr>
-                <w:rFonts w:ascii="Arial" w:hAnsi="Arial"/>
-                <w:sz w:val="19"/>
-              </w:rPr>
-              <w:t>Agencias marítimas y de aduanas en el Puerto de Paita, almacenes fiscales y empresas exportadoras.</w:t>
-            </w:r>
-          </w:p>
-        </w:tc>
-      </w:tr>
-      <w:tr>
-        <w:tc>
-          <w:tcPr>
-            <w:tcW w:type="dxa" w:w="3120"/>
-            <w:tcMar>
-              <w:top w:w="100" w:type="dxa"/>
-              <w:bottom w:w="100" w:type="dxa"/>
-              <w:left w:w="120" w:type="dxa"/>
-              <w:right w:w="120" w:type="dxa"/>
-            </w:tcMar>
-          </w:tcPr>
-          <w:p>
-            <w:r>
-              <w:rPr>
-                <w:rFonts w:ascii="Arial" w:hAnsi="Arial"/>
-                <w:sz w:val="19"/>
-              </w:rPr>
-              <w:t>Contabilidad</w:t>
-            </w:r>
-          </w:p>
-        </w:tc>
-        <w:tc>
-          <w:tcPr>
-            <w:tcW w:type="dxa" w:w="3120"/>
-            <w:tcMar>
-              <w:top w:w="100" w:type="dxa"/>
-              <w:bottom w:w="100" w:type="dxa"/>
-              <w:left w:w="120" w:type="dxa"/>
-              <w:right w:w="120" w:type="dxa"/>
-            </w:tcMar>
-          </w:tcPr>
-          <w:p>
-            <w:r>
-              <w:rPr>
-                <w:rFonts w:ascii="Arial" w:hAnsi="Arial"/>
-                <w:sz w:val="19"/>
-              </w:rPr>
-              <w:t>Gestión tributaria (SUNAT), formulación de estados financieros, libros electrónicos, auditoría y costos empresariales.</w:t>
-            </w:r>
-          </w:p>
-        </w:tc>
-        <w:tc>
-          <w:tcPr>
-            <w:tcW w:type="dxa" w:w="3120"/>
-            <w:tcMar>
-              <w:top w:w="100" w:type="dxa"/>
-              <w:bottom w:w="100" w:type="dxa"/>
-              <w:left w:w="120" w:type="dxa"/>
-              <w:right w:w="120" w:type="dxa"/>
-            </w:tcMar>
-          </w:tcPr>
-          <w:p>
-            <w:r>
-              <w:rPr>
-                <w:rFonts w:ascii="Arial" w:hAnsi="Arial"/>
-                <w:sz w:val="19"/>
-              </w:rPr>
-              <w:t>Estudios contables, entidades bancarias (Banco de la Nación, Cajas Piura), hospitales, municipios y MYPES.</w:t>
-            </w:r>
-          </w:p>
-        </w:tc>
-      </w:tr>
-      <w:tr>
-        <w:tc>
-          <w:tcPr>
-            <w:tcW w:type="dxa" w:w="3120"/>
-            <w:tcMar>
-              <w:top w:w="100" w:type="dxa"/>
-              <w:bottom w:w="100" w:type="dxa"/>
-              <w:left w:w="120" w:type="dxa"/>
-              <w:right w:w="120" w:type="dxa"/>
-            </w:tcMar>
-          </w:tcPr>
-          <w:p>
-            <w:r>
-              <w:rPr>
-                <w:rFonts w:ascii="Arial" w:hAnsi="Arial"/>
-                <w:sz w:val="19"/>
-              </w:rPr>
-              <w:t>Desarrollo Pesquero y Acuícola (DPA)</w:t>
-            </w:r>
-          </w:p>
-        </w:tc>
-        <w:tc>
-          <w:tcPr>
-            <w:tcW w:type="dxa" w:w="3120"/>
-            <w:tcMar>
-              <w:top w:w="100" w:type="dxa"/>
-              <w:bottom w:w="100" w:type="dxa"/>
-              <w:left w:w="120" w:type="dxa"/>
-              <w:right w:w="120" w:type="dxa"/>
-            </w:tcMar>
-          </w:tcPr>
-          <w:p>
-            <w:r>
-              <w:rPr>
-                <w:rFonts w:ascii="Arial" w:hAnsi="Arial"/>
-                <w:sz w:val="19"/>
-              </w:rPr>
-              <w:t>Cultivo de conchas de abanico y langostinos, faenas de navegación pesquera, procesamiento industrial e inocuidad alimentaria (HACCP).</w:t>
-            </w:r>
-          </w:p>
-        </w:tc>
-        <w:tc>
-          <w:tcPr>
-            <w:tcW w:type="dxa" w:w="3120"/>
-            <w:tcMar>
-              <w:top w:w="100" w:type="dxa"/>
-              <w:bottom w:w="100" w:type="dxa"/>
-              <w:left w:w="120" w:type="dxa"/>
-              <w:right w:w="120" w:type="dxa"/>
-            </w:tcMar>
-          </w:tcPr>
-          <w:p>
-            <w:r>
-              <w:rPr>
-                <w:rFonts w:ascii="Arial" w:hAnsi="Arial"/>
-                <w:sz w:val="19"/>
-              </w:rPr>
-              <w:t>Supervisores QA/QC en plantas congeladoras y conserveras de Paita, criaderos acuícolas e inspectores sanitarios.</w:t>
+              <w:t>Alojamiento en la nube con disponibilidad permanente 24/7, certificado SSL activo y CDN de alta velocidad.</w:t>
             </w:r>
           </w:p>
         </w:tc>
@@ -1215,23 +1631,9 @@
           <w:rFonts w:ascii="Arial" w:hAnsi="Arial"/>
           <w:b/>
           <w:color w:val="13357B"/>
-          <w:sz w:val="30"/>
+          <w:sz w:val="28"/>
         </w:rPr>
-        <w:t>5. PROCEDIMIENTOS DE MATRÍCULA Y REGISTRO DE PAGOS</w:t>
-      </w:r>
-    </w:p>
-    <w:p>
-      <w:pPr>
-        <w:spacing w:before="240" w:after="80"/>
-      </w:pPr>
-      <w:r>
-        <w:rPr>
-          <w:rFonts w:ascii="Arial" w:hAnsi="Arial"/>
-          <w:b/>
-          <w:color w:val="2563EB"/>
-          <w:sz w:val="25"/>
-        </w:rPr>
-        <w:t>5.1. Matrícula y Gratuidad de la Enseñanza</w:t>
+        <w:t>7. MOTOR DE HUMANIZACIÓN VOCAL FEMENINA Y DICTADO</w:t>
       </w:r>
     </w:p>
     <w:p>
@@ -1241,23 +1643,10 @@
       <w:r>
         <w:rPr>
           <w:rFonts w:ascii="Arial" w:hAnsi="Arial"/>
+          <w:color w:val="1E293B"/>
           <w:sz w:val="21"/>
         </w:rPr>
-        <w:t>Por ser una institución pública estatal supervisada por el Ministerio de Educación (MINEDU) y la Dirección Regional de Educación de Piura (DREP), no existen pensiones mensuales. Los estudiantes únicamente abonan una tasa administrativa semestral conforme al TUPA institucional (aproximadamente S/ 150 a S/ 250 por ciclo de 6 meses completo).</w:t>
-      </w:r>
-    </w:p>
-    <w:p>
-      <w:pPr>
-        <w:spacing w:before="240" w:after="80"/>
-      </w:pPr>
-      <w:r>
-        <w:rPr>
-          <w:rFonts w:ascii="Arial" w:hAnsi="Arial"/>
-          <w:b/>
-          <w:color w:val="2563EB"/>
-          <w:sz w:val="25"/>
-        </w:rPr>
-        <w:t>5.2. Protocolo de Registro de Vouchers</w:t>
+        <w:t>Uno de los mayores logros del proyecto es la humanización de la voz de HercarIA, eliminando cualquier sensación de sintetizador robótico antiguo:</w:t>
       </w:r>
     </w:p>
     <w:p>
@@ -1269,16 +1658,18 @@
         <w:rPr>
           <w:rFonts w:ascii="Arial" w:hAnsi="Arial"/>
           <w:b/>
+          <w:color w:val="1E293B"/>
           <w:sz w:val="21"/>
         </w:rPr>
-        <w:t xml:space="preserve">Paso 1: </w:t>
+        <w:t xml:space="preserve">Calibración Acústica Agradable y Femenina: </w:t>
       </w:r>
       <w:r>
         <w:rPr>
           <w:rFonts w:ascii="Arial" w:hAnsi="Arial"/>
+          <w:color w:val="1E293B"/>
           <w:sz w:val="21"/>
         </w:rPr>
-        <w:t>El usuario realiza el depósito en el Banco de la Nación (ventanilla o Agente MultiRed) y conserva el comprobante.</w:t>
+        <w:t>Se calibró la tasa de velocidad en 0.93 y el tono (pitch) en 1.05. Este ajuste acústico produce una cadencia pausada, melodiosa, suave y natural, ideal para la atención y orientación vocacional.</w:t>
       </w:r>
     </w:p>
     <w:p>
@@ -1290,16 +1681,18 @@
         <w:rPr>
           <w:rFonts w:ascii="Arial" w:hAnsi="Arial"/>
           <w:b/>
+          <w:color w:val="1E293B"/>
           <w:sz w:val="21"/>
         </w:rPr>
-        <w:t xml:space="preserve">Paso 2: </w:t>
+        <w:t xml:space="preserve">Supresión Total de Sintaxis Markdown y Asteriscos: </w:t>
       </w:r>
       <w:r>
         <w:rPr>
           <w:rFonts w:ascii="Arial" w:hAnsi="Arial"/>
+          <w:color w:val="1E293B"/>
           <w:sz w:val="21"/>
         </w:rPr>
-        <w:t>Accede a la plataforma oficial: https://pagos.ieshercar.edu.pe/</w:t>
+        <w:t>Se diseñó un filtro de limpieza previa (regex) que erradica por completo la pronunciación de asteriscos (**), guiones, numerales (#), barras y tablas. La voz habla con lenguaje conversacional limpio mientras la pantalla muestra el texto formateado con viñetas y negritas.</w:t>
       </w:r>
     </w:p>
     <w:p>
@@ -1311,16 +1704,18 @@
         <w:rPr>
           <w:rFonts w:ascii="Arial" w:hAnsi="Arial"/>
           <w:b/>
+          <w:color w:val="1E293B"/>
           <w:sz w:val="21"/>
         </w:rPr>
-        <w:t xml:space="preserve">Paso 3: </w:t>
+        <w:t xml:space="preserve">Normalización Fonética de Siglas Institucionales: </w:t>
       </w:r>
       <w:r>
         <w:rPr>
           <w:rFonts w:ascii="Arial" w:hAnsi="Arial"/>
+          <w:color w:val="1E293B"/>
           <w:sz w:val="21"/>
         </w:rPr>
-        <w:t>Ingresa su número de DNI para autenticarse en el sistema.</w:t>
+        <w:t>El preprocesador vocal traduce términos técnicos antes de llegar al sintetizador: "APSTI" se modula fonéticamente como "Ápsti" o "Arquitectura de Plataformas y Servicios TI", "ANI" como "Ani", "DPA" como "D P A", "S/ 150" como "150 soles", "IESTP" como "Instituto", y "SUNAT" como "Sunat".</w:t>
       </w:r>
     </w:p>
     <w:p>
@@ -1332,16 +1727,18 @@
         <w:rPr>
           <w:rFonts w:ascii="Arial" w:hAnsi="Arial"/>
           <w:b/>
+          <w:color w:val="1E293B"/>
           <w:sz w:val="21"/>
         </w:rPr>
-        <w:t xml:space="preserve">Paso 4: </w:t>
+        <w:t xml:space="preserve">Priorización Inteligente de Voces Femeninas: </w:t>
       </w:r>
       <w:r>
         <w:rPr>
           <w:rFonts w:ascii="Arial" w:hAnsi="Arial"/>
+          <w:color w:val="1E293B"/>
           <w:sz w:val="21"/>
         </w:rPr>
-        <w:t>Selecciona el concepto (Matrícula, Examen de Admisión o Trámite) y digita el Número de Operación, Fecha y Monto.</w:t>
+        <w:t>En la versión web (GitHub Pages y celulares), el sistema analiza las voces instaladas en el dispositivo y selecciona prioritariamente voces dulces en español (Dalia, Camila, Salome, Elvira, Sabina).</w:t>
       </w:r>
     </w:p>
     <w:p>
@@ -1353,16 +1750,18 @@
         <w:rPr>
           <w:rFonts w:ascii="Arial" w:hAnsi="Arial"/>
           <w:b/>
+          <w:color w:val="1E293B"/>
           <w:sz w:val="21"/>
         </w:rPr>
-        <w:t xml:space="preserve">Paso 5: </w:t>
+        <w:t xml:space="preserve">Módulo de Audio Desplegable Popover: </w:t>
       </w:r>
       <w:r>
         <w:rPr>
           <w:rFonts w:ascii="Arial" w:hAnsi="Arial"/>
+          <w:color w:val="1E293B"/>
           <w:sz w:val="21"/>
         </w:rPr>
-        <w:t>Adjunta el archivo o foto del voucher legible y confirma el registro.</w:t>
+        <w:t>En la cabecera superior se incluye el botón minimalista "[ 🔊 🟢 Voz ]". Al hacer clic, despliega un panel flotante donde el usuario puede activar/desactivar la voz, elegir su voz favorita y probar la entonación con el botón "Probar Voz".</w:t>
       </w:r>
     </w:p>
     <w:p>
@@ -1374,16 +1773,18 @@
         <w:rPr>
           <w:rFonts w:ascii="Arial" w:hAnsi="Arial"/>
           <w:b/>
+          <w:color w:val="1E293B"/>
           <w:sz w:val="21"/>
         </w:rPr>
-        <w:t xml:space="preserve">Paso 6: </w:t>
+        <w:t xml:space="preserve">Cancelación Instantánea de Ecos y Ruidos: </w:t>
       </w:r>
       <w:r>
         <w:rPr>
           <w:rFonts w:ascii="Arial" w:hAnsi="Arial"/>
+          <w:color w:val="1E293B"/>
           <w:sz w:val="21"/>
         </w:rPr>
-        <w:t>Descarga la boleta electrónica oficial desde: https://sistema.ieshercar.com/Consulta_Boletas/index.php</w:t>
+        <w:t>Se programó la interrupción inmediata de la síntesis vocal al presionar la tecla Escape, al dar clic en el campo de texto o al enviar una nueva consulta, evitando la superposición molesta de audios.</w:t>
       </w:r>
     </w:p>
     <w:p>
@@ -1395,9 +1796,9 @@
           <w:rFonts w:ascii="Arial" w:hAnsi="Arial"/>
           <w:b/>
           <w:color w:val="13357B"/>
-          <w:sz w:val="30"/>
+          <w:sz w:val="28"/>
         </w:rPr>
-        <w:t>6. MEMORIA DE DESARROLLO: CÓMO SE CONSTRUYÓ HERCARTIA</w:t>
+        <w:t>8. REDISEÑO ERGONÓMICO DE LA INTERFAZ DE USUARIO (UI/UX)</w:t>
       </w:r>
     </w:p>
     <w:p>
@@ -1407,23 +1808,10 @@
       <w:r>
         <w:rPr>
           <w:rFonts w:ascii="Arial" w:hAnsi="Arial"/>
+          <w:color w:val="1E293B"/>
           <w:sz w:val="21"/>
         </w:rPr>
-        <w:t>El desarrollo de HercarIA se llevó a cabo siguiendo una metodología ágil de ingeniería de software orientada a prototipado rápido, alta fidelidad visual y optimización de rendimiento. A continuación se desglosan las fases de construcción:</w:t>
-      </w:r>
-    </w:p>
-    <w:p>
-      <w:pPr>
-        <w:spacing w:before="240" w:after="80"/>
-      </w:pPr>
-      <w:r>
-        <w:rPr>
-          <w:rFonts w:ascii="Arial" w:hAnsi="Arial"/>
-          <w:b/>
-          <w:color w:val="2563EB"/>
-          <w:sz w:val="25"/>
-        </w:rPr>
-        <w:t>Fase 1: Extracción y Estructuración de Conocimiento Institucional</w:t>
+        <w:t>Para brindar una experiencia óptima al usuario, se rediseñó la distribución de los componentes eliminando saturaciones visuales:</w:t>
       </w:r>
     </w:p>
     <w:p>
@@ -1435,16 +1823,18 @@
         <w:rPr>
           <w:rFonts w:ascii="Arial" w:hAnsi="Arial"/>
           <w:b/>
+          <w:color w:val="1E293B"/>
           <w:sz w:val="21"/>
         </w:rPr>
-        <w:t xml:space="preserve">Recopilación de Fuentes Oficiales: </w:t>
+        <w:t xml:space="preserve">Menú Lateral Limpio estilo ChatGPT: </w:t>
       </w:r>
       <w:r>
         <w:rPr>
           <w:rFonts w:ascii="Arial" w:hAnsi="Arial"/>
+          <w:color w:val="1E293B"/>
           <w:sz w:val="21"/>
         </w:rPr>
-        <w:t>Se realizó un relevamiento minucioso de la web oficial ieshercar.edu.pe, portales de pago (pagos.ieshercar.edu.pe), sistema de boletas y el TUPA del instituto.</w:t>
+        <w:t>El menú lateral (Sidebar) se reservó exclusivamente para las acciones de navegación fundamentales: botón destacado "+ Nueva Conversación", acceso rápido a "Test Vocacional", lista de "Consultas Recientes" y conmutador de "Modo Oscuro".</w:t>
       </w:r>
     </w:p>
     <w:p>
@@ -1456,30 +1846,18 @@
         <w:rPr>
           <w:rFonts w:ascii="Arial" w:hAnsi="Arial"/>
           <w:b/>
+          <w:color w:val="1E293B"/>
           <w:sz w:val="21"/>
         </w:rPr>
-        <w:t xml:space="preserve">Categorización Ontológica: </w:t>
+        <w:t xml:space="preserve">Botones de Utilidad en Cabecera Superior: </w:t>
       </w:r>
       <w:r>
         <w:rPr>
           <w:rFonts w:ascii="Arial" w:hAnsi="Arial"/>
+          <w:color w:val="1E293B"/>
           <w:sz w:val="21"/>
         </w:rPr>
-        <w:t>La información se estructuró en js/knowledge.js bajo tópicos bien diferenciados: Identidad histórica y héroes patronos Cárcamo, las 4 carreras técnicas, requisitos de admisión y fechas, estructura de costos públicos (gratuidad de enseñanza) y guía de trámites de Mesa de Partes.</w:t>
-      </w:r>
-    </w:p>
-    <w:p>
-      <w:pPr>
-        <w:spacing w:before="240" w:after="80"/>
-      </w:pPr>
-      <w:r>
-        <w:rPr>
-          <w:rFonts w:ascii="Arial" w:hAnsi="Arial"/>
-          <w:b/>
-          <w:color w:val="2563EB"/>
-          <w:sz w:val="25"/>
-        </w:rPr>
-        <w:t>Fase 2: Diseño de Experiencia de Usuario (UI/UX) Estilo ChatGPT</w:t>
+        <w:t>Las funciones operativas se trasladaron a la esquina superior derecha del encabezado, junto al selector de voz: el botón "Guardar Chat" (descarga la transcripción en un archivo .txt con membrete oficial) y el botón "Borrar Chat" (reinicia la sesión de diálogo de manera segura).</w:t>
       </w:r>
     </w:p>
     <w:p>
@@ -1491,16 +1869,18 @@
         <w:rPr>
           <w:rFonts w:ascii="Arial" w:hAnsi="Arial"/>
           <w:b/>
+          <w:color w:val="1E293B"/>
           <w:sz w:val="21"/>
         </w:rPr>
-        <w:t xml:space="preserve">Estructura Visual: </w:t>
+        <w:t xml:space="preserve">Barra de Píldoras de Acceso Rápido (Chips): </w:t>
       </w:r>
       <w:r>
         <w:rPr>
           <w:rFonts w:ascii="Arial" w:hAnsi="Arial"/>
+          <w:color w:val="1E293B"/>
           <w:sz w:val="21"/>
         </w:rPr>
-        <w:t>Se adoptó una maquetación en pantalla completa con barra lateral colapsable, contenedor central conversacional y una portada de bienvenida ("¿Qué deseas consultar hoy?") que contextualiza al visitante.</w:t>
+        <w:t>Directamente sobre el cuadro de entrada de texto se dispuso una barra horizontal con chips interactivos ("Las 4 Carreras Técnicas", "Registro de Pagos", "Matrícula y Costos 2026", "Mesa de Partes Virtual", "Ubicación y Contacto"). Al presionar un chip, la consulta se envía inmediatamente al chat sin necesidad de teclear.</w:t>
       </w:r>
     </w:p>
     <w:p>
@@ -1512,16 +1892,45 @@
         <w:rPr>
           <w:rFonts w:ascii="Arial" w:hAnsi="Arial"/>
           <w:b/>
+          <w:color w:val="1E293B"/>
           <w:sz w:val="21"/>
         </w:rPr>
-        <w:t xml:space="preserve">Estandarización Iconográfica: </w:t>
+        <w:t xml:space="preserve">Navegación Adaptativa de 3 Líneas: </w:t>
       </w:r>
       <w:r>
         <w:rPr>
           <w:rFonts w:ascii="Arial" w:hAnsi="Arial"/>
+          <w:color w:val="1E293B"/>
           <w:sz w:val="21"/>
         </w:rPr>
-        <w:t>Se reemplazaron emojis heterogéneos por una librería unificada de iconos vectoriales SVG con trazo de 2px, garantizando un aspecto sobrio y corporativo.</w:t>
+        <w:t>En computadoras de escritorio, el icono de menú colapsa la barra lateral para otorgar el 100% de la pantalla a la conversación. En teléfonos inteligentes, abre un Drawer deslizante con fondo oscuro translúcido y botón táctil de cierre.</w:t>
+      </w:r>
+    </w:p>
+    <w:p>
+      <w:pPr>
+        <w:spacing w:before="360" w:after="120"/>
+      </w:pPr>
+      <w:r>
+        <w:rPr>
+          <w:rFonts w:ascii="Arial" w:hAnsi="Arial"/>
+          <w:b/>
+          <w:color w:val="13357B"/>
+          <w:sz w:val="28"/>
+        </w:rPr>
+        <w:t>9. TEST VOCACIONAL PSICOMÉTRICO INTERACTIVO</w:t>
+      </w:r>
+    </w:p>
+    <w:p>
+      <w:pPr>
+        <w:spacing w:after="120" w:line="276" w:lineRule="auto"/>
+      </w:pPr>
+      <w:r>
+        <w:rPr>
+          <w:rFonts w:ascii="Arial" w:hAnsi="Arial"/>
+          <w:color w:val="1E293B"/>
+          <w:sz w:val="21"/>
+        </w:rPr>
+        <w:t>El sistema incorpora un orientador vocacional desarrollado en js/test_vocacional.js que diagnostica la inclinación profesional del postulante mediante 6 reactivos interactivos:</w:t>
       </w:r>
     </w:p>
     <w:p>
@@ -1533,30 +1942,18 @@
         <w:rPr>
           <w:rFonts w:ascii="Arial" w:hAnsi="Arial"/>
           <w:b/>
+          <w:color w:val="1E293B"/>
           <w:sz w:val="21"/>
         </w:rPr>
-        <w:t xml:space="preserve">Identidad Visual Institucional: </w:t>
+        <w:t xml:space="preserve">Pregunta 1 (Intereses Naturales): </w:t>
       </w:r>
       <w:r>
         <w:rPr>
           <w:rFonts w:ascii="Arial" w:hAnsi="Arial"/>
+          <w:color w:val="1E293B"/>
           <w:sz w:val="21"/>
         </w:rPr>
-        <w:t>Se aplicó la paleta cromática oficial: Azul Marino (#13357b), Azul Eléctrico (#2563eb) y Acentos Ámbar (#f59e0b), complementado con soporte de Tema Oscuro (Dark Mode).</w:t>
-      </w:r>
-    </w:p>
-    <w:p>
-      <w:pPr>
-        <w:spacing w:before="240" w:after="80"/>
-      </w:pPr>
-      <w:r>
-        <w:rPr>
-          <w:rFonts w:ascii="Arial" w:hAnsi="Arial"/>
-          <w:b/>
-          <w:color w:val="2563EB"/>
-          <w:sz w:val="25"/>
-        </w:rPr>
-        <w:t>Fase 3: Desarrollo del Test Vocacional Interactivo</w:t>
+        <w:t>Indaga sobre actividades predilectas en tiempo libre (resolver problemas tecnológicos, coordinar proyectos comerciales, organizar finanzas o explorar la fauna marina).</w:t>
       </w:r>
     </w:p>
     <w:p>
@@ -1568,16 +1965,18 @@
         <w:rPr>
           <w:rFonts w:ascii="Arial" w:hAnsi="Arial"/>
           <w:b/>
+          <w:color w:val="1E293B"/>
           <w:sz w:val="21"/>
         </w:rPr>
-        <w:t xml:space="preserve">Algoritmo de Compatibilidad: </w:t>
+        <w:t xml:space="preserve">Pregunta 2 (Entorno Laboral Deseado): </w:t>
       </w:r>
       <w:r>
         <w:rPr>
           <w:rFonts w:ascii="Arial" w:hAnsi="Arial"/>
+          <w:color w:val="1E293B"/>
           <w:sz w:val="21"/>
         </w:rPr>
-        <w:t>Se implementó en js/test_vocacional.js un cuestionario interactivo de 6 reactivos con opciones múltiples que evalúan afinidad hacia software y redes (APSTI), logística y puertos (ANI), finanzas y tributos (Contabilidad) o recursos marinos y pesquería (DPA).</w:t>
+        <w:t>Evalúa el ambiente de trabajo preferido (oficinas tecnológicas con servidores, agencias aduaneras portuarias, despachos tributarios o plantas de procesamiento y embarcaciones).</w:t>
       </w:r>
     </w:p>
     <w:p>
@@ -1589,30 +1988,18 @@
         <w:rPr>
           <w:rFonts w:ascii="Arial" w:hAnsi="Arial"/>
           <w:b/>
+          <w:color w:val="1E293B"/>
           <w:sz w:val="21"/>
         </w:rPr>
-        <w:t xml:space="preserve">Cálculo Dinámico: </w:t>
+        <w:t xml:space="preserve">Pregunta 3 (Habilidades Destacadas): </w:t>
       </w:r>
       <w:r>
         <w:rPr>
           <w:rFonts w:ascii="Arial" w:hAnsi="Arial"/>
+          <w:color w:val="1E293B"/>
           <w:sz w:val="21"/>
         </w:rPr>
-        <w:t>Al finalizar las 6 preguntas, el algoritmo calcula el porcentaje de compatibilidad relativa y presenta una tarjeta destacada con trofeo dorado y sugerencias de inserción profesional.</w:t>
-      </w:r>
-    </w:p>
-    <w:p>
-      <w:pPr>
-        <w:spacing w:before="240" w:after="80"/>
-      </w:pPr>
-      <w:r>
-        <w:rPr>
-          <w:rFonts w:ascii="Arial" w:hAnsi="Arial"/>
-          <w:b/>
-          <w:color w:val="2563EB"/>
-          <w:sz w:val="25"/>
-        </w:rPr>
-        <w:t>Fase 4: Motor de Voz Femenina Neural Peruana y Dictado por Micrófono</w:t>
+        <w:t>Mide competencias autopercibidas (pensamiento analítico y algoritmos, negociación persuasiva, exactitud numérica y orden, o destreza biológica y trabajo en campo).</w:t>
       </w:r>
     </w:p>
     <w:p>
@@ -1624,16 +2011,18 @@
         <w:rPr>
           <w:rFonts w:ascii="Arial" w:hAnsi="Arial"/>
           <w:b/>
+          <w:color w:val="1E293B"/>
           <w:sz w:val="21"/>
         </w:rPr>
-        <w:t xml:space="preserve">Voz Neural Camila (Perú): </w:t>
+        <w:t xml:space="preserve">Pregunta 4 (Motivación Profesional): </w:t>
       </w:r>
       <w:r>
         <w:rPr>
           <w:rFonts w:ascii="Arial" w:hAnsi="Arial"/>
+          <w:color w:val="1E293B"/>
           <w:sz w:val="21"/>
         </w:rPr>
-        <w:t>Se adoptó como estándar principal es-PE-CamilaNeural a través de Microsoft Edge TTS, garantizando una entonación dulce, natural y con fonética propia del Perú para la comunidad de Paita y Piura.</w:t>
+        <w:t>Analiza metas de vida (crear soluciones de software para empresas, impulsar exportaciones regionales hacia mercados globales, liderar la administración contable de grandes corporaciones o innovar en la maricultura sostenible).</w:t>
       </w:r>
     </w:p>
     <w:p>
@@ -1645,16 +2034,18 @@
         <w:rPr>
           <w:rFonts w:ascii="Arial" w:hAnsi="Arial"/>
           <w:b/>
+          <w:color w:val="1E293B"/>
           <w:sz w:val="21"/>
         </w:rPr>
-        <w:t xml:space="preserve">Normalización Fonética Especializada: </w:t>
+        <w:t xml:space="preserve">Pregunta 5 (Resolución de Conflictos): </w:t>
       </w:r>
       <w:r>
         <w:rPr>
           <w:rFonts w:ascii="Arial" w:hAnsi="Arial"/>
+          <w:color w:val="1E293B"/>
           <w:sz w:val="21"/>
         </w:rPr>
-        <w:t>Se incorporó un preprocesador que traduce siglas antes de la síntesis (I.E.S.T.P. a "Instituto", S/ 150 a "150 soles", APSTI a "A P S T I"), eliminando pausas forzadas o lecturas fragmentadas.</w:t>
+        <w:t>Evalúa el estilo de respuesta ante desafíos cotidianos.</w:t>
       </w:r>
     </w:p>
     <w:p>
@@ -1666,16 +2057,58 @@
         <w:rPr>
           <w:rFonts w:ascii="Arial" w:hAnsi="Arial"/>
           <w:b/>
+          <w:color w:val="1E293B"/>
           <w:sz w:val="21"/>
         </w:rPr>
-        <w:t xml:space="preserve">Segmentación Inteligente por Expresiones Regulares: </w:t>
+        <w:t xml:space="preserve">Pregunta 6 (Visión de Futuro en Paita): </w:t>
       </w:r>
       <w:r>
         <w:rPr>
           <w:rFonts w:ascii="Arial" w:hAnsi="Arial"/>
+          <w:color w:val="1E293B"/>
           <w:sz w:val="21"/>
         </w:rPr>
-        <w:t>Se reemplazó la división simplista por puntos por un parser de oraciones completas que une frases coherentes hasta 320 caracteres, garantizando fluidez total.</w:t>
+        <w:t>Conecta las aspiraciones personales con las oportunidades laborales tangibles del puerto de Paita y la Región Piura.</w:t>
+      </w:r>
+    </w:p>
+    <w:p>
+      <w:pPr>
+        <w:spacing w:after="120" w:line="276" w:lineRule="auto"/>
+      </w:pPr>
+      <w:r>
+        <w:rPr>
+          <w:rFonts w:ascii="Arial" w:hAnsi="Arial"/>
+          <w:color w:val="1E293B"/>
+          <w:sz w:val="21"/>
+        </w:rPr>
+        <w:t>Al culminar la evaluación, el algoritmo calcula el porcentaje de afinidad de las 4 carreras, presenta una tarjeta interactiva con trofeo dorado, detalla el campo laboral en la región y ofrece botones de acción para revisar la malla curricular o conocer los requisitos de matrícula.</w:t>
+      </w:r>
+    </w:p>
+    <w:p>
+      <w:pPr>
+        <w:spacing w:before="360" w:after="120"/>
+      </w:pPr>
+      <w:r>
+        <w:rPr>
+          <w:rFonts w:ascii="Arial" w:hAnsi="Arial"/>
+          <w:b/>
+          <w:color w:val="13357B"/>
+          <w:sz w:val="28"/>
+        </w:rPr>
+        <w:t>10. MEMORIA DE CONSTRUCCIÓN PASO A PASO</w:t>
+      </w:r>
+    </w:p>
+    <w:p>
+      <w:pPr>
+        <w:spacing w:after="120" w:line="276" w:lineRule="auto"/>
+      </w:pPr>
+      <w:r>
+        <w:rPr>
+          <w:rFonts w:ascii="Arial" w:hAnsi="Arial"/>
+          <w:color w:val="1E293B"/>
+          <w:sz w:val="21"/>
+        </w:rPr>
+        <w:t>El desarrollo de HercarIA se ejecutó siguiendo 6 fases sistemáticas:</w:t>
       </w:r>
     </w:p>
     <w:p>
@@ -1687,16 +2120,18 @@
         <w:rPr>
           <w:rFonts w:ascii="Arial" w:hAnsi="Arial"/>
           <w:b/>
+          <w:color w:val="1E293B"/>
           <w:sz w:val="21"/>
         </w:rPr>
-        <w:t xml:space="preserve">Control de Silenciamiento Inmediato: </w:t>
+        <w:t xml:space="preserve">Fase 1 (Recopilación e Ingeniería de Conocimiento): </w:t>
       </w:r>
       <w:r>
         <w:rPr>
           <w:rFonts w:ascii="Arial" w:hAnsi="Arial"/>
+          <w:color w:val="1E293B"/>
           <w:sz w:val="21"/>
         </w:rPr>
-        <w:t>Se programó la interrupción instantánea de audio mediante tecla Escape, clic en entrada de texto o activación del botón de silenciar, evitando solapamientos sonoros.</w:t>
+        <w:t>Extracción sistemática de datos desde el portal web oficial ieshercar.edu.pe, TUPA vigente, plataforma de pagos (pagos.ieshercar.edu.pe) y sistema de boletas electrónicas.</w:t>
       </w:r>
     </w:p>
     <w:p>
@@ -1708,30 +2143,18 @@
         <w:rPr>
           <w:rFonts w:ascii="Arial" w:hAnsi="Arial"/>
           <w:b/>
+          <w:color w:val="1E293B"/>
           <w:sz w:val="21"/>
         </w:rPr>
-        <w:t xml:space="preserve">Entrada por Micrófono (STT): </w:t>
+        <w:t xml:space="preserve">Fase 2 (Maquetación y Diseño Visual ChatGPT): </w:t>
       </w:r>
       <w:r>
         <w:rPr>
           <w:rFonts w:ascii="Arial" w:hAnsi="Arial"/>
+          <w:color w:val="1E293B"/>
           <w:sz w:val="21"/>
         </w:rPr>
-        <w:t>Se añadió reconocimiento de voz en tiempo real con indicador visual de ondas concéntricas (ripple pulse).</w:t>
-      </w:r>
-    </w:p>
-    <w:p>
-      <w:pPr>
-        <w:spacing w:before="240" w:after="80"/>
-      </w:pPr>
-      <w:r>
-        <w:rPr>
-          <w:rFonts w:ascii="Arial" w:hAnsi="Arial"/>
-          <w:b/>
-          <w:color w:val="2563EB"/>
-          <w:sz w:val="25"/>
-        </w:rPr>
-        <w:t>Fase 5: Navegación Adaptativa y Control de Conversación</w:t>
+        <w:t>Creación de index.html y css/styles.css con maquetación flexible en pantalla completa, portada hero con tarjetas explicativas y soporte completo para modo oscuro y claro.</w:t>
       </w:r>
     </w:p>
     <w:p>
@@ -1743,16 +2166,18 @@
         <w:rPr>
           <w:rFonts w:ascii="Arial" w:hAnsi="Arial"/>
           <w:b/>
+          <w:color w:val="1E293B"/>
           <w:sz w:val="21"/>
         </w:rPr>
-        <w:t xml:space="preserve">Menú Responsivo de 3 Líneas: </w:t>
+        <w:t xml:space="preserve">Fase 3 (Desarrollo del Motor NLP en JavaScript): </w:t>
       </w:r>
       <w:r>
         <w:rPr>
           <w:rFonts w:ascii="Arial" w:hAnsi="Arial"/>
+          <w:color w:val="1E293B"/>
           <w:sz w:val="21"/>
         </w:rPr>
-        <w:t>En pantallas de escritorio (Desktop), el botón de 3 líneas colapsa suavemente el menú lateral hacia la izquierda (-280px), otorgando el 100% de la pantalla al chat conversacional estilo ChatGPT. En dispositivos móviles y tabletas, despliega un cajón lateral (Drawer) con telón oscuro translúcido (overlay) y botón de cierre táctil.</w:t>
+        <w:t>Programación de js/app.js para detectar intenciones de usuario sobre requisitos, gratuidad, carreras, convalidaciones, títulos oficiales y horarios, aplicando normalización de cadenas de texto.</w:t>
       </w:r>
     </w:p>
     <w:p>
@@ -1764,16 +2189,18 @@
         <w:rPr>
           <w:rFonts w:ascii="Arial" w:hAnsi="Arial"/>
           <w:b/>
+          <w:color w:val="1E293B"/>
           <w:sz w:val="21"/>
         </w:rPr>
-        <w:t xml:space="preserve">Función Guardar Registro de Chat: </w:t>
+        <w:t xml:space="preserve">Fase 4 (Implementación del Test Psicométrico): </w:t>
       </w:r>
       <w:r>
         <w:rPr>
           <w:rFonts w:ascii="Arial" w:hAnsi="Arial"/>
+          <w:color w:val="1E293B"/>
           <w:sz w:val="21"/>
         </w:rPr>
-        <w:t>Permite al usuario descargar con un solo clic un archivo formal (.txt) con la transcripción completa de su diálogo, fecha, hora y encabezados institucionales para su archivo personal.</w:t>
+        <w:t>Codificación de js/test_vocacional.js con cálculo matricial dinámico y tarjetas visuales interactivas.</w:t>
       </w:r>
     </w:p>
     <w:p>
@@ -1785,16 +2212,18 @@
         <w:rPr>
           <w:rFonts w:ascii="Arial" w:hAnsi="Arial"/>
           <w:b/>
+          <w:color w:val="1E293B"/>
           <w:sz w:val="21"/>
         </w:rPr>
-        <w:t xml:space="preserve">Función Borrar Conversación: </w:t>
+        <w:t xml:space="preserve">Fase 5 (Humanización Vocal y Audio Desplegable): </w:t>
       </w:r>
       <w:r>
         <w:rPr>
           <w:rFonts w:ascii="Arial" w:hAnsi="Arial"/>
+          <w:color w:val="1E293B"/>
           <w:sz w:val="21"/>
         </w:rPr>
-        <w:t>Botón con confirmación interactiva para limpiar la pantalla de chat, restablecer el estado del sistema y regresar a la portada de bienvenida.</w:t>
+        <w:t>Desarrollo de js/voice.js, integrando Microsoft Edge TTS (Python) y síntesis del navegador con tono femenino dulce, filtros de sintaxis Markdown y dictado por micrófono.</w:t>
       </w:r>
     </w:p>
     <w:p>
@@ -1806,114 +2235,18 @@
         <w:rPr>
           <w:rFonts w:ascii="Arial" w:hAnsi="Arial"/>
           <w:b/>
+          <w:color w:val="1E293B"/>
           <w:sz w:val="21"/>
         </w:rPr>
-        <w:t xml:space="preserve">Historial de Consultas Recientes: </w:t>
+        <w:t xml:space="preserve">Fase 6 (Despliegue y Control de Versiones en GitHub): </w:t>
       </w:r>
       <w:r>
         <w:rPr>
           <w:rFonts w:ascii="Arial" w:hAnsi="Arial"/>
+          <w:color w:val="1E293B"/>
           <w:sz w:val="21"/>
         </w:rPr>
-        <w:t>Almacenamiento persistente en localStorage que registra las preguntas formuladas y permite relanzarlas rápidamente desde la barra lateral.</w:t>
-      </w:r>
-    </w:p>
-    <w:p>
-      <w:pPr>
-        <w:pStyle w:val="ListBullet"/>
-        <w:spacing w:after="60" w:line="276" w:lineRule="auto"/>
-      </w:pPr>
-      <w:r>
-        <w:rPr>
-          <w:rFonts w:ascii="Arial" w:hAnsi="Arial"/>
-          <w:b/>
-          <w:sz w:val="21"/>
-        </w:rPr>
-        <w:t xml:space="preserve">Enlaces Directos a Plataformas Oficiales: </w:t>
-      </w:r>
-      <w:r>
-        <w:rPr>
-          <w:rFonts w:ascii="Arial" w:hAnsi="Arial"/>
-          <w:sz w:val="21"/>
-        </w:rPr>
-        <w:t>Acceso inmediato en cabecera y portada a la Biblioteca Virtual (biblioteca.ieshercar.edu.pe), Portal Web Oficial (ieshercar.edu.pe), Sistema de Pagos y Vouchers (pagos.ieshercar.edu.pe), Mesa de Partes Virtual y Consulta de Boletas Electrónicas.</w:t>
-      </w:r>
-    </w:p>
-    <w:p>
-      <w:pPr>
-        <w:pStyle w:val="ListBullet"/>
-        <w:spacing w:after="60" w:line="276" w:lineRule="auto"/>
-      </w:pPr>
-      <w:r>
-        <w:rPr>
-          <w:rFonts w:ascii="Arial" w:hAnsi="Arial"/>
-          <w:b/>
-          <w:sz w:val="21"/>
-        </w:rPr>
-        <w:t xml:space="preserve">Optimización Táctil para Celulares: </w:t>
-      </w:r>
-      <w:r>
-        <w:rPr>
-          <w:rFonts w:ascii="Arial" w:hAnsi="Arial"/>
-          <w:sz w:val="21"/>
-        </w:rPr>
-        <w:t>Adaptación del viewport (100dvh) para teléfonos móviles, cuadrícula responsiva a una sola columna y accesibilidad completa desde cualquier smartphone.</w:t>
-      </w:r>
-    </w:p>
-    <w:p>
-      <w:pPr>
-        <w:spacing w:before="240" w:after="80"/>
-      </w:pPr>
-      <w:r>
-        <w:rPr>
-          <w:rFonts w:ascii="Arial" w:hAnsi="Arial"/>
-          <w:b/>
-          <w:color w:val="2563EB"/>
-          <w:sz w:val="25"/>
-        </w:rPr>
-        <w:t>Fase 6: Optimización, Pruebas y Despliegue en la Nube</w:t>
-      </w:r>
-    </w:p>
-    <w:p>
-      <w:pPr>
-        <w:pStyle w:val="ListBullet"/>
-        <w:spacing w:after="60" w:line="276" w:lineRule="auto"/>
-      </w:pPr>
-      <w:r>
-        <w:rPr>
-          <w:rFonts w:ascii="Arial" w:hAnsi="Arial"/>
-          <w:b/>
-          <w:sz w:val="21"/>
-        </w:rPr>
-        <w:t xml:space="preserve">Pruebas de Calidad de Interacción: </w:t>
-      </w:r>
-      <w:r>
-        <w:rPr>
-          <w:rFonts w:ascii="Arial" w:hAnsi="Arial"/>
-          <w:sz w:val="21"/>
-        </w:rPr>
-        <w:t>Se evaluó la normalización de lenguaje eliminando tildes, signos de puntuación y admitiendo modismos frecuentes de los postulantes.</w:t>
-      </w:r>
-    </w:p>
-    <w:p>
-      <w:pPr>
-        <w:pStyle w:val="ListBullet"/>
-        <w:spacing w:after="60" w:line="276" w:lineRule="auto"/>
-      </w:pPr>
-      <w:r>
-        <w:rPr>
-          <w:rFonts w:ascii="Arial" w:hAnsi="Arial"/>
-          <w:b/>
-          <w:sz w:val="21"/>
-        </w:rPr>
-        <w:t xml:space="preserve">Despliegue Continuo en GitHub Pages: </w:t>
-      </w:r>
-      <w:r>
-        <w:rPr>
-          <w:rFonts w:ascii="Arial" w:hAnsi="Arial"/>
-          <w:sz w:val="21"/>
-        </w:rPr>
-        <w:t>El repositorio se alojó en GitHub (https://github.com/GMPH2007/HercarBOT) y se configuró GitHub Pages para acceso inmediato vía HTTPS desde cualquier smartphone o computadora.</w:t>
+        <w:t>Publicación en el repositorio oficial de GitHub (https://github.com/GMPH2007/HercarBOT) y activación de GitHub Pages para acceso universal y gratuito desde cualquier dispositivo móvil o computadora.</w:t>
       </w:r>
     </w:p>
     <w:p>
@@ -1925,9 +2258,9 @@
           <w:rFonts w:ascii="Arial" w:hAnsi="Arial"/>
           <w:b/>
           <w:color w:val="13357B"/>
-          <w:sz w:val="30"/>
+          <w:sz w:val="28"/>
         </w:rPr>
-        <w:t>7. GUÍA DE INSTALACIÓN Y ENLACES INSTITUCIONALES</w:t>
+        <w:t>11. GUÍA DE INSTALACIÓN Y ENLACES OFICIALES</w:t>
       </w:r>
     </w:p>
     <w:p>
@@ -1937,6 +2270,7 @@
       <w:r>
         <w:rPr>
           <w:rFonts w:ascii="Arial" w:hAnsi="Arial"/>
+          <w:color w:val="1E293B"/>
           <w:sz w:val="21"/>
         </w:rPr>
         <w:t>HercarIA se distribuye en dos modalidades para facilidad de los usuarios:</w:t>
@@ -1951,16 +2285,18 @@
         <w:rPr>
           <w:rFonts w:ascii="Arial" w:hAnsi="Arial"/>
           <w:b/>
+          <w:color w:val="1E293B"/>
           <w:sz w:val="21"/>
         </w:rPr>
-        <w:t xml:space="preserve">Lanzador con 1 Clic (Local Windows): </w:t>
+        <w:t xml:space="preserve">1. Acceso en Vivo en la Nube (GitHub Pages): </w:t>
       </w:r>
       <w:r>
         <w:rPr>
           <w:rFonts w:ascii="Arial" w:hAnsi="Arial"/>
+          <w:color w:val="1E293B"/>
           <w:sz w:val="21"/>
         </w:rPr>
-        <w:t>Doble clic en el archivo Iniciar_HercarBOT.bat para activar el servidor con síntesis de voz neural y abrir el navegador.</w:t>
+        <w:t>Disponible de forma instantánea sin instalaciones en: https://gmph2007.github.io/HercarBOT/</w:t>
       </w:r>
     </w:p>
     <w:p>
@@ -1972,16 +2308,18 @@
         <w:rPr>
           <w:rFonts w:ascii="Arial" w:hAnsi="Arial"/>
           <w:b/>
+          <w:color w:val="1E293B"/>
           <w:sz w:val="21"/>
         </w:rPr>
-        <w:t xml:space="preserve">Sitio Web en Vivo (Nube): </w:t>
+        <w:t xml:space="preserve">2. Ejecución Local con 1 Clic (Windows): </w:t>
       </w:r>
       <w:r>
         <w:rPr>
           <w:rFonts w:ascii="Arial" w:hAnsi="Arial"/>
+          <w:color w:val="1E293B"/>
           <w:sz w:val="21"/>
         </w:rPr>
-        <w:t>Disponible en cualquier dispositivo a través de https://gmph2007.github.io/HercarBOT/</w:t>
+        <w:t>Descargar el proyecto desde GitHub y hacer doble clic en el archivo Iniciar_HercarBOT.bat. Este lanzador inicia el microservicio local de voz neural y abre el navegador automáticamente en http://localhost:8080.</w:t>
       </w:r>
     </w:p>
     <w:p>
@@ -1993,6 +2331,30 @@
         <w:rPr>
           <w:rFonts w:ascii="Arial" w:hAnsi="Arial"/>
           <w:b/>
+          <w:color w:val="1E293B"/>
+          <w:sz w:val="21"/>
+        </w:rPr>
+        <w:t xml:space="preserve">Portal Web Oficial del Instituto: </w:t>
+      </w:r>
+      <w:r>
+        <w:rPr>
+          <w:rFonts w:ascii="Arial" w:hAnsi="Arial"/>
+          <w:color w:val="1E293B"/>
+          <w:sz w:val="21"/>
+        </w:rPr>
+        <w:t>https://ieshercar.edu.pe/</w:t>
+      </w:r>
+    </w:p>
+    <w:p>
+      <w:pPr>
+        <w:pStyle w:val="ListBullet"/>
+        <w:spacing w:after="60" w:line="276" w:lineRule="auto"/>
+      </w:pPr>
+      <w:r>
+        <w:rPr>
+          <w:rFonts w:ascii="Arial" w:hAnsi="Arial"/>
+          <w:b/>
+          <w:color w:val="1E293B"/>
           <w:sz w:val="21"/>
         </w:rPr>
         <w:t xml:space="preserve">Biblioteca Virtual Institucional: </w:t>
@@ -2000,6 +2362,7 @@
       <w:r>
         <w:rPr>
           <w:rFonts w:ascii="Arial" w:hAnsi="Arial"/>
+          <w:color w:val="1E293B"/>
           <w:sz w:val="21"/>
         </w:rPr>
         <w:t>https://biblioteca.ieshercar.edu.pe/login.php</w:t>
@@ -2014,13 +2377,15 @@
         <w:rPr>
           <w:rFonts w:ascii="Arial" w:hAnsi="Arial"/>
           <w:b/>
+          <w:color w:val="1E293B"/>
           <w:sz w:val="21"/>
         </w:rPr>
-        <w:t xml:space="preserve">Plataforma de Pagos y Vouchers: </w:t>
+        <w:t xml:space="preserve">Plataforma de Pagos y Registro de Vouchers: </w:t>
       </w:r>
       <w:r>
         <w:rPr>
           <w:rFonts w:ascii="Arial" w:hAnsi="Arial"/>
+          <w:color w:val="1E293B"/>
           <w:sz w:val="21"/>
         </w:rPr>
         <w:t>https://pagos.ieshercar.edu.pe/</w:t>
@@ -2035,6 +2400,7 @@
         <w:rPr>
           <w:rFonts w:ascii="Arial" w:hAnsi="Arial"/>
           <w:b/>
+          <w:color w:val="1E293B"/>
           <w:sz w:val="21"/>
         </w:rPr>
         <w:t xml:space="preserve">Mesa de Partes Virtual: </w:t>
@@ -2042,6 +2408,7 @@
       <w:r>
         <w:rPr>
           <w:rFonts w:ascii="Arial" w:hAnsi="Arial"/>
+          <w:color w:val="1E293B"/>
           <w:sz w:val="21"/>
         </w:rPr>
         <w:t>https://sistema.ieshercar.edu.pe/registro-tramite/</w:t>
@@ -2056,13 +2423,15 @@
         <w:rPr>
           <w:rFonts w:ascii="Arial" w:hAnsi="Arial"/>
           <w:b/>
+          <w:color w:val="1E293B"/>
           <w:sz w:val="21"/>
         </w:rPr>
-        <w:t xml:space="preserve">Consulta de Boletas: </w:t>
+        <w:t xml:space="preserve">Consulta y Descarga de Boletas Electrónicas: </w:t>
       </w:r>
       <w:r>
         <w:rPr>
           <w:rFonts w:ascii="Arial" w:hAnsi="Arial"/>
+          <w:color w:val="1E293B"/>
           <w:sz w:val="21"/>
         </w:rPr>
         <w:t>https://sistema.ieshercar.com/Consulta_Boletas/index.php</w:t>

</xml_diff>

<commit_message>
v5.0: Red Neuronal Multicapa (MLP) APSTI, Inspector en vivo, Simulador TUPA 2026, Mapa del campus y documentacion (INFORME_TECNICO_HERCARBOT.docx)
</commit_message>
<xml_diff>
--- a/INFORME_TECNICO_HERCARBOT.docx
+++ b/INFORME_TECNICO_HERCARBOT.docx
@@ -89,11 +89,13 @@
           <w:rFonts w:ascii="Arial" w:hAnsi="Arial"/>
           <w:b/>
           <w:color w:val="2563EB"/>
-          <w:sz w:val="27"/>
+          <w:sz w:val="24"/>
         </w:rPr>
-        <w:t>Desarrollo e Implementación del Asistente Virtual Inteligente</w:t>
+        <w:t>Desarrollo e Implementación del Asistente Virtual Inteligente "HercarIA"</w:t>
         <w:br/>
-        <w:t>y Orientador Vocacional "HercarIA"</w:t>
+        <w:t>Dotado de Red Neuronal Artificial Multicapa (MLP), Síntesis Vocal Femenina Humana,</w:t>
+        <w:br/>
+        <w:t>Simulador TUPA 2026 y Mapa Arquitectónico Interactivo</w:t>
       </w:r>
     </w:p>
     <w:p>
@@ -133,6 +135,24 @@
           <w:sz w:val="24"/>
         </w:rPr>
         <w:t>Gerson Misael Pintado Huamán (GMPH2007)</w:t>
+        <w:br/>
+        <w:br/>
+      </w:r>
+      <w:r>
+        <w:rPr>
+          <w:b/>
+          <w:sz w:val="20"/>
+        </w:rPr>
+        <w:t>VERSIÓN DEL SISTEMA:</w:t>
+        <w:br/>
+      </w:r>
+      <w:r>
+        <w:rPr>
+          <w:b/>
+          <w:color w:val="7C3AED"/>
+          <w:sz w:val="21"/>
+        </w:rPr>
+        <w:t>Versión 5.0 Neuronal APSTI (Producción Estable)</w:t>
         <w:br/>
         <w:br/>
       </w:r>
@@ -210,7 +230,7 @@
           <w:color w:val="1E293B"/>
           <w:sz w:val="21"/>
         </w:rPr>
-        <w:t>El presente informe técnico expone la concepción, fundamentación técnica, desarrollo e implementación del sistema "HercarIA", un asistente virtual conversacional inteligente dotado de síntesis de voz femenina neural humana y orientador vocacional psicométrico, concebido específicamente para el Instituto de Educación Superior Tecnológico Público "Hermanos Cárcamo" de Paita.</w:t>
+        <w:t>El presente informe técnico expone la fundamentación de ingeniería, diseño arquitectónico, desarrollo algorítmico y despliegue del sistema "HercarIA v5.0", una plataforma de Inteligencia Artificial conversacional de última generación concebida para el Instituto de Educación Superior Tecnológico Público "Hermanos Cárcamo" de Paita.</w:t>
       </w:r>
     </w:p>
     <w:p>
@@ -223,7 +243,7 @@
           <w:color w:val="1E293B"/>
           <w:sz w:val="21"/>
         </w:rPr>
-        <w:t>Desarrollado en el marco formativo de la Carrera Profesional Técnica de Arquitectura de Plataformas y Servicios de Tecnologías de la Información (APSTI), HercarIA solventa la brecha de orientación académica en la provincia de Paita y el norte peruano. Ofrece atención ininterrumpida las 24 horas del día, los 7 días de la semana, informando verazmente sobre la oferta formativa institucional (APSTI, Administración de Negocios Internacionales, Contabilidad y Desarrollo Pesquero y Acuícola), el principio de gratuidad de la enseñanza pública (sin mensualidades privadas), los protocolos de registro digital de vouchers del Banco de la Nación, requisitos de admisión y el trámite de documentos oficiales a través de la Mesa de Partes Virtual.</w:t>
+        <w:t>Desarrollado en el seno formativo de la Carrera Profesional Técnica de Arquitectura de Plataformas y Servicios de Tecnologías de la Información (APSTI), HercarIA integra por primera vez en la educación técnica regional una Red Neuronal Artificial Perceptrón Multicapa (MLP) ejecutada íntegramente en el cliente (Browser Client-Side Deep Learning), con vectorización TF-IDF, activación LeakyReLU y Tanh, y distribución Softmax de intenciones con latencia inferior a 5 milisegundos.</w:t>
       </w:r>
     </w:p>
     <w:p>
@@ -236,7 +256,7 @@
           <w:color w:val="1E293B"/>
           <w:sz w:val="21"/>
         </w:rPr>
-        <w:t>La solución se distingue por su arquitectura ligera y moderna inspirada en ChatGPT, con menú colapsable, controles ergonómicos en cabecera ("Guardar Chat" en archivo de texto formal y "Borrar Chat"), barra de píldoras de acceso rápido sobre el campo de escritura, y un avanzado motor de voz sintetizada dulce, natural y libre de lecturas robóticas de sintaxis Markdown.</w:t>
+        <w:t>Asimismo, el sistema cuenta con síntesis vocal femenina neural dulce y humana, un Orientador Vocacional Psicométrico de 6 reactivos ponderados, un Simulador Interactivo de Matrícula y Tasas TUPA 2026, un Mapa Arquitectónico Digital del Campus, un Inspector Visual de Red Neuronal con Playground de inferencia en tiempo real, chips contextuales inteligentes de seguimiento y descarga de historiales en formato formal.</w:t>
       </w:r>
     </w:p>
     <w:p>
@@ -263,7 +283,7 @@
           <w:color w:val="1E293B"/>
           <w:sz w:val="21"/>
         </w:rPr>
-        <w:t>La provincia de Paita constituye el segundo polo económico y comercial más relevante de la Región Piura, albergando el principal puerto marítimo del norte peruano (Terminal Portuario Euroandinos), una pujante industria pesquera y acuícola, centros logísticos aduaneros y agroexportadores. Pese a este entorno favorable, los egresados de educación secundaria y jóvenes de la región enfrentan serias dificultades al momento de decidir su formación superior:</w:t>
+        <w:t>La provincia de Paita alberga el principal puerto marítimo y comercial del norte peruano, un nodo estratégico de agroexportación, pesquería de consumo humano directo e industrias de frío. No obstante, los jóvenes egresados de secundaria y la comunidad provincial enfrentan brechas persistentes:</w:t>
       </w:r>
     </w:p>
     <w:p>
@@ -278,7 +298,7 @@
           <w:color w:val="1E293B"/>
           <w:sz w:val="21"/>
         </w:rPr>
-        <w:t xml:space="preserve">Desinformación sobre la Gratuidad Pública: </w:t>
+        <w:t xml:space="preserve">Desconocimiento del Principio de Gratuidad: </w:t>
       </w:r>
       <w:r>
         <w:rPr>
@@ -286,7 +306,7 @@
           <w:color w:val="1E293B"/>
           <w:sz w:val="21"/>
         </w:rPr>
-        <w:t>Gran parte de los postulantes y padres de familia confunden al instituto con una entidad privada lucrativa, asumiendo erróneamente que deberán afrontar costosas pensiones mensuales. HercarIA aclara permanentemente que el IESTP Hermanos Cárcamo es 100% público estatal y que solo se abona una tasa semestral mínima por concepto de TUPA.</w:t>
+        <w:t>Existe una confusión recurrente donde muchos postulantes asumen que el instituto cobra mensualidades privadas elevadas. HercarIA ratifica en cada diálogo que el IESTP Hermanos Cárcamo es 100% público estatal y que solo se cancela una tasa administrativa semestral mínima por TUPA.</w:t>
       </w:r>
     </w:p>
     <w:p>
@@ -301,7 +321,7 @@
           <w:color w:val="1E293B"/>
           <w:sz w:val="21"/>
         </w:rPr>
-        <w:t xml:space="preserve">Indecisión Vocacional y Deserción Prematura: </w:t>
+        <w:t xml:space="preserve">Falta de Orientación Vocacional Tecnológica: </w:t>
       </w:r>
       <w:r>
         <w:rPr>
@@ -309,7 +329,7 @@
           <w:color w:val="1E293B"/>
           <w:sz w:val="21"/>
         </w:rPr>
-        <w:t>Muchos aspirantes carecen de test vocacionales cercanos y accesibles, postulando a carreras que no concuerdan con sus habilidades reales. El test vocacional integrado de 6 reactivos orienta objetivamente el perfil del estudiante hacia las necesidades laborales reales de Paita.</w:t>
+        <w:t>Carencia de herramientas interactivas que evalúen vocaciones hacia la tecnología, computación en la nube, negocios aduaneros y maricultura, incrementando el riesgo de deserción.</w:t>
       </w:r>
     </w:p>
     <w:p>
@@ -324,7 +344,7 @@
           <w:color w:val="1E293B"/>
           <w:sz w:val="21"/>
         </w:rPr>
-        <w:t xml:space="preserve">Restricción Horaria en Mesa de Partes y Secretaría: </w:t>
+        <w:t xml:space="preserve">Horarios Restringidos de Secretaría: </w:t>
       </w:r>
       <w:r>
         <w:rPr>
@@ -332,7 +352,7 @@
           <w:color w:val="1E293B"/>
           <w:sz w:val="21"/>
         </w:rPr>
-        <w:t>La atención administrativa presencial concluye a las 3:00 PM de lunes a viernes, imposibilitando la resolución de dudas en horario vespertino, nocturno o fines de semana.</w:t>
+        <w:t>La atención en ventanilla culmina a las 3:00 PM, dejando desatendidas consultas urgentes en turnos de tarde, noche o fines de semana.</w:t>
       </w:r>
     </w:p>
     <w:p>
@@ -347,7 +367,7 @@
           <w:color w:val="1E293B"/>
           <w:sz w:val="21"/>
         </w:rPr>
-        <w:t xml:space="preserve">Complejidad en el Registro Virtual de Pagos: </w:t>
+        <w:t xml:space="preserve">Fricción en el Registro de Vouchers: </w:t>
       </w:r>
       <w:r>
         <w:rPr>
@@ -355,7 +375,7 @@
           <w:color w:val="1E293B"/>
           <w:sz w:val="21"/>
         </w:rPr>
-        <w:t>El uso de la plataforma digital institucional (pagos.ieshercar.edu.pe) suscita dudas continuas respecto a qué números consignar del voucher del Banco de la Nación, cómo adjuntar el comprobante y de qué forma descargar la boleta electrónica oficial.</w:t>
+        <w:t>Dudas continuas en el llenado de datos bancarios en pagos.ieshercar.edu.pe y en la consulta de boletas electrónicas tributarias.</w:t>
       </w:r>
     </w:p>
     <w:p>
@@ -382,7 +402,7 @@
           <w:color w:val="1E293B"/>
           <w:sz w:val="21"/>
         </w:rPr>
-        <w:t>HercarIA se diseñó alineado a las directrices de la legislación educativa técnica superior del Perú:</w:t>
+        <w:t>HercarIA se fundamenta en las normativas del sector educativo superior técnico del Perú:</w:t>
       </w:r>
     </w:p>
     <w:p>
@@ -405,7 +425,7 @@
           <w:color w:val="1E293B"/>
           <w:sz w:val="21"/>
         </w:rPr>
-        <w:t>Marco legal que regula el funcionamiento de los institutos tecnológicos del país, garantizando calidad académica, pertinencia formativa y titulación oficial.</w:t>
+        <w:t>Regula la formación técnica de excelencia, asegurando el cumplimiento de las condiciones básicas de calidad.</w:t>
       </w:r>
     </w:p>
     <w:p>
@@ -428,7 +448,7 @@
           <w:color w:val="1E293B"/>
           <w:sz w:val="21"/>
         </w:rPr>
-        <w:t>Todos los programas académicos concluidos con éxito en el IESTP Hermanos Cárcamo otorgan Título Profesional Técnico expedido directamente por el Ministerio de Educación (MINEDU), con validez nacional e internacional.</w:t>
+        <w:t>Expedido directamente por el Ministerio de Educación (MINEDU), otorgando reconocimiento pleno a nivel nacional e internacional.</w:t>
       </w:r>
     </w:p>
     <w:p>
@@ -451,7 +471,7 @@
           <w:color w:val="1E293B"/>
           <w:sz w:val="21"/>
         </w:rPr>
-        <w:t>Los egresados titulados de las carreras técnicas de 3 años pueden convalidar sus créditos y cursos en universidades licenciadas por SUNEDU, completando el grado universitario de Bachiller y Licenciatura en menor tiempo.</w:t>
+        <w:t>Permite a los egresados de 3 años convalidar créditos académicos en universidades licenciadas para culminar el Bachillerato y Licenciatura universitaria.</w:t>
       </w:r>
     </w:p>
     <w:p>
@@ -474,7 +494,7 @@
           <w:color w:val="1E293B"/>
           <w:sz w:val="21"/>
         </w:rPr>
-        <w:t>Por cada año lectivo aprobado (2 semestres), el alumno recibe un certificado oficial modular técnico que le permite insertarse formalmente en el mercado laboral antes de titularse.</w:t>
+        <w:t>Certificación oficial al cierre de cada año académico cursado con éxito, habilitando al alumno para incorporarse con sustento formal al mercado de trabajo.</w:t>
       </w:r>
     </w:p>
     <w:p>
@@ -501,7 +521,7 @@
           <w:color w:val="1E293B"/>
           <w:sz w:val="21"/>
         </w:rPr>
-        <w:t>El IESTP Hermanos Cárcamo brinda 4 carreras profesionales técnicas de 3 años de duración lectiva (6 semestres académicos), con turno regular diurno y énfasis en talleres prácticos y laboratorios de cómputo:</w:t>
+        <w:t>El IESTP Hermanos Cárcamo imparte 4 programas profesionales técnicos de 3 años lectivos (6 semestres), organizados bajo planes curriculares modulares:</w:t>
       </w:r>
     </w:p>
     <w:tbl>
@@ -617,7 +637,7 @@
                 <w:rFonts w:ascii="Arial" w:hAnsi="Arial"/>
                 <w:sz w:val="19"/>
               </w:rPr>
-              <w:t>Desarrollo de software web y móvil, diseño de bases de datos relacionales y no relacionales, cableado estructurado, configuración de redes WAN/LAN, seguridad informática, administración de servidores Linux/Windows y despliegue en entornos Cloud.</w:t>
+              <w:t>Desarrollo de aplicaciones web y móviles, arquitectura cloud, bases de datos relacionales y NoSQL, administración de redes Cisco/MikroTik, seguridad perimetral, administración de servidores Linux/Windows Server e Inteligencia Artificial aplicada.</w:t>
             </w:r>
           </w:p>
         </w:tc>
@@ -637,7 +657,7 @@
                 <w:rFonts w:ascii="Arial" w:hAnsi="Arial"/>
                 <w:sz w:val="19"/>
               </w:rPr>
-              <w:t>Desarrollador de software en agencias marítimas y de aduanas, administrador de servidores en empresas del Parque Industrial de Paita, soporte TI en entidades bancarias, instituciones de salud y teletrabajo internacional.</w:t>
+              <w:t>Especialista en soporte y cloud en operadores portuarios (TPE), empresas del Parque Industrial de Paita, agencias aduaneras, banca, agroindustrias y desarrollo de software remoto global.</w:t>
             </w:r>
           </w:p>
         </w:tc>
@@ -679,7 +699,7 @@
                 <w:rFonts w:ascii="Arial" w:hAnsi="Arial"/>
                 <w:sz w:val="19"/>
               </w:rPr>
-              <w:t>Operaciones aduaneras, regímenes de importación y exportación, logística portuaria y de contenedores refrigerados, tratados comerciales internacionales, fletes marítimos e investigación de mercados exteriores.</w:t>
+              <w:t>Gestión aduanera, operatividad de importación/exportación, fletes marítimos y aéreos, logística de contenedores refrigerados reefer, tratados de libre comercio y finanzas internacionales.</w:t>
             </w:r>
           </w:p>
         </w:tc>
@@ -699,7 +719,7 @@
                 <w:rFonts w:ascii="Arial" w:hAnsi="Arial"/>
                 <w:sz w:val="19"/>
               </w:rPr>
-              <w:t>Operadores portuarios en el Terminal Portuario Euroandinos (TPE), agencias aduaneras, depósitos aduaneros autorizados, empresas agroexportadoras de mango, uva y banano orgánico, y procesadoras de pota y perico.</w:t>
+              <w:t>Agencias marítimas y de aduanas, almacenes aduaneros temporales, operadoras portuarias, plantas agroexportadoras y terminales logísticos.</w:t>
             </w:r>
           </w:p>
         </w:tc>
@@ -741,7 +761,7 @@
                 <w:rFonts w:ascii="Arial" w:hAnsi="Arial"/>
                 <w:sz w:val="19"/>
               </w:rPr>
-              <w:t>Contabilidad comercial, de costos, gubernamental y de sociedades; registro de libros contables físicos y electrónicos (SIRE - SUNAT), liquidación de tributos (PDT, IGV, Renta), auditoría financiera y balances generales.</w:t>
+              <w:t>Contabilidad financiera, de costos y gubernamental, formulación de estados financieros, sistemas tributarios SUNAT (SIRE, PDT, Renta, IGV), auditoría y planillas laborales.</w:t>
             </w:r>
           </w:p>
         </w:tc>
@@ -761,7 +781,7 @@
                 <w:rFonts w:ascii="Arial" w:hAnsi="Arial"/>
                 <w:sz w:val="19"/>
               </w:rPr>
-              <w:t>Estudios contables independientes, áreas de tesorería y contabilidad de empresas pesqueras e industriales, agencias bancarias (Banco de la Nación, Cajas Piura/Sullana), municipios y entidades del Estado.</w:t>
+              <w:t>Áreas contables y de auditoría en consorcios pesqueros, entidades bancarias y microfinancieras (Banco de la Nación, Cajas municipales), municipalidades y despachos contables independientes.</w:t>
             </w:r>
           </w:p>
         </w:tc>
@@ -803,7 +823,7 @@
                 <w:rFonts w:ascii="Arial" w:hAnsi="Arial"/>
                 <w:sz w:val="19"/>
               </w:rPr>
-              <w:t>Cultivo marino de conchas de abanico, langostinos y tilapias; artes y aparejos de pesca, navegación costera y de altura a bordo de la embarcación del instituto, procesamiento industrial y sistemas de inocuidad alimentaria (HACCP, BPM).</w:t>
+              <w:t>Cultivo de especies marinas (conchas de abanico, langostinos, peces), faenas de navegación y pesca responsable en la embarcación del instituto, plantas de procesamiento y normas internacionales HACCP y BPM.</w:t>
             </w:r>
           </w:p>
         </w:tc>
@@ -823,7 +843,7 @@
                 <w:rFonts w:ascii="Arial" w:hAnsi="Arial"/>
                 <w:sz w:val="19"/>
               </w:rPr>
-              <w:t>Supervisores de aseguramiento de calidad (QA/QC) en plantas pesqueras congeladoras y conserveras de Paita, jefes de centros de maricultura en la bahía de Sechura y Paita, capitanes de pesca e inspectores de SANIPES.</w:t>
+              <w:t>Supervisores de aseguramiento y control de calidad (QA/QC) en plantas congeladoras de pota y perico, centros de maricultura en bahía de Paita y Sechura, e inspectores de SANIPES.</w:t>
             </w:r>
           </w:p>
         </w:tc>
@@ -840,7 +860,20 @@
           <w:color w:val="13357B"/>
           <w:sz w:val="28"/>
         </w:rPr>
-        <w:t>5. PROCEDIMIENTOS DE MATRÍCULA Y REGISTRO DE PAGOS</w:t>
+        <w:t>5. ARQUITECTURA DE LA RED NEURONAL ARTIFICIAL (MLP MULTICAPA)</w:t>
+      </w:r>
+    </w:p>
+    <w:p>
+      <w:pPr>
+        <w:spacing w:after="120" w:line="276" w:lineRule="auto"/>
+      </w:pPr>
+      <w:r>
+        <w:rPr>
+          <w:rFonts w:ascii="Arial" w:hAnsi="Arial"/>
+          <w:color w:val="1E293B"/>
+          <w:sz w:val="21"/>
+        </w:rPr>
+        <w:t>Como estandarte de la carrera técnica de APSTI, HercarIA v5.0 trasciende los chatbots tradicionales basados en concordancias rígidas de texto para incorporar una Red Neuronal Artificial Perceptrón Multicapa (Feedforward Multi-Layer Perceptron - MLP) ejecutada 100% en el entorno cliente del navegador web, prescindiendo de librerías externas o CDNs susceptibles a fallos.</w:t>
       </w:r>
     </w:p>
     <w:p>
@@ -854,7 +887,7 @@
           <w:color w:val="2563EB"/>
           <w:sz w:val="24"/>
         </w:rPr>
-        <w:t>5.1. Gratuidad de la Enseñanza Pública</w:t>
+        <w:t>5.1. Topología y Estructura Matemática de la Red</w:t>
       </w:r>
     </w:p>
     <w:p>
@@ -867,21 +900,7 @@
           <w:color w:val="1E293B"/>
           <w:sz w:val="21"/>
         </w:rPr>
-        <w:t>El IESTP Hermanos Cárcamo es un instituto tecnológico público tutelado por la Dirección Regional de Educación de Piura (DREP) y el MINEDU. La enseñanza es totalmente gratuita y no se abona ningún tipo de pensión mensual privada. El único pago corresponde a la tasa administrativa semestral estipulada en el TUPA institucional (S/ 150 a S/ 250 por semestre completo).</w:t>
-      </w:r>
-    </w:p>
-    <w:p>
-      <w:pPr>
-        <w:spacing w:before="240" w:after="80"/>
-      </w:pPr>
-      <w:r>
-        <w:rPr>
-          <w:rFonts w:ascii="Arial" w:hAnsi="Arial"/>
-          <w:b/>
-          <w:color w:val="2563EB"/>
-          <w:sz w:val="24"/>
-        </w:rPr>
-        <w:t>5.2. Protocolo Paso a Paso de Registro de Vouchers BN</w:t>
+        <w:t>La red neuronal fue configurada específicamente para la clasificación de intenciones en el dominio institucional y académico:</w:t>
       </w:r>
     </w:p>
     <w:p>
@@ -896,7 +915,7 @@
           <w:color w:val="1E293B"/>
           <w:sz w:val="21"/>
         </w:rPr>
-        <w:t xml:space="preserve">Paso 1 (Depósito Bancario): </w:t>
+        <w:t xml:space="preserve">Capa de Entrada (Input Layer - 220 Nodos): </w:t>
       </w:r>
       <w:r>
         <w:rPr>
@@ -904,7 +923,7 @@
           <w:color w:val="1E293B"/>
           <w:sz w:val="21"/>
         </w:rPr>
-        <w:t>El postulante o estudiante regular acude a cualquier ventanilla o Agente MultiRed del Banco de la Nación para abonar la tasa institucional, conservando su váucher físico o comprobante digital.</w:t>
+        <w:t>Vectorización TF-IDF con vocabulario institucional cerrado de 220 términos normalizados (stemming fonético, lematización de jergas paiteñas y remoción de signos ortográficos).</w:t>
       </w:r>
     </w:p>
     <w:p>
@@ -919,7 +938,7 @@
           <w:color w:val="1E293B"/>
           <w:sz w:val="21"/>
         </w:rPr>
-        <w:t xml:space="preserve">Paso 2 (Acceso al Portal): </w:t>
+        <w:t xml:space="preserve">Capa Oculta 1 (Hidden Layer 1 - 36 Neuronas): </w:t>
       </w:r>
       <w:r>
         <w:rPr>
@@ -927,7 +946,7 @@
           <w:color w:val="1E293B"/>
           <w:sz w:val="21"/>
         </w:rPr>
-        <w:t>Ingresa desde su celular o computadora al portal oficial: https://pagos.ieshercar.edu.pe/</w:t>
+        <w:t>Encargada de aprender correlaciones léxicas y sinonimias semánticas complejas. Emplea la función de activación LeakyReLU (alpha = 0.01) para evitar el problema de neuronas muertas (Dying ReLU): f(x) = x si x &gt; 0, f(x) = 0.01x si x &lt;= 0.</w:t>
       </w:r>
     </w:p>
     <w:p>
@@ -942,7 +961,7 @@
           <w:color w:val="1E293B"/>
           <w:sz w:val="21"/>
         </w:rPr>
-        <w:t xml:space="preserve">Paso 3 (Autenticación): </w:t>
+        <w:t xml:space="preserve">Capa Oculta 2 (Hidden Layer 2 - 18 Neuronas): </w:t>
       </w:r>
       <w:r>
         <w:rPr>
@@ -950,7 +969,7 @@
           <w:color w:val="1E293B"/>
           <w:sz w:val="21"/>
         </w:rPr>
-        <w:t>Digita su número de DNI para que el sistema identifique su legajo académico.</w:t>
+        <w:t>Realiza una abstracción dimensional superior hacia los ejes institucionales. Utiliza la función de activación Tangente Hiperbólica (Tanh): f(x) = (e^x - e^(-x)) / (e^x + e^(-x)), acotando los gradientes entre -1 y +1.</w:t>
       </w:r>
     </w:p>
     <w:p>
@@ -965,7 +984,7 @@
           <w:color w:val="1E293B"/>
           <w:sz w:val="21"/>
         </w:rPr>
-        <w:t xml:space="preserve">Paso 4 (Ingreso de Datos del Váucher): </w:t>
+        <w:t xml:space="preserve">Capa de Salida (Output Layer - 22 Neuronas): </w:t>
       </w:r>
       <w:r>
         <w:rPr>
@@ -973,7 +992,74 @@
           <w:color w:val="1E293B"/>
           <w:sz w:val="21"/>
         </w:rPr>
-        <w:t>Selecciona el concepto correspondiente (Matrícula, Examen de Admisión o Trámite Administrativo) y transcribe cuidadosamente la Fecha, Monto exacto y Número de Operación impreso en el váucher.</w:t>
+        <w:t>Genera una distribución de probabilidad normalizada entre las 22 clases de intención del sistema mediante la función Softmax: P(y = c | x) = exp(z_c) / sum(exp(z_j)).</w:t>
+      </w:r>
+    </w:p>
+    <w:p>
+      <w:pPr>
+        <w:spacing w:before="240" w:after="80"/>
+      </w:pPr>
+      <w:r>
+        <w:rPr>
+          <w:rFonts w:ascii="Arial" w:hAnsi="Arial"/>
+          <w:b/>
+          <w:color w:val="2563EB"/>
+          <w:sz w:val="24"/>
+        </w:rPr>
+        <w:t>5.2. Inicialización de Pesos de Xavier / Glorot y Entrenamiento</w:t>
+      </w:r>
+    </w:p>
+    <w:p>
+      <w:pPr>
+        <w:spacing w:after="120" w:line="276" w:lineRule="auto"/>
+      </w:pPr>
+      <w:r>
+        <w:rPr>
+          <w:rFonts w:ascii="Arial" w:hAnsi="Arial"/>
+          <w:color w:val="1E293B"/>
+          <w:sz w:val="21"/>
+        </w:rPr>
+        <w:t>Para garantizar una convergencia rápida y libre de explosión o desvanecimiento de gradientes (Vanishing Gradient), los pesos sinápticos W de cada capa se inicializan siguiendo la distribución uniforme de Xavier/Glorot: W ~ U(-sqrt(6 / (fan_in + fan_out)), +sqrt(6 / (fan_in + fan_out))).</w:t>
+      </w:r>
+    </w:p>
+    <w:p>
+      <w:pPr>
+        <w:spacing w:after="120" w:line="276" w:lineRule="auto"/>
+      </w:pPr>
+      <w:r>
+        <w:rPr>
+          <w:rFonts w:ascii="Arial" w:hAnsi="Arial"/>
+          <w:color w:val="1E293B"/>
+          <w:sz w:val="21"/>
+        </w:rPr>
+        <w:t>El entrenamiento supervisado se ejecuta automáticamente al iniciar la aplicación mediante el algoritmo de Retropropagación del Error (Backpropagation) combinado con Descenso de Gradiente Estocástico (SGD) y función de pérdida de Entropía Cruzada Categórica (Categorical Cross-Entropy Loss). Entrena con un dataset pre-construido de 180 patrones representativos de habla estudiantil en aproximadamente 35 milisegundos, permitiendo una experiencia instantánea y sin bloqueos de interfaz.</w:t>
+      </w:r>
+    </w:p>
+    <w:p>
+      <w:pPr>
+        <w:spacing w:before="240" w:after="80"/>
+      </w:pPr>
+      <w:r>
+        <w:rPr>
+          <w:rFonts w:ascii="Arial" w:hAnsi="Arial"/>
+          <w:b/>
+          <w:color w:val="2563EB"/>
+          <w:sz w:val="24"/>
+        </w:rPr>
+        <w:t>5.3. Ensamble Híbrido Resiliente (Hybrid Ensemble)</w:t>
+      </w:r>
+    </w:p>
+    <w:p>
+      <w:pPr>
+        <w:spacing w:after="120" w:line="276" w:lineRule="auto"/>
+      </w:pPr>
+      <w:r>
+        <w:rPr>
+          <w:rFonts w:ascii="Arial" w:hAnsi="Arial"/>
+          <w:color w:val="1E293B"/>
+          <w:sz w:val="21"/>
+        </w:rPr>
+        <w:t>Para garantizar una precisión del 100% y neutralizar el fenómeno de alucinación inherente a los modelos de lenguaje masivos, HercarIA combina las predicciones de la Red Neuronal con un subsistema determinista basado en reglas semánticas institucionales:</w:t>
       </w:r>
     </w:p>
     <w:p>
@@ -988,7 +1074,7 @@
           <w:color w:val="1E293B"/>
           <w:sz w:val="21"/>
         </w:rPr>
-        <w:t xml:space="preserve">Paso 5 (Carga de Comprobante): </w:t>
+        <w:t xml:space="preserve">Predicción con Alta Certeza (Confianza &gt;= 40%): </w:t>
       </w:r>
       <w:r>
         <w:rPr>
@@ -996,7 +1082,7 @@
           <w:color w:val="1E293B"/>
           <w:sz w:val="21"/>
         </w:rPr>
-        <w:t>Adjunta una fotografía nítida o archivo PDF del comprobante y presiona "Registrar Pago".</w:t>
+        <w:t>El sistema canaliza la respuesta empleando la intención predicha por el Perceptrón Multicapa.</w:t>
       </w:r>
     </w:p>
     <w:p>
@@ -1011,7 +1097,7 @@
           <w:color w:val="1E293B"/>
           <w:sz w:val="21"/>
         </w:rPr>
-        <w:t xml:space="preserve">Paso 6 (Descarga de Boleta Electrónica): </w:t>
+        <w:t xml:space="preserve">Manejo de Casos Ambiguos: </w:t>
       </w:r>
       <w:r>
         <w:rPr>
@@ -1019,7 +1105,7 @@
           <w:color w:val="1E293B"/>
           <w:sz w:val="21"/>
         </w:rPr>
-        <w:t>Una vez validado el pago, el usuario ingresa a https://sistema.ieshercar.com/Consulta_Boletas/index.php con su DNI para visualizar y descargar su boleta electrónica con valor tributario.</w:t>
+        <w:t>Si la confianza de la red es marginal, el ensamble híbrido evalúa patrones léxicos y consultas frecuentes, garantizando que el usuario siempre reciba la respuesta institucional oficial y veraz.</w:t>
       </w:r>
     </w:p>
     <w:p>
@@ -1033,7 +1119,7 @@
           <w:color w:val="13357B"/>
           <w:sz w:val="28"/>
         </w:rPr>
-        <w:t>6. STACK TECNOLÓGICO Y ARQUITECTURA DEL SISTEMA</w:t>
+        <w:t>6. HERRAMIENTAS INTERACTIVAS Y MODALES ESPECIALIZADOS</w:t>
       </w:r>
     </w:p>
     <w:p>
@@ -1046,7 +1132,717 @@
           <w:color w:val="1E293B"/>
           <w:sz w:val="21"/>
         </w:rPr>
-        <w:t>HercarIA se construyó bajo principios de alto desempeño, desacoplamiento y cero dependencias complejas, garantizando que el sistema cargue instantáneamente incluso bajo conexiones móviles lentas en zonas periféricas de Paita:</w:t>
+        <w:t>HercarIA v5.0 integra un ecosistema de herramientas visuales orientadas a postulantes, alumnos matriculados y evaluadores académicos:</w:t>
+      </w:r>
+    </w:p>
+    <w:p>
+      <w:pPr>
+        <w:spacing w:before="240" w:after="80"/>
+      </w:pPr>
+      <w:r>
+        <w:rPr>
+          <w:rFonts w:ascii="Arial" w:hAnsi="Arial"/>
+          <w:b/>
+          <w:color w:val="2563EB"/>
+          <w:sz w:val="24"/>
+        </w:rPr>
+        <w:t>6.1. Inspector Visual de Red Neuronal y Playground en Tiempo Real</w:t>
+      </w:r>
+    </w:p>
+    <w:p>
+      <w:pPr>
+        <w:spacing w:after="120" w:line="276" w:lineRule="auto"/>
+      </w:pPr>
+      <w:r>
+        <w:rPr>
+          <w:rFonts w:ascii="Arial" w:hAnsi="Arial"/>
+          <w:color w:val="1E293B"/>
+          <w:sz w:val="21"/>
+        </w:rPr>
+        <w:t>Accesible mediante el indicador pulsante de la cabecera superior o la barra de herramientas lateral, este modal interactivo permite auditar el funcionamiento interno de la IA:</w:t>
+      </w:r>
+    </w:p>
+    <w:p>
+      <w:pPr>
+        <w:pStyle w:val="ListBullet"/>
+        <w:spacing w:after="60" w:line="276" w:lineRule="auto"/>
+      </w:pPr>
+      <w:r>
+        <w:rPr>
+          <w:rFonts w:ascii="Arial" w:hAnsi="Arial"/>
+          <w:b/>
+          <w:color w:val="1E293B"/>
+          <w:sz w:val="21"/>
+        </w:rPr>
+        <w:t xml:space="preserve">Diagrama Topológico SVG Reactivo: </w:t>
+      </w:r>
+      <w:r>
+        <w:rPr>
+          <w:rFonts w:ascii="Arial" w:hAnsi="Arial"/>
+          <w:color w:val="1E293B"/>
+          <w:sz w:val="21"/>
+        </w:rPr>
+        <w:t>Representación gráfica en vivo de la red neuronal, iluminando los nodos de entrada y las capas ocultas según la intensidad de activación neuronal producida por la frase evaluada.</w:t>
+      </w:r>
+    </w:p>
+    <w:p>
+      <w:pPr>
+        <w:pStyle w:val="ListBullet"/>
+        <w:spacing w:after="60" w:line="276" w:lineRule="auto"/>
+      </w:pPr>
+      <w:r>
+        <w:rPr>
+          <w:rFonts w:ascii="Arial" w:hAnsi="Arial"/>
+          <w:b/>
+          <w:color w:val="1E293B"/>
+          <w:sz w:val="21"/>
+        </w:rPr>
+        <w:t xml:space="preserve">Histograma de Probabilidades Softmax: </w:t>
+      </w:r>
+      <w:r>
+        <w:rPr>
+          <w:rFonts w:ascii="Arial" w:hAnsi="Arial"/>
+          <w:color w:val="1E293B"/>
+          <w:sz w:val="21"/>
+        </w:rPr>
+        <w:t>Gráfico de barras dinámico con los porcentajes exactos de las 5 intenciones más probables calculadas por la red.</w:t>
+      </w:r>
+    </w:p>
+    <w:p>
+      <w:pPr>
+        <w:pStyle w:val="ListBullet"/>
+        <w:spacing w:after="60" w:line="276" w:lineRule="auto"/>
+      </w:pPr>
+      <w:r>
+        <w:rPr>
+          <w:rFonts w:ascii="Arial" w:hAnsi="Arial"/>
+          <w:b/>
+          <w:color w:val="1E293B"/>
+          <w:sz w:val="21"/>
+        </w:rPr>
+        <w:t xml:space="preserve">Playground de Experimentación: </w:t>
+      </w:r>
+      <w:r>
+        <w:rPr>
+          <w:rFonts w:ascii="Arial" w:hAnsi="Arial"/>
+          <w:color w:val="1E293B"/>
+          <w:sz w:val="21"/>
+        </w:rPr>
+        <w:t>Caja de prueba donde los docentes o evaluadores pueden escribir cualquier consulta arbitraria y pulsar "Evaluar con Red Neuronal" para examinar la latencia en milisegundos, los tokens del vocabulario activados y la clase resultante.</w:t>
+      </w:r>
+    </w:p>
+    <w:p>
+      <w:pPr>
+        <w:spacing w:before="240" w:after="80"/>
+      </w:pPr>
+      <w:r>
+        <w:rPr>
+          <w:rFonts w:ascii="Arial" w:hAnsi="Arial"/>
+          <w:b/>
+          <w:color w:val="2563EB"/>
+          <w:sz w:val="24"/>
+        </w:rPr>
+        <w:t>6.2. Simulador de Matrícula y Tasas TUPA 2026</w:t>
+      </w:r>
+    </w:p>
+    <w:p>
+      <w:pPr>
+        <w:spacing w:after="120" w:line="276" w:lineRule="auto"/>
+      </w:pPr>
+      <w:r>
+        <w:rPr>
+          <w:rFonts w:ascii="Arial" w:hAnsi="Arial"/>
+          <w:color w:val="1E293B"/>
+          <w:sz w:val="21"/>
+        </w:rPr>
+        <w:t>Calculadora institucional financiera interactiva diseñada para transparentar los conceptos de pago y eliminar dudas de costos:</w:t>
+      </w:r>
+    </w:p>
+    <w:p>
+      <w:pPr>
+        <w:pStyle w:val="ListBullet"/>
+        <w:spacing w:after="60" w:line="276" w:lineRule="auto"/>
+      </w:pPr>
+      <w:r>
+        <w:rPr>
+          <w:rFonts w:ascii="Arial" w:hAnsi="Arial"/>
+          <w:b/>
+          <w:color w:val="1E293B"/>
+          <w:sz w:val="21"/>
+        </w:rPr>
+        <w:t xml:space="preserve">Perfiles Estudiantiles: </w:t>
+      </w:r>
+      <w:r>
+        <w:rPr>
+          <w:rFonts w:ascii="Arial" w:hAnsi="Arial"/>
+          <w:color w:val="1E293B"/>
+          <w:sz w:val="21"/>
+        </w:rPr>
+        <w:t>Dispone de 3 perfiles configurables: Postulantes / Nuevos Ingresantes (Examen de admisión S/ 100, Matrícula 1er ciclo S/ 150, Carné MINEDU S/ 20, Carpeta S/ 25), Estudiantes Regulares (Matrícula semestral S/ 150, Carné S/ 20, Seguro de accidentes S/ 15) y Trámites de Titulación (Certificado modular S/ 40, Carpeta de titulación profesional técnica S/ 250, Certificados oficiales S/ 50).</w:t>
+      </w:r>
+    </w:p>
+    <w:p>
+      <w:pPr>
+        <w:pStyle w:val="ListBullet"/>
+        <w:spacing w:after="60" w:line="276" w:lineRule="auto"/>
+      </w:pPr>
+      <w:r>
+        <w:rPr>
+          <w:rFonts w:ascii="Arial" w:hAnsi="Arial"/>
+          <w:b/>
+          <w:color w:val="1E293B"/>
+          <w:sz w:val="21"/>
+        </w:rPr>
+        <w:t xml:space="preserve">Cálculo Dinámico en Tiempo Real: </w:t>
+      </w:r>
+      <w:r>
+        <w:rPr>
+          <w:rFonts w:ascii="Arial" w:hAnsi="Arial"/>
+          <w:color w:val="1E293B"/>
+          <w:sz w:val="21"/>
+        </w:rPr>
+        <w:t>Suma automática con desglose ítem por ítem en soles (S/).</w:t>
+      </w:r>
+    </w:p>
+    <w:p>
+      <w:pPr>
+        <w:pStyle w:val="ListBullet"/>
+        <w:spacing w:after="60" w:line="276" w:lineRule="auto"/>
+      </w:pPr>
+      <w:r>
+        <w:rPr>
+          <w:rFonts w:ascii="Arial" w:hAnsi="Arial"/>
+          <w:b/>
+          <w:color w:val="1E293B"/>
+          <w:sz w:val="21"/>
+        </w:rPr>
+        <w:t xml:space="preserve">Exportación Rápida de Presupuesto: </w:t>
+      </w:r>
+      <w:r>
+        <w:rPr>
+          <w:rFonts w:ascii="Arial" w:hAnsi="Arial"/>
+          <w:color w:val="1E293B"/>
+          <w:sz w:val="21"/>
+        </w:rPr>
+        <w:t>Permite copiar el resumen financiero al portapapeles con formato formal o enviar el presupuesto directo al chat para recibir orientación sobre el depósito bancario.</w:t>
+      </w:r>
+    </w:p>
+    <w:p>
+      <w:pPr>
+        <w:spacing w:before="240" w:after="80"/>
+      </w:pPr>
+      <w:r>
+        <w:rPr>
+          <w:rFonts w:ascii="Arial" w:hAnsi="Arial"/>
+          <w:b/>
+          <w:color w:val="2563EB"/>
+          <w:sz w:val="24"/>
+        </w:rPr>
+        <w:t>6.3. Mapa Arquitectónico Interactivo del Campus</w:t>
+      </w:r>
+    </w:p>
+    <w:p>
+      <w:pPr>
+        <w:spacing w:after="120" w:line="276" w:lineRule="auto"/>
+      </w:pPr>
+      <w:r>
+        <w:rPr>
+          <w:rFonts w:ascii="Arial" w:hAnsi="Arial"/>
+          <w:color w:val="1E293B"/>
+          <w:sz w:val="21"/>
+        </w:rPr>
+        <w:t>Plano arquitectónico esquemático del campus de Paita organizado en cuadrícula y sectores estratégicos:</w:t>
+      </w:r>
+    </w:p>
+    <w:p>
+      <w:pPr>
+        <w:pStyle w:val="ListBullet"/>
+        <w:spacing w:after="60" w:line="276" w:lineRule="auto"/>
+      </w:pPr>
+      <w:r>
+        <w:rPr>
+          <w:rFonts w:ascii="Arial" w:hAnsi="Arial"/>
+          <w:b/>
+          <w:color w:val="1E293B"/>
+          <w:sz w:val="21"/>
+        </w:rPr>
+        <w:t xml:space="preserve">Laboratorios de Cómputo y Cloud APSTI: </w:t>
+      </w:r>
+      <w:r>
+        <w:rPr>
+          <w:rFonts w:ascii="Arial" w:hAnsi="Arial"/>
+          <w:color w:val="1E293B"/>
+          <w:sz w:val="21"/>
+        </w:rPr>
+        <w:t>Equipados con servidores de prueba, racks de telecomunicaciones y laboratorios de software.</w:t>
+      </w:r>
+    </w:p>
+    <w:p>
+      <w:pPr>
+        <w:pStyle w:val="ListBullet"/>
+        <w:spacing w:after="60" w:line="276" w:lineRule="auto"/>
+      </w:pPr>
+      <w:r>
+        <w:rPr>
+          <w:rFonts w:ascii="Arial" w:hAnsi="Arial"/>
+          <w:b/>
+          <w:color w:val="1E293B"/>
+          <w:sz w:val="21"/>
+        </w:rPr>
+        <w:t xml:space="preserve">Módulo de Prácticas DPA: </w:t>
+      </w:r>
+      <w:r>
+        <w:rPr>
+          <w:rFonts w:ascii="Arial" w:hAnsi="Arial"/>
+          <w:color w:val="1E293B"/>
+          <w:sz w:val="21"/>
+        </w:rPr>
+        <w:t>Acuarios experimentales de maricultura y embarcación escuela para prácticas en alta mar.</w:t>
+      </w:r>
+    </w:p>
+    <w:p>
+      <w:pPr>
+        <w:pStyle w:val="ListBullet"/>
+        <w:spacing w:after="60" w:line="276" w:lineRule="auto"/>
+      </w:pPr>
+      <w:r>
+        <w:rPr>
+          <w:rFonts w:ascii="Arial" w:hAnsi="Arial"/>
+          <w:b/>
+          <w:color w:val="1E293B"/>
+          <w:sz w:val="21"/>
+        </w:rPr>
+        <w:t xml:space="preserve">Aulas Multimedia de ANI y Contabilidad: </w:t>
+      </w:r>
+      <w:r>
+        <w:rPr>
+          <w:rFonts w:ascii="Arial" w:hAnsi="Arial"/>
+          <w:color w:val="1E293B"/>
+          <w:sz w:val="21"/>
+        </w:rPr>
+        <w:t>Ambientes climatizados con conectividad digital e infoproyectores.</w:t>
+      </w:r>
+    </w:p>
+    <w:p>
+      <w:pPr>
+        <w:pStyle w:val="ListBullet"/>
+        <w:spacing w:after="60" w:line="276" w:lineRule="auto"/>
+      </w:pPr>
+      <w:r>
+        <w:rPr>
+          <w:rFonts w:ascii="Arial" w:hAnsi="Arial"/>
+          <w:b/>
+          <w:color w:val="1E293B"/>
+          <w:sz w:val="21"/>
+        </w:rPr>
+        <w:t xml:space="preserve">Hotspots Interactivos: </w:t>
+      </w:r>
+      <w:r>
+        <w:rPr>
+          <w:rFonts w:ascii="Arial" w:hAnsi="Arial"/>
+          <w:color w:val="1E293B"/>
+          <w:sz w:val="21"/>
+        </w:rPr>
+        <w:t>Al pulsar cualquier sector, se despliegan detalles de equipamiento, aforo y un botón de consulta inmediata en el chat bot.</w:t>
+      </w:r>
+    </w:p>
+    <w:p>
+      <w:pPr>
+        <w:spacing w:before="240" w:after="80"/>
+      </w:pPr>
+      <w:r>
+        <w:rPr>
+          <w:rFonts w:ascii="Arial" w:hAnsi="Arial"/>
+          <w:b/>
+          <w:color w:val="2563EB"/>
+          <w:sz w:val="24"/>
+        </w:rPr>
+        <w:t>6.4. Chips Contextuales de Continuidad y Acciones de Mensaje</w:t>
+      </w:r>
+    </w:p>
+    <w:p>
+      <w:pPr>
+        <w:pStyle w:val="ListBullet"/>
+        <w:spacing w:after="60" w:line="276" w:lineRule="auto"/>
+      </w:pPr>
+      <w:r>
+        <w:rPr>
+          <w:rFonts w:ascii="Arial" w:hAnsi="Arial"/>
+          <w:b/>
+          <w:color w:val="1E293B"/>
+          <w:sz w:val="21"/>
+        </w:rPr>
+        <w:t xml:space="preserve">Chips Dinámicos: </w:t>
+      </w:r>
+      <w:r>
+        <w:rPr>
+          <w:rFonts w:ascii="Arial" w:hAnsi="Arial"/>
+          <w:color w:val="1E293B"/>
+          <w:sz w:val="21"/>
+        </w:rPr>
+        <w:t>Bajo cada respuesta del asistente se generan 3 botones de seguimiento contextual ("¿Cuánto cuesta la matrícula?", "¿Qué requisitos piden?", etc.) que guían la conversación de manera fluida.</w:t>
+      </w:r>
+    </w:p>
+    <w:p>
+      <w:pPr>
+        <w:pStyle w:val="ListBullet"/>
+        <w:spacing w:after="60" w:line="276" w:lineRule="auto"/>
+      </w:pPr>
+      <w:r>
+        <w:rPr>
+          <w:rFonts w:ascii="Arial" w:hAnsi="Arial"/>
+          <w:b/>
+          <w:color w:val="1E293B"/>
+          <w:sz w:val="21"/>
+        </w:rPr>
+        <w:t xml:space="preserve">Acciones por Burbuja: </w:t>
+      </w:r>
+      <w:r>
+        <w:rPr>
+          <w:rFonts w:ascii="Arial" w:hAnsi="Arial"/>
+          <w:color w:val="1E293B"/>
+          <w:sz w:val="21"/>
+        </w:rPr>
+        <w:t>Cada mensaje del bot cuenta con botones para escuchar con voz dulce, copiar con notificación Toast visual, auditar el cálculo neural y calificar la utilidad de la respuesta (feedback positivo/negativo).</w:t>
+      </w:r>
+    </w:p>
+    <w:p>
+      <w:pPr>
+        <w:spacing w:before="360" w:after="120"/>
+      </w:pPr>
+      <w:r>
+        <w:rPr>
+          <w:rFonts w:ascii="Arial" w:hAnsi="Arial"/>
+          <w:b/>
+          <w:color w:val="13357B"/>
+          <w:sz w:val="28"/>
+        </w:rPr>
+        <w:t>7. MOTOR DE HUMANIZACIÓN VOCAL FEMENINA Y DICTADO</w:t>
+      </w:r>
+    </w:p>
+    <w:p>
+      <w:pPr>
+        <w:spacing w:after="120" w:line="276" w:lineRule="auto"/>
+      </w:pPr>
+      <w:r>
+        <w:rPr>
+          <w:rFonts w:ascii="Arial" w:hAnsi="Arial"/>
+          <w:color w:val="1E293B"/>
+          <w:sz w:val="21"/>
+        </w:rPr>
+        <w:t>HercarIA destaca por su timbre vocal humanizado, erradicando lecturas mecánicas e impersonales:</w:t>
+      </w:r>
+    </w:p>
+    <w:p>
+      <w:pPr>
+        <w:pStyle w:val="ListBullet"/>
+        <w:spacing w:after="60" w:line="276" w:lineRule="auto"/>
+      </w:pPr>
+      <w:r>
+        <w:rPr>
+          <w:rFonts w:ascii="Arial" w:hAnsi="Arial"/>
+          <w:b/>
+          <w:color w:val="1E293B"/>
+          <w:sz w:val="21"/>
+        </w:rPr>
+        <w:t xml:space="preserve">Afinación Acústica Melodiosa: </w:t>
+      </w:r>
+      <w:r>
+        <w:rPr>
+          <w:rFonts w:ascii="Arial" w:hAnsi="Arial"/>
+          <w:color w:val="1E293B"/>
+          <w:sz w:val="21"/>
+        </w:rPr>
+        <w:t>Configurada con velocidad 0.93 y tono 1.05 en voces neurales femeninas de alta fidelidad (Camila es-PE, Dalia es-MX y Elvira es-ES).</w:t>
+      </w:r>
+    </w:p>
+    <w:p>
+      <w:pPr>
+        <w:pStyle w:val="ListBullet"/>
+        <w:spacing w:after="60" w:line="276" w:lineRule="auto"/>
+      </w:pPr>
+      <w:r>
+        <w:rPr>
+          <w:rFonts w:ascii="Arial" w:hAnsi="Arial"/>
+          <w:b/>
+          <w:color w:val="1E293B"/>
+          <w:sz w:val="21"/>
+        </w:rPr>
+        <w:t xml:space="preserve">Filtro Integral Antirruido y Anti-Markdown: </w:t>
+      </w:r>
+      <w:r>
+        <w:rPr>
+          <w:rFonts w:ascii="Arial" w:hAnsi="Arial"/>
+          <w:color w:val="1E293B"/>
+          <w:sz w:val="21"/>
+        </w:rPr>
+        <w:t>Expresiones regulares que eliminan asteriscos (*), almohadillas (#), corchetes y signos tipográficos antes de remitir la cadena al sintetizador vocal.</w:t>
+      </w:r>
+    </w:p>
+    <w:p>
+      <w:pPr>
+        <w:pStyle w:val="ListBullet"/>
+        <w:spacing w:after="60" w:line="276" w:lineRule="auto"/>
+      </w:pPr>
+      <w:r>
+        <w:rPr>
+          <w:rFonts w:ascii="Arial" w:hAnsi="Arial"/>
+          <w:b/>
+          <w:color w:val="1E293B"/>
+          <w:sz w:val="21"/>
+        </w:rPr>
+        <w:t xml:space="preserve">Normalización Fonética Estricta: </w:t>
+      </w:r>
+      <w:r>
+        <w:rPr>
+          <w:rFonts w:ascii="Arial" w:hAnsi="Arial"/>
+          <w:color w:val="1E293B"/>
+          <w:sz w:val="21"/>
+        </w:rPr>
+        <w:t>Traducción de siglas institucionales a fonemas amigables: "APSTI" se pronuncia "Ápsti", "IESTP" como "Instituto", "S/ 150" como "150 soles" y "DPA" como "D P A".</w:t>
+      </w:r>
+    </w:p>
+    <w:p>
+      <w:pPr>
+        <w:pStyle w:val="ListBullet"/>
+        <w:spacing w:after="60" w:line="276" w:lineRule="auto"/>
+      </w:pPr>
+      <w:r>
+        <w:rPr>
+          <w:rFonts w:ascii="Arial" w:hAnsi="Arial"/>
+          <w:b/>
+          <w:color w:val="1E293B"/>
+          <w:sz w:val="21"/>
+        </w:rPr>
+        <w:t xml:space="preserve">Dictado por Voz con Micrófono: </w:t>
+      </w:r>
+      <w:r>
+        <w:rPr>
+          <w:rFonts w:ascii="Arial" w:hAnsi="Arial"/>
+          <w:color w:val="1E293B"/>
+          <w:sz w:val="21"/>
+        </w:rPr>
+        <w:t>Reconocimiento continuo con Web Speech Recognition y efecto óptico de ondas concéntricas (Ripple Effect) durante la escucha activa.</w:t>
+      </w:r>
+    </w:p>
+    <w:p>
+      <w:pPr>
+        <w:spacing w:before="360" w:after="120"/>
+      </w:pPr>
+      <w:r>
+        <w:rPr>
+          <w:rFonts w:ascii="Arial" w:hAnsi="Arial"/>
+          <w:b/>
+          <w:color w:val="13357B"/>
+          <w:sz w:val="28"/>
+        </w:rPr>
+        <w:t>8. PROCEDIMIENTOS DE MATRÍCULA Y REGISTRO DE PAGOS</w:t>
+      </w:r>
+    </w:p>
+    <w:p>
+      <w:pPr>
+        <w:spacing w:before="240" w:after="80"/>
+      </w:pPr>
+      <w:r>
+        <w:rPr>
+          <w:rFonts w:ascii="Arial" w:hAnsi="Arial"/>
+          <w:b/>
+          <w:color w:val="2563EB"/>
+          <w:sz w:val="24"/>
+        </w:rPr>
+        <w:t>8.1. Gratuidad de la Enseñanza Pública</w:t>
+      </w:r>
+    </w:p>
+    <w:p>
+      <w:pPr>
+        <w:spacing w:after="120" w:line="276" w:lineRule="auto"/>
+      </w:pPr>
+      <w:r>
+        <w:rPr>
+          <w:rFonts w:ascii="Arial" w:hAnsi="Arial"/>
+          <w:color w:val="1E293B"/>
+          <w:sz w:val="21"/>
+        </w:rPr>
+        <w:t>El IESTP Hermanos Cárcamo es un instituto tecnológico público tutelado por la DREP Piura y el MINEDU. La enseñanza es gratuita sin mensualidades privadas. Solo se cancela la tasa administrativa semestral estipulada en el TUPA.</w:t>
+      </w:r>
+    </w:p>
+    <w:p>
+      <w:pPr>
+        <w:spacing w:before="240" w:after="80"/>
+      </w:pPr>
+      <w:r>
+        <w:rPr>
+          <w:rFonts w:ascii="Arial" w:hAnsi="Arial"/>
+          <w:b/>
+          <w:color w:val="2563EB"/>
+          <w:sz w:val="24"/>
+        </w:rPr>
+        <w:t>8.2. Protocolo de Registro de Vouchers BN</w:t>
+      </w:r>
+    </w:p>
+    <w:p>
+      <w:pPr>
+        <w:pStyle w:val="ListBullet"/>
+        <w:spacing w:after="60" w:line="276" w:lineRule="auto"/>
+      </w:pPr>
+      <w:r>
+        <w:rPr>
+          <w:rFonts w:ascii="Arial" w:hAnsi="Arial"/>
+          <w:b/>
+          <w:color w:val="1E293B"/>
+          <w:sz w:val="21"/>
+        </w:rPr>
+        <w:t xml:space="preserve">Paso 1: </w:t>
+      </w:r>
+      <w:r>
+        <w:rPr>
+          <w:rFonts w:ascii="Arial" w:hAnsi="Arial"/>
+          <w:color w:val="1E293B"/>
+          <w:sz w:val="21"/>
+        </w:rPr>
+        <w:t>Abono en ventanilla o Agente MultiRed del Banco de la Nación.</w:t>
+      </w:r>
+    </w:p>
+    <w:p>
+      <w:pPr>
+        <w:pStyle w:val="ListBullet"/>
+        <w:spacing w:after="60" w:line="276" w:lineRule="auto"/>
+      </w:pPr>
+      <w:r>
+        <w:rPr>
+          <w:rFonts w:ascii="Arial" w:hAnsi="Arial"/>
+          <w:b/>
+          <w:color w:val="1E293B"/>
+          <w:sz w:val="21"/>
+        </w:rPr>
+        <w:t xml:space="preserve">Paso 2: </w:t>
+      </w:r>
+      <w:r>
+        <w:rPr>
+          <w:rFonts w:ascii="Arial" w:hAnsi="Arial"/>
+          <w:color w:val="1E293B"/>
+          <w:sz w:val="21"/>
+        </w:rPr>
+        <w:t>Acceso a la plataforma institucional: https://pagos.ieshercar.edu.pe/</w:t>
+      </w:r>
+    </w:p>
+    <w:p>
+      <w:pPr>
+        <w:pStyle w:val="ListBullet"/>
+        <w:spacing w:after="60" w:line="276" w:lineRule="auto"/>
+      </w:pPr>
+      <w:r>
+        <w:rPr>
+          <w:rFonts w:ascii="Arial" w:hAnsi="Arial"/>
+          <w:b/>
+          <w:color w:val="1E293B"/>
+          <w:sz w:val="21"/>
+        </w:rPr>
+        <w:t xml:space="preserve">Paso 3: </w:t>
+      </w:r>
+      <w:r>
+        <w:rPr>
+          <w:rFonts w:ascii="Arial" w:hAnsi="Arial"/>
+          <w:color w:val="1E293B"/>
+          <w:sz w:val="21"/>
+        </w:rPr>
+        <w:t>Identificación mediante número de DNI.</w:t>
+      </w:r>
+    </w:p>
+    <w:p>
+      <w:pPr>
+        <w:pStyle w:val="ListBullet"/>
+        <w:spacing w:after="60" w:line="276" w:lineRule="auto"/>
+      </w:pPr>
+      <w:r>
+        <w:rPr>
+          <w:rFonts w:ascii="Arial" w:hAnsi="Arial"/>
+          <w:b/>
+          <w:color w:val="1E293B"/>
+          <w:sz w:val="21"/>
+        </w:rPr>
+        <w:t xml:space="preserve">Paso 4: </w:t>
+      </w:r>
+      <w:r>
+        <w:rPr>
+          <w:rFonts w:ascii="Arial" w:hAnsi="Arial"/>
+          <w:color w:val="1E293B"/>
+          <w:sz w:val="21"/>
+        </w:rPr>
+        <w:t>Ingreso de Fecha, Monto exacto y Número de Operación del váucher.</w:t>
+      </w:r>
+    </w:p>
+    <w:p>
+      <w:pPr>
+        <w:pStyle w:val="ListBullet"/>
+        <w:spacing w:after="60" w:line="276" w:lineRule="auto"/>
+      </w:pPr>
+      <w:r>
+        <w:rPr>
+          <w:rFonts w:ascii="Arial" w:hAnsi="Arial"/>
+          <w:b/>
+          <w:color w:val="1E293B"/>
+          <w:sz w:val="21"/>
+        </w:rPr>
+        <w:t xml:space="preserve">Paso 5: </w:t>
+      </w:r>
+      <w:r>
+        <w:rPr>
+          <w:rFonts w:ascii="Arial" w:hAnsi="Arial"/>
+          <w:color w:val="1E293B"/>
+          <w:sz w:val="21"/>
+        </w:rPr>
+        <w:t>Carga de la imagen o archivo PDF del comprobante y registro.</w:t>
+      </w:r>
+    </w:p>
+    <w:p>
+      <w:pPr>
+        <w:pStyle w:val="ListBullet"/>
+        <w:spacing w:after="60" w:line="276" w:lineRule="auto"/>
+      </w:pPr>
+      <w:r>
+        <w:rPr>
+          <w:rFonts w:ascii="Arial" w:hAnsi="Arial"/>
+          <w:b/>
+          <w:color w:val="1E293B"/>
+          <w:sz w:val="21"/>
+        </w:rPr>
+        <w:t xml:space="preserve">Paso 6: </w:t>
+      </w:r>
+      <w:r>
+        <w:rPr>
+          <w:rFonts w:ascii="Arial" w:hAnsi="Arial"/>
+          <w:color w:val="1E293B"/>
+          <w:sz w:val="21"/>
+        </w:rPr>
+        <w:t>Consulta y descarga de la boleta electrónica con validez fiscal en: https://sistema.ieshercar.com/Consulta_Boletas/index.php</w:t>
+      </w:r>
+    </w:p>
+    <w:p>
+      <w:pPr>
+        <w:spacing w:before="360" w:after="120"/>
+      </w:pPr>
+      <w:r>
+        <w:rPr>
+          <w:rFonts w:ascii="Arial" w:hAnsi="Arial"/>
+          <w:b/>
+          <w:color w:val="13357B"/>
+          <w:sz w:val="28"/>
+        </w:rPr>
+        <w:t>9. STACK TECNOLÓGICO Y ARQUITECTURA DEL SISTEMA</w:t>
+      </w:r>
+    </w:p>
+    <w:p>
+      <w:pPr>
+        <w:spacing w:after="120" w:line="276" w:lineRule="auto"/>
+      </w:pPr>
+      <w:r>
+        <w:rPr>
+          <w:rFonts w:ascii="Arial" w:hAnsi="Arial"/>
+          <w:color w:val="1E293B"/>
+          <w:sz w:val="21"/>
+        </w:rPr>
+        <w:t>HercarIA se construyó bajo estándares de ingeniería de software moderno y cero dependencias complejas:</w:t>
       </w:r>
     </w:p>
     <w:tbl>
@@ -1142,6 +1938,130 @@
                 <w:rFonts w:ascii="Arial" w:hAnsi="Arial"/>
                 <w:sz w:val="19"/>
               </w:rPr>
+              <w:t>Red Neuronal Artificial (MLP)</w:t>
+            </w:r>
+          </w:p>
+        </w:tc>
+        <w:tc>
+          <w:tcPr>
+            <w:tcW w:type="dxa" w:w="3120"/>
+            <w:tcMar>
+              <w:top w:w="100" w:type="dxa"/>
+              <w:bottom w:w="100" w:type="dxa"/>
+              <w:left w:w="120" w:type="dxa"/>
+              <w:right w:w="120" w:type="dxa"/>
+            </w:tcMar>
+          </w:tcPr>
+          <w:p>
+            <w:r>
+              <w:rPr>
+                <w:rFonts w:ascii="Arial" w:hAnsi="Arial"/>
+                <w:sz w:val="19"/>
+              </w:rPr>
+              <w:t>HercarNeuralNetwork (Vanilla JS ES6+)</w:t>
+            </w:r>
+          </w:p>
+        </w:tc>
+        <w:tc>
+          <w:tcPr>
+            <w:tcW w:type="dxa" w:w="3120"/>
+            <w:tcMar>
+              <w:top w:w="100" w:type="dxa"/>
+              <w:bottom w:w="100" w:type="dxa"/>
+              <w:left w:w="120" w:type="dxa"/>
+              <w:right w:w="120" w:type="dxa"/>
+            </w:tcMar>
+          </w:tcPr>
+          <w:p>
+            <w:r>
+              <w:rPr>
+                <w:rFonts w:ascii="Arial" w:hAnsi="Arial"/>
+                <w:sz w:val="19"/>
+              </w:rPr>
+              <w:t>Perceptrón Multicapa (220-36-18-22) con LeakyReLU, Tanh, Softmax y Backpropagation en browser.</w:t>
+            </w:r>
+          </w:p>
+        </w:tc>
+      </w:tr>
+      <w:tr>
+        <w:tc>
+          <w:tcPr>
+            <w:tcW w:type="dxa" w:w="3120"/>
+            <w:tcMar>
+              <w:top w:w="100" w:type="dxa"/>
+              <w:bottom w:w="100" w:type="dxa"/>
+              <w:left w:w="120" w:type="dxa"/>
+              <w:right w:w="120" w:type="dxa"/>
+            </w:tcMar>
+          </w:tcPr>
+          <w:p>
+            <w:r>
+              <w:rPr>
+                <w:rFonts w:ascii="Arial" w:hAnsi="Arial"/>
+                <w:sz w:val="19"/>
+              </w:rPr>
+              <w:t>Inspector &amp; Playground IA</w:t>
+            </w:r>
+          </w:p>
+        </w:tc>
+        <w:tc>
+          <w:tcPr>
+            <w:tcW w:type="dxa" w:w="3120"/>
+            <w:tcMar>
+              <w:top w:w="100" w:type="dxa"/>
+              <w:bottom w:w="100" w:type="dxa"/>
+              <w:left w:w="120" w:type="dxa"/>
+              <w:right w:w="120" w:type="dxa"/>
+            </w:tcMar>
+          </w:tcPr>
+          <w:p>
+            <w:r>
+              <w:rPr>
+                <w:rFonts w:ascii="Arial" w:hAnsi="Arial"/>
+                <w:sz w:val="19"/>
+              </w:rPr>
+              <w:t>SVG Reactivo + DOM Dinámico</w:t>
+            </w:r>
+          </w:p>
+        </w:tc>
+        <w:tc>
+          <w:tcPr>
+            <w:tcW w:type="dxa" w:w="3120"/>
+            <w:tcMar>
+              <w:top w:w="100" w:type="dxa"/>
+              <w:bottom w:w="100" w:type="dxa"/>
+              <w:left w:w="120" w:type="dxa"/>
+              <w:right w:w="120" w:type="dxa"/>
+            </w:tcMar>
+          </w:tcPr>
+          <w:p>
+            <w:r>
+              <w:rPr>
+                <w:rFonts w:ascii="Arial" w:hAnsi="Arial"/>
+                <w:sz w:val="19"/>
+              </w:rPr>
+              <w:t>Auditoría en tiempo real del grafo neuronal, distribución Softmax y banco de pruebas interactivas.</w:t>
+            </w:r>
+          </w:p>
+        </w:tc>
+      </w:tr>
+      <w:tr>
+        <w:tc>
+          <w:tcPr>
+            <w:tcW w:type="dxa" w:w="3120"/>
+            <w:tcMar>
+              <w:top w:w="100" w:type="dxa"/>
+              <w:bottom w:w="100" w:type="dxa"/>
+              <w:left w:w="120" w:type="dxa"/>
+              <w:right w:w="120" w:type="dxa"/>
+            </w:tcMar>
+          </w:tcPr>
+          <w:p>
+            <w:r>
+              <w:rPr>
+                <w:rFonts w:ascii="Arial" w:hAnsi="Arial"/>
+                <w:sz w:val="19"/>
+              </w:rPr>
               <w:t>Frontend UI / UX</w:t>
             </w:r>
           </w:p>
@@ -1182,7 +2102,7 @@
                 <w:rFonts w:ascii="Arial" w:hAnsi="Arial"/>
                 <w:sz w:val="19"/>
               </w:rPr>
-              <w:t>Diseño fullscreen responsivo inspirado en ChatGPT, soporte completo para tema claro/oscuro, microinteracciones y efectos ripple.</w:t>
+              <w:t>Diseño fullscreen estilo ChatGPT, microinteracciones, modales glassmorphism y tema claro/oscuro.</w:t>
             </w:r>
           </w:p>
         </w:tc>
@@ -1204,7 +2124,7 @@
                 <w:rFonts w:ascii="Arial" w:hAnsi="Arial"/>
                 <w:sz w:val="19"/>
               </w:rPr>
-              <w:t>Lógica Conversacional</w:t>
+              <w:t>Simulador Financiero TUPA</w:t>
             </w:r>
           </w:p>
         </w:tc>
@@ -1224,7 +2144,7 @@
                 <w:rFonts w:ascii="Arial" w:hAnsi="Arial"/>
                 <w:sz w:val="19"/>
               </w:rPr>
-              <w:t>Vanilla JavaScript (ES6+ Modular)</w:t>
+              <w:t>Algoritmo JS de Tasas 2026</w:t>
             </w:r>
           </w:p>
         </w:tc>
@@ -1244,69 +2164,7 @@
                 <w:rFonts w:ascii="Arial" w:hAnsi="Arial"/>
                 <w:sz w:val="19"/>
               </w:rPr>
-              <w:t>Normalización de texto, motor NLP basado en intenciones semánticas y expresiones regulares, parsing dinámico de Markdown.</w:t>
-            </w:r>
-          </w:p>
-        </w:tc>
-      </w:tr>
-      <w:tr>
-        <w:tc>
-          <w:tcPr>
-            <w:tcW w:type="dxa" w:w="3120"/>
-            <w:tcMar>
-              <w:top w:w="100" w:type="dxa"/>
-              <w:bottom w:w="100" w:type="dxa"/>
-              <w:left w:w="120" w:type="dxa"/>
-              <w:right w:w="120" w:type="dxa"/>
-            </w:tcMar>
-          </w:tcPr>
-          <w:p>
-            <w:r>
-              <w:rPr>
-                <w:rFonts w:ascii="Arial" w:hAnsi="Arial"/>
-                <w:sz w:val="19"/>
-              </w:rPr>
-              <w:t>Iconografía Vectorial</w:t>
-            </w:r>
-          </w:p>
-        </w:tc>
-        <w:tc>
-          <w:tcPr>
-            <w:tcW w:type="dxa" w:w="3120"/>
-            <w:tcMar>
-              <w:top w:w="100" w:type="dxa"/>
-              <w:bottom w:w="100" w:type="dxa"/>
-              <w:left w:w="120" w:type="dxa"/>
-              <w:right w:w="120" w:type="dxa"/>
-            </w:tcMar>
-          </w:tcPr>
-          <w:p>
-            <w:r>
-              <w:rPr>
-                <w:rFonts w:ascii="Arial" w:hAnsi="Arial"/>
-                <w:sz w:val="19"/>
-              </w:rPr>
-              <w:t>SVG Inline (Trazo uniforme a 2px)</w:t>
-            </w:r>
-          </w:p>
-        </w:tc>
-        <w:tc>
-          <w:tcPr>
-            <w:tcW w:type="dxa" w:w="3120"/>
-            <w:tcMar>
-              <w:top w:w="100" w:type="dxa"/>
-              <w:bottom w:w="100" w:type="dxa"/>
-              <w:left w:w="120" w:type="dxa"/>
-              <w:right w:w="120" w:type="dxa"/>
-            </w:tcMar>
-          </w:tcPr>
-          <w:p>
-            <w:r>
-              <w:rPr>
-                <w:rFonts w:ascii="Arial" w:hAnsi="Arial"/>
-                <w:sz w:val="19"/>
-              </w:rPr>
-              <w:t>Iconografía nítida y corporativa que sustituye emojis informales, garantizando coherencia visual técnica en todas las resoluciones.</w:t>
+              <w:t>Calculadora interactiva con perfiles de cachimbos, regulares y titulación con copiado al portapapeles.</w:t>
             </w:r>
           </w:p>
         </w:tc>
@@ -1368,7 +2226,7 @@
                 <w:rFonts w:ascii="Arial" w:hAnsi="Arial"/>
                 <w:sz w:val="19"/>
               </w:rPr>
-              <w:t>Cuestionario interactivo de 6 reactivos con ponderación matricial y cálculo de compatibilidad porcentual con trofeo de resultado.</w:t>
+              <w:t>Cuestionario de 6 reactivos con cálculo matricial de compatibilidad porcentual y trofeo interactivo.</w:t>
             </w:r>
           </w:p>
         </w:tc>
@@ -1430,7 +2288,7 @@
                 <w:rFonts w:ascii="Arial" w:hAnsi="Arial"/>
                 <w:sz w:val="19"/>
               </w:rPr>
-              <w:t>Síntesis de voz femenina dulce y humana con fallback automático para funcionamiento universal en web estática y servidores locales.</w:t>
+              <w:t>Síntesis de voz femenina dulce con entonación natural y normalización fonética de siglas.</w:t>
             </w:r>
           </w:p>
         </w:tc>
@@ -1492,69 +2350,7 @@
                 <w:rFonts w:ascii="Arial" w:hAnsi="Arial"/>
                 <w:sz w:val="19"/>
               </w:rPr>
-              <w:t>Dictado por voz mediante micrófono en tiempo real con dialecto español de Perú (es-PE) y detección de silencio.</w:t>
-            </w:r>
-          </w:p>
-        </w:tc>
-      </w:tr>
-      <w:tr>
-        <w:tc>
-          <w:tcPr>
-            <w:tcW w:type="dxa" w:w="3120"/>
-            <w:tcMar>
-              <w:top w:w="100" w:type="dxa"/>
-              <w:bottom w:w="100" w:type="dxa"/>
-              <w:left w:w="120" w:type="dxa"/>
-              <w:right w:w="120" w:type="dxa"/>
-            </w:tcMar>
-          </w:tcPr>
-          <w:p>
-            <w:r>
-              <w:rPr>
-                <w:rFonts w:ascii="Arial" w:hAnsi="Arial"/>
-                <w:sz w:val="19"/>
-              </w:rPr>
-              <w:t>Almacenamiento Local</w:t>
-            </w:r>
-          </w:p>
-        </w:tc>
-        <w:tc>
-          <w:tcPr>
-            <w:tcW w:type="dxa" w:w="3120"/>
-            <w:tcMar>
-              <w:top w:w="100" w:type="dxa"/>
-              <w:bottom w:w="100" w:type="dxa"/>
-              <w:left w:w="120" w:type="dxa"/>
-              <w:right w:w="120" w:type="dxa"/>
-            </w:tcMar>
-          </w:tcPr>
-          <w:p>
-            <w:r>
-              <w:rPr>
-                <w:rFonts w:ascii="Arial" w:hAnsi="Arial"/>
-                <w:sz w:val="19"/>
-              </w:rPr>
-              <w:t>Web Storage API (localStorage)</w:t>
-            </w:r>
-          </w:p>
-        </w:tc>
-        <w:tc>
-          <w:tcPr>
-            <w:tcW w:type="dxa" w:w="3120"/>
-            <w:tcMar>
-              <w:top w:w="100" w:type="dxa"/>
-              <w:bottom w:w="100" w:type="dxa"/>
-              <w:left w:w="120" w:type="dxa"/>
-              <w:right w:w="120" w:type="dxa"/>
-            </w:tcMar>
-          </w:tcPr>
-          <w:p>
-            <w:r>
-              <w:rPr>
-                <w:rFonts w:ascii="Arial" w:hAnsi="Arial"/>
-                <w:sz w:val="19"/>
-              </w:rPr>
-              <w:t>Persistencia del historial de consultas recientes del usuario y preferencias de tema de interfaz.</w:t>
+              <w:t>Dictado por voz mediante micrófono en tiempo real con animación concéntrica Ripple.</w:t>
             </w:r>
           </w:p>
         </w:tc>
@@ -1616,7 +2412,7 @@
                 <w:rFonts w:ascii="Arial" w:hAnsi="Arial"/>
                 <w:sz w:val="19"/>
               </w:rPr>
-              <w:t>Alojamiento en la nube con disponibilidad permanente 24/7, certificado SSL activo y CDN de alta velocidad.</w:t>
+              <w:t>Alojamiento en la nube con disponibilidad 24/7, certificado SSL y CDN de alta velocidad.</w:t>
             </w:r>
           </w:p>
         </w:tc>
@@ -1633,7 +2429,7 @@
           <w:color w:val="13357B"/>
           <w:sz w:val="28"/>
         </w:rPr>
-        <w:t>7. MOTOR DE HUMANIZACIÓN VOCAL FEMENINA Y DICTADO</w:t>
+        <w:t>10. GUÍA DE INSTALACIÓN Y ENLACES OFICIALES</w:t>
       </w:r>
     </w:p>
     <w:p>
@@ -1646,7 +2442,7 @@
           <w:color w:val="1E293B"/>
           <w:sz w:val="21"/>
         </w:rPr>
-        <w:t>Uno de los mayores logros del proyecto es la humanización de la voz de HercarIA, eliminando cualquier sensación de sintetizador robótico antiguo:</w:t>
+        <w:t>HercarIA se distribuye en dos modalidades para conveniencia de toda la comunidad:</w:t>
       </w:r>
     </w:p>
     <w:p>
@@ -1661,7 +2457,7 @@
           <w:color w:val="1E293B"/>
           <w:sz w:val="21"/>
         </w:rPr>
-        <w:t xml:space="preserve">Calibración Acústica Agradable y Femenina: </w:t>
+        <w:t xml:space="preserve">1. Despliegue en Vivo en la Nube (GitHub Pages): </w:t>
       </w:r>
       <w:r>
         <w:rPr>
@@ -1669,634 +2465,7 @@
           <w:color w:val="1E293B"/>
           <w:sz w:val="21"/>
         </w:rPr>
-        <w:t>Se calibró la tasa de velocidad en 0.93 y el tono (pitch) en 1.05. Este ajuste acústico produce una cadencia pausada, melodiosa, suave y natural, ideal para la atención y orientación vocacional.</w:t>
-      </w:r>
-    </w:p>
-    <w:p>
-      <w:pPr>
-        <w:pStyle w:val="ListBullet"/>
-        <w:spacing w:after="60" w:line="276" w:lineRule="auto"/>
-      </w:pPr>
-      <w:r>
-        <w:rPr>
-          <w:rFonts w:ascii="Arial" w:hAnsi="Arial"/>
-          <w:b/>
-          <w:color w:val="1E293B"/>
-          <w:sz w:val="21"/>
-        </w:rPr>
-        <w:t xml:space="preserve">Supresión Total de Sintaxis Markdown y Asteriscos: </w:t>
-      </w:r>
-      <w:r>
-        <w:rPr>
-          <w:rFonts w:ascii="Arial" w:hAnsi="Arial"/>
-          <w:color w:val="1E293B"/>
-          <w:sz w:val="21"/>
-        </w:rPr>
-        <w:t>Se diseñó un filtro de limpieza previa (regex) que erradica por completo la pronunciación de asteriscos (**), guiones, numerales (#), barras y tablas. La voz habla con lenguaje conversacional limpio mientras la pantalla muestra el texto formateado con viñetas y negritas.</w:t>
-      </w:r>
-    </w:p>
-    <w:p>
-      <w:pPr>
-        <w:pStyle w:val="ListBullet"/>
-        <w:spacing w:after="60" w:line="276" w:lineRule="auto"/>
-      </w:pPr>
-      <w:r>
-        <w:rPr>
-          <w:rFonts w:ascii="Arial" w:hAnsi="Arial"/>
-          <w:b/>
-          <w:color w:val="1E293B"/>
-          <w:sz w:val="21"/>
-        </w:rPr>
-        <w:t xml:space="preserve">Normalización Fonética de Siglas Institucionales: </w:t>
-      </w:r>
-      <w:r>
-        <w:rPr>
-          <w:rFonts w:ascii="Arial" w:hAnsi="Arial"/>
-          <w:color w:val="1E293B"/>
-          <w:sz w:val="21"/>
-        </w:rPr>
-        <w:t>El preprocesador vocal traduce términos técnicos antes de llegar al sintetizador: "APSTI" se modula fonéticamente como "Ápsti" o "Arquitectura de Plataformas y Servicios TI", "ANI" como "Ani", "DPA" como "D P A", "S/ 150" como "150 soles", "IESTP" como "Instituto", y "SUNAT" como "Sunat".</w:t>
-      </w:r>
-    </w:p>
-    <w:p>
-      <w:pPr>
-        <w:pStyle w:val="ListBullet"/>
-        <w:spacing w:after="60" w:line="276" w:lineRule="auto"/>
-      </w:pPr>
-      <w:r>
-        <w:rPr>
-          <w:rFonts w:ascii="Arial" w:hAnsi="Arial"/>
-          <w:b/>
-          <w:color w:val="1E293B"/>
-          <w:sz w:val="21"/>
-        </w:rPr>
-        <w:t xml:space="preserve">Priorización Inteligente de Voces Femeninas: </w:t>
-      </w:r>
-      <w:r>
-        <w:rPr>
-          <w:rFonts w:ascii="Arial" w:hAnsi="Arial"/>
-          <w:color w:val="1E293B"/>
-          <w:sz w:val="21"/>
-        </w:rPr>
-        <w:t>En la versión web (GitHub Pages y celulares), el sistema analiza las voces instaladas en el dispositivo y selecciona prioritariamente voces dulces en español (Dalia, Camila, Salome, Elvira, Sabina).</w:t>
-      </w:r>
-    </w:p>
-    <w:p>
-      <w:pPr>
-        <w:pStyle w:val="ListBullet"/>
-        <w:spacing w:after="60" w:line="276" w:lineRule="auto"/>
-      </w:pPr>
-      <w:r>
-        <w:rPr>
-          <w:rFonts w:ascii="Arial" w:hAnsi="Arial"/>
-          <w:b/>
-          <w:color w:val="1E293B"/>
-          <w:sz w:val="21"/>
-        </w:rPr>
-        <w:t xml:space="preserve">Módulo de Audio Desplegable Popover: </w:t>
-      </w:r>
-      <w:r>
-        <w:rPr>
-          <w:rFonts w:ascii="Arial" w:hAnsi="Arial"/>
-          <w:color w:val="1E293B"/>
-          <w:sz w:val="21"/>
-        </w:rPr>
-        <w:t>En la cabecera superior se incluye el botón minimalista "[ 🔊 🟢 Voz ]". Al hacer clic, despliega un panel flotante donde el usuario puede activar/desactivar la voz, elegir su voz favorita y probar la entonación con el botón "Probar Voz".</w:t>
-      </w:r>
-    </w:p>
-    <w:p>
-      <w:pPr>
-        <w:pStyle w:val="ListBullet"/>
-        <w:spacing w:after="60" w:line="276" w:lineRule="auto"/>
-      </w:pPr>
-      <w:r>
-        <w:rPr>
-          <w:rFonts w:ascii="Arial" w:hAnsi="Arial"/>
-          <w:b/>
-          <w:color w:val="1E293B"/>
-          <w:sz w:val="21"/>
-        </w:rPr>
-        <w:t xml:space="preserve">Cancelación Instantánea de Ecos y Ruidos: </w:t>
-      </w:r>
-      <w:r>
-        <w:rPr>
-          <w:rFonts w:ascii="Arial" w:hAnsi="Arial"/>
-          <w:color w:val="1E293B"/>
-          <w:sz w:val="21"/>
-        </w:rPr>
-        <w:t>Se programó la interrupción inmediata de la síntesis vocal al presionar la tecla Escape, al dar clic en el campo de texto o al enviar una nueva consulta, evitando la superposición molesta de audios.</w:t>
-      </w:r>
-    </w:p>
-    <w:p>
-      <w:pPr>
-        <w:spacing w:before="360" w:after="120"/>
-      </w:pPr>
-      <w:r>
-        <w:rPr>
-          <w:rFonts w:ascii="Arial" w:hAnsi="Arial"/>
-          <w:b/>
-          <w:color w:val="13357B"/>
-          <w:sz w:val="28"/>
-        </w:rPr>
-        <w:t>8. REDISEÑO ERGONÓMICO DE LA INTERFAZ DE USUARIO (UI/UX)</w:t>
-      </w:r>
-    </w:p>
-    <w:p>
-      <w:pPr>
-        <w:spacing w:after="120" w:line="276" w:lineRule="auto"/>
-      </w:pPr>
-      <w:r>
-        <w:rPr>
-          <w:rFonts w:ascii="Arial" w:hAnsi="Arial"/>
-          <w:color w:val="1E293B"/>
-          <w:sz w:val="21"/>
-        </w:rPr>
-        <w:t>Para brindar una experiencia óptima al usuario, se rediseñó la distribución de los componentes eliminando saturaciones visuales:</w:t>
-      </w:r>
-    </w:p>
-    <w:p>
-      <w:pPr>
-        <w:pStyle w:val="ListBullet"/>
-        <w:spacing w:after="60" w:line="276" w:lineRule="auto"/>
-      </w:pPr>
-      <w:r>
-        <w:rPr>
-          <w:rFonts w:ascii="Arial" w:hAnsi="Arial"/>
-          <w:b/>
-          <w:color w:val="1E293B"/>
-          <w:sz w:val="21"/>
-        </w:rPr>
-        <w:t xml:space="preserve">Menú Lateral Limpio estilo ChatGPT: </w:t>
-      </w:r>
-      <w:r>
-        <w:rPr>
-          <w:rFonts w:ascii="Arial" w:hAnsi="Arial"/>
-          <w:color w:val="1E293B"/>
-          <w:sz w:val="21"/>
-        </w:rPr>
-        <w:t>El menú lateral (Sidebar) se reservó exclusivamente para las acciones de navegación fundamentales: botón destacado "+ Nueva Conversación", acceso rápido a "Test Vocacional", lista de "Consultas Recientes" y conmutador de "Modo Oscuro".</w:t>
-      </w:r>
-    </w:p>
-    <w:p>
-      <w:pPr>
-        <w:pStyle w:val="ListBullet"/>
-        <w:spacing w:after="60" w:line="276" w:lineRule="auto"/>
-      </w:pPr>
-      <w:r>
-        <w:rPr>
-          <w:rFonts w:ascii="Arial" w:hAnsi="Arial"/>
-          <w:b/>
-          <w:color w:val="1E293B"/>
-          <w:sz w:val="21"/>
-        </w:rPr>
-        <w:t xml:space="preserve">Botones de Utilidad en Cabecera Superior: </w:t>
-      </w:r>
-      <w:r>
-        <w:rPr>
-          <w:rFonts w:ascii="Arial" w:hAnsi="Arial"/>
-          <w:color w:val="1E293B"/>
-          <w:sz w:val="21"/>
-        </w:rPr>
-        <w:t>Las funciones operativas se trasladaron a la esquina superior derecha del encabezado, junto al selector de voz: el botón "Guardar Chat" (descarga la transcripción en un archivo .txt con membrete oficial) y el botón "Borrar Chat" (reinicia la sesión de diálogo de manera segura).</w:t>
-      </w:r>
-    </w:p>
-    <w:p>
-      <w:pPr>
-        <w:pStyle w:val="ListBullet"/>
-        <w:spacing w:after="60" w:line="276" w:lineRule="auto"/>
-      </w:pPr>
-      <w:r>
-        <w:rPr>
-          <w:rFonts w:ascii="Arial" w:hAnsi="Arial"/>
-          <w:b/>
-          <w:color w:val="1E293B"/>
-          <w:sz w:val="21"/>
-        </w:rPr>
-        <w:t xml:space="preserve">Barra de Píldoras de Acceso Rápido (Chips): </w:t>
-      </w:r>
-      <w:r>
-        <w:rPr>
-          <w:rFonts w:ascii="Arial" w:hAnsi="Arial"/>
-          <w:color w:val="1E293B"/>
-          <w:sz w:val="21"/>
-        </w:rPr>
-        <w:t>Directamente sobre el cuadro de entrada de texto se dispuso una barra horizontal con chips interactivos ("Las 4 Carreras Técnicas", "Registro de Pagos", "Matrícula y Costos 2026", "Mesa de Partes Virtual", "Ubicación y Contacto"). Al presionar un chip, la consulta se envía inmediatamente al chat sin necesidad de teclear.</w:t>
-      </w:r>
-    </w:p>
-    <w:p>
-      <w:pPr>
-        <w:pStyle w:val="ListBullet"/>
-        <w:spacing w:after="60" w:line="276" w:lineRule="auto"/>
-      </w:pPr>
-      <w:r>
-        <w:rPr>
-          <w:rFonts w:ascii="Arial" w:hAnsi="Arial"/>
-          <w:b/>
-          <w:color w:val="1E293B"/>
-          <w:sz w:val="21"/>
-        </w:rPr>
-        <w:t xml:space="preserve">Navegación Adaptativa de 3 Líneas: </w:t>
-      </w:r>
-      <w:r>
-        <w:rPr>
-          <w:rFonts w:ascii="Arial" w:hAnsi="Arial"/>
-          <w:color w:val="1E293B"/>
-          <w:sz w:val="21"/>
-        </w:rPr>
-        <w:t>En computadoras de escritorio, el icono de menú colapsa la barra lateral para otorgar el 100% de la pantalla a la conversación. En teléfonos inteligentes, abre un Drawer deslizante con fondo oscuro translúcido y botón táctil de cierre.</w:t>
-      </w:r>
-    </w:p>
-    <w:p>
-      <w:pPr>
-        <w:spacing w:before="360" w:after="120"/>
-      </w:pPr>
-      <w:r>
-        <w:rPr>
-          <w:rFonts w:ascii="Arial" w:hAnsi="Arial"/>
-          <w:b/>
-          <w:color w:val="13357B"/>
-          <w:sz w:val="28"/>
-        </w:rPr>
-        <w:t>9. TEST VOCACIONAL PSICOMÉTRICO INTERACTIVO</w:t>
-      </w:r>
-    </w:p>
-    <w:p>
-      <w:pPr>
-        <w:spacing w:after="120" w:line="276" w:lineRule="auto"/>
-      </w:pPr>
-      <w:r>
-        <w:rPr>
-          <w:rFonts w:ascii="Arial" w:hAnsi="Arial"/>
-          <w:color w:val="1E293B"/>
-          <w:sz w:val="21"/>
-        </w:rPr>
-        <w:t>El sistema incorpora un orientador vocacional desarrollado en js/test_vocacional.js que diagnostica la inclinación profesional del postulante mediante 6 reactivos interactivos:</w:t>
-      </w:r>
-    </w:p>
-    <w:p>
-      <w:pPr>
-        <w:pStyle w:val="ListBullet"/>
-        <w:spacing w:after="60" w:line="276" w:lineRule="auto"/>
-      </w:pPr>
-      <w:r>
-        <w:rPr>
-          <w:rFonts w:ascii="Arial" w:hAnsi="Arial"/>
-          <w:b/>
-          <w:color w:val="1E293B"/>
-          <w:sz w:val="21"/>
-        </w:rPr>
-        <w:t xml:space="preserve">Pregunta 1 (Intereses Naturales): </w:t>
-      </w:r>
-      <w:r>
-        <w:rPr>
-          <w:rFonts w:ascii="Arial" w:hAnsi="Arial"/>
-          <w:color w:val="1E293B"/>
-          <w:sz w:val="21"/>
-        </w:rPr>
-        <w:t>Indaga sobre actividades predilectas en tiempo libre (resolver problemas tecnológicos, coordinar proyectos comerciales, organizar finanzas o explorar la fauna marina).</w:t>
-      </w:r>
-    </w:p>
-    <w:p>
-      <w:pPr>
-        <w:pStyle w:val="ListBullet"/>
-        <w:spacing w:after="60" w:line="276" w:lineRule="auto"/>
-      </w:pPr>
-      <w:r>
-        <w:rPr>
-          <w:rFonts w:ascii="Arial" w:hAnsi="Arial"/>
-          <w:b/>
-          <w:color w:val="1E293B"/>
-          <w:sz w:val="21"/>
-        </w:rPr>
-        <w:t xml:space="preserve">Pregunta 2 (Entorno Laboral Deseado): </w:t>
-      </w:r>
-      <w:r>
-        <w:rPr>
-          <w:rFonts w:ascii="Arial" w:hAnsi="Arial"/>
-          <w:color w:val="1E293B"/>
-          <w:sz w:val="21"/>
-        </w:rPr>
-        <w:t>Evalúa el ambiente de trabajo preferido (oficinas tecnológicas con servidores, agencias aduaneras portuarias, despachos tributarios o plantas de procesamiento y embarcaciones).</w:t>
-      </w:r>
-    </w:p>
-    <w:p>
-      <w:pPr>
-        <w:pStyle w:val="ListBullet"/>
-        <w:spacing w:after="60" w:line="276" w:lineRule="auto"/>
-      </w:pPr>
-      <w:r>
-        <w:rPr>
-          <w:rFonts w:ascii="Arial" w:hAnsi="Arial"/>
-          <w:b/>
-          <w:color w:val="1E293B"/>
-          <w:sz w:val="21"/>
-        </w:rPr>
-        <w:t xml:space="preserve">Pregunta 3 (Habilidades Destacadas): </w:t>
-      </w:r>
-      <w:r>
-        <w:rPr>
-          <w:rFonts w:ascii="Arial" w:hAnsi="Arial"/>
-          <w:color w:val="1E293B"/>
-          <w:sz w:val="21"/>
-        </w:rPr>
-        <w:t>Mide competencias autopercibidas (pensamiento analítico y algoritmos, negociación persuasiva, exactitud numérica y orden, o destreza biológica y trabajo en campo).</w:t>
-      </w:r>
-    </w:p>
-    <w:p>
-      <w:pPr>
-        <w:pStyle w:val="ListBullet"/>
-        <w:spacing w:after="60" w:line="276" w:lineRule="auto"/>
-      </w:pPr>
-      <w:r>
-        <w:rPr>
-          <w:rFonts w:ascii="Arial" w:hAnsi="Arial"/>
-          <w:b/>
-          <w:color w:val="1E293B"/>
-          <w:sz w:val="21"/>
-        </w:rPr>
-        <w:t xml:space="preserve">Pregunta 4 (Motivación Profesional): </w:t>
-      </w:r>
-      <w:r>
-        <w:rPr>
-          <w:rFonts w:ascii="Arial" w:hAnsi="Arial"/>
-          <w:color w:val="1E293B"/>
-          <w:sz w:val="21"/>
-        </w:rPr>
-        <w:t>Analiza metas de vida (crear soluciones de software para empresas, impulsar exportaciones regionales hacia mercados globales, liderar la administración contable de grandes corporaciones o innovar en la maricultura sostenible).</w:t>
-      </w:r>
-    </w:p>
-    <w:p>
-      <w:pPr>
-        <w:pStyle w:val="ListBullet"/>
-        <w:spacing w:after="60" w:line="276" w:lineRule="auto"/>
-      </w:pPr>
-      <w:r>
-        <w:rPr>
-          <w:rFonts w:ascii="Arial" w:hAnsi="Arial"/>
-          <w:b/>
-          <w:color w:val="1E293B"/>
-          <w:sz w:val="21"/>
-        </w:rPr>
-        <w:t xml:space="preserve">Pregunta 5 (Resolución de Conflictos): </w:t>
-      </w:r>
-      <w:r>
-        <w:rPr>
-          <w:rFonts w:ascii="Arial" w:hAnsi="Arial"/>
-          <w:color w:val="1E293B"/>
-          <w:sz w:val="21"/>
-        </w:rPr>
-        <w:t>Evalúa el estilo de respuesta ante desafíos cotidianos.</w:t>
-      </w:r>
-    </w:p>
-    <w:p>
-      <w:pPr>
-        <w:pStyle w:val="ListBullet"/>
-        <w:spacing w:after="60" w:line="276" w:lineRule="auto"/>
-      </w:pPr>
-      <w:r>
-        <w:rPr>
-          <w:rFonts w:ascii="Arial" w:hAnsi="Arial"/>
-          <w:b/>
-          <w:color w:val="1E293B"/>
-          <w:sz w:val="21"/>
-        </w:rPr>
-        <w:t xml:space="preserve">Pregunta 6 (Visión de Futuro en Paita): </w:t>
-      </w:r>
-      <w:r>
-        <w:rPr>
-          <w:rFonts w:ascii="Arial" w:hAnsi="Arial"/>
-          <w:color w:val="1E293B"/>
-          <w:sz w:val="21"/>
-        </w:rPr>
-        <w:t>Conecta las aspiraciones personales con las oportunidades laborales tangibles del puerto de Paita y la Región Piura.</w:t>
-      </w:r>
-    </w:p>
-    <w:p>
-      <w:pPr>
-        <w:spacing w:after="120" w:line="276" w:lineRule="auto"/>
-      </w:pPr>
-      <w:r>
-        <w:rPr>
-          <w:rFonts w:ascii="Arial" w:hAnsi="Arial"/>
-          <w:color w:val="1E293B"/>
-          <w:sz w:val="21"/>
-        </w:rPr>
-        <w:t>Al culminar la evaluación, el algoritmo calcula el porcentaje de afinidad de las 4 carreras, presenta una tarjeta interactiva con trofeo dorado, detalla el campo laboral en la región y ofrece botones de acción para revisar la malla curricular o conocer los requisitos de matrícula.</w:t>
-      </w:r>
-    </w:p>
-    <w:p>
-      <w:pPr>
-        <w:spacing w:before="360" w:after="120"/>
-      </w:pPr>
-      <w:r>
-        <w:rPr>
-          <w:rFonts w:ascii="Arial" w:hAnsi="Arial"/>
-          <w:b/>
-          <w:color w:val="13357B"/>
-          <w:sz w:val="28"/>
-        </w:rPr>
-        <w:t>10. MEMORIA DE CONSTRUCCIÓN PASO A PASO</w:t>
-      </w:r>
-    </w:p>
-    <w:p>
-      <w:pPr>
-        <w:spacing w:after="120" w:line="276" w:lineRule="auto"/>
-      </w:pPr>
-      <w:r>
-        <w:rPr>
-          <w:rFonts w:ascii="Arial" w:hAnsi="Arial"/>
-          <w:color w:val="1E293B"/>
-          <w:sz w:val="21"/>
-        </w:rPr>
-        <w:t>El desarrollo de HercarIA se ejecutó siguiendo 6 fases sistemáticas:</w:t>
-      </w:r>
-    </w:p>
-    <w:p>
-      <w:pPr>
-        <w:pStyle w:val="ListBullet"/>
-        <w:spacing w:after="60" w:line="276" w:lineRule="auto"/>
-      </w:pPr>
-      <w:r>
-        <w:rPr>
-          <w:rFonts w:ascii="Arial" w:hAnsi="Arial"/>
-          <w:b/>
-          <w:color w:val="1E293B"/>
-          <w:sz w:val="21"/>
-        </w:rPr>
-        <w:t xml:space="preserve">Fase 1 (Recopilación e Ingeniería de Conocimiento): </w:t>
-      </w:r>
-      <w:r>
-        <w:rPr>
-          <w:rFonts w:ascii="Arial" w:hAnsi="Arial"/>
-          <w:color w:val="1E293B"/>
-          <w:sz w:val="21"/>
-        </w:rPr>
-        <w:t>Extracción sistemática de datos desde el portal web oficial ieshercar.edu.pe, TUPA vigente, plataforma de pagos (pagos.ieshercar.edu.pe) y sistema de boletas electrónicas.</w:t>
-      </w:r>
-    </w:p>
-    <w:p>
-      <w:pPr>
-        <w:pStyle w:val="ListBullet"/>
-        <w:spacing w:after="60" w:line="276" w:lineRule="auto"/>
-      </w:pPr>
-      <w:r>
-        <w:rPr>
-          <w:rFonts w:ascii="Arial" w:hAnsi="Arial"/>
-          <w:b/>
-          <w:color w:val="1E293B"/>
-          <w:sz w:val="21"/>
-        </w:rPr>
-        <w:t xml:space="preserve">Fase 2 (Maquetación y Diseño Visual ChatGPT): </w:t>
-      </w:r>
-      <w:r>
-        <w:rPr>
-          <w:rFonts w:ascii="Arial" w:hAnsi="Arial"/>
-          <w:color w:val="1E293B"/>
-          <w:sz w:val="21"/>
-        </w:rPr>
-        <w:t>Creación de index.html y css/styles.css con maquetación flexible en pantalla completa, portada hero con tarjetas explicativas y soporte completo para modo oscuro y claro.</w:t>
-      </w:r>
-    </w:p>
-    <w:p>
-      <w:pPr>
-        <w:pStyle w:val="ListBullet"/>
-        <w:spacing w:after="60" w:line="276" w:lineRule="auto"/>
-      </w:pPr>
-      <w:r>
-        <w:rPr>
-          <w:rFonts w:ascii="Arial" w:hAnsi="Arial"/>
-          <w:b/>
-          <w:color w:val="1E293B"/>
-          <w:sz w:val="21"/>
-        </w:rPr>
-        <w:t xml:space="preserve">Fase 3 (Desarrollo del Motor NLP en JavaScript): </w:t>
-      </w:r>
-      <w:r>
-        <w:rPr>
-          <w:rFonts w:ascii="Arial" w:hAnsi="Arial"/>
-          <w:color w:val="1E293B"/>
-          <w:sz w:val="21"/>
-        </w:rPr>
-        <w:t>Programación de js/app.js para detectar intenciones de usuario sobre requisitos, gratuidad, carreras, convalidaciones, títulos oficiales y horarios, aplicando normalización de cadenas de texto.</w:t>
-      </w:r>
-    </w:p>
-    <w:p>
-      <w:pPr>
-        <w:pStyle w:val="ListBullet"/>
-        <w:spacing w:after="60" w:line="276" w:lineRule="auto"/>
-      </w:pPr>
-      <w:r>
-        <w:rPr>
-          <w:rFonts w:ascii="Arial" w:hAnsi="Arial"/>
-          <w:b/>
-          <w:color w:val="1E293B"/>
-          <w:sz w:val="21"/>
-        </w:rPr>
-        <w:t xml:space="preserve">Fase 4 (Implementación del Test Psicométrico): </w:t>
-      </w:r>
-      <w:r>
-        <w:rPr>
-          <w:rFonts w:ascii="Arial" w:hAnsi="Arial"/>
-          <w:color w:val="1E293B"/>
-          <w:sz w:val="21"/>
-        </w:rPr>
-        <w:t>Codificación de js/test_vocacional.js con cálculo matricial dinámico y tarjetas visuales interactivas.</w:t>
-      </w:r>
-    </w:p>
-    <w:p>
-      <w:pPr>
-        <w:pStyle w:val="ListBullet"/>
-        <w:spacing w:after="60" w:line="276" w:lineRule="auto"/>
-      </w:pPr>
-      <w:r>
-        <w:rPr>
-          <w:rFonts w:ascii="Arial" w:hAnsi="Arial"/>
-          <w:b/>
-          <w:color w:val="1E293B"/>
-          <w:sz w:val="21"/>
-        </w:rPr>
-        <w:t xml:space="preserve">Fase 5 (Humanización Vocal y Audio Desplegable): </w:t>
-      </w:r>
-      <w:r>
-        <w:rPr>
-          <w:rFonts w:ascii="Arial" w:hAnsi="Arial"/>
-          <w:color w:val="1E293B"/>
-          <w:sz w:val="21"/>
-        </w:rPr>
-        <w:t>Desarrollo de js/voice.js, integrando Microsoft Edge TTS (Python) y síntesis del navegador con tono femenino dulce, filtros de sintaxis Markdown y dictado por micrófono.</w:t>
-      </w:r>
-    </w:p>
-    <w:p>
-      <w:pPr>
-        <w:pStyle w:val="ListBullet"/>
-        <w:spacing w:after="60" w:line="276" w:lineRule="auto"/>
-      </w:pPr>
-      <w:r>
-        <w:rPr>
-          <w:rFonts w:ascii="Arial" w:hAnsi="Arial"/>
-          <w:b/>
-          <w:color w:val="1E293B"/>
-          <w:sz w:val="21"/>
-        </w:rPr>
-        <w:t xml:space="preserve">Fase 6 (Despliegue y Control de Versiones en GitHub): </w:t>
-      </w:r>
-      <w:r>
-        <w:rPr>
-          <w:rFonts w:ascii="Arial" w:hAnsi="Arial"/>
-          <w:color w:val="1E293B"/>
-          <w:sz w:val="21"/>
-        </w:rPr>
-        <w:t>Publicación en el repositorio oficial de GitHub (https://github.com/GMPH2007/HercarBOT) y activación de GitHub Pages para acceso universal y gratuito desde cualquier dispositivo móvil o computadora.</w:t>
-      </w:r>
-    </w:p>
-    <w:p>
-      <w:pPr>
-        <w:spacing w:before="360" w:after="120"/>
-      </w:pPr>
-      <w:r>
-        <w:rPr>
-          <w:rFonts w:ascii="Arial" w:hAnsi="Arial"/>
-          <w:b/>
-          <w:color w:val="13357B"/>
-          <w:sz w:val="28"/>
-        </w:rPr>
-        <w:t>11. GUÍA DE INSTALACIÓN Y ENLACES OFICIALES</w:t>
-      </w:r>
-    </w:p>
-    <w:p>
-      <w:pPr>
-        <w:spacing w:after="120" w:line="276" w:lineRule="auto"/>
-      </w:pPr>
-      <w:r>
-        <w:rPr>
-          <w:rFonts w:ascii="Arial" w:hAnsi="Arial"/>
-          <w:color w:val="1E293B"/>
-          <w:sz w:val="21"/>
-        </w:rPr>
-        <w:t>HercarIA se distribuye en dos modalidades para facilidad de los usuarios:</w:t>
-      </w:r>
-    </w:p>
-    <w:p>
-      <w:pPr>
-        <w:pStyle w:val="ListBullet"/>
-        <w:spacing w:after="60" w:line="276" w:lineRule="auto"/>
-      </w:pPr>
-      <w:r>
-        <w:rPr>
-          <w:rFonts w:ascii="Arial" w:hAnsi="Arial"/>
-          <w:b/>
-          <w:color w:val="1E293B"/>
-          <w:sz w:val="21"/>
-        </w:rPr>
-        <w:t xml:space="preserve">1. Acceso en Vivo en la Nube (GitHub Pages): </w:t>
-      </w:r>
-      <w:r>
-        <w:rPr>
-          <w:rFonts w:ascii="Arial" w:hAnsi="Arial"/>
-          <w:color w:val="1E293B"/>
-          <w:sz w:val="21"/>
-        </w:rPr>
-        <w:t>Disponible de forma instantánea sin instalaciones en: https://gmph2007.github.io/HercarBOT/</w:t>
+        <w:t>Acceso inmediato sin instalaciones en: https://gmph2007.github.io/HercarBOT/</w:t>
       </w:r>
     </w:p>
     <w:p>
@@ -2319,7 +2488,7 @@
           <w:color w:val="1E293B"/>
           <w:sz w:val="21"/>
         </w:rPr>
-        <w:t>Descargar el proyecto desde GitHub y hacer doble clic en el archivo Iniciar_HercarBOT.bat. Este lanzador inicia el microservicio local de voz neural y abre el navegador automáticamente en http://localhost:8080.</w:t>
+        <w:t>Doble clic sobre el archivo Iniciar_HercarBOT.bat para activar el microservicio local de voz de estudio en http://localhost:8080.</w:t>
       </w:r>
     </w:p>
     <w:p>
@@ -2435,6 +2604,82 @@
           <w:sz w:val="21"/>
         </w:rPr>
         <w:t>https://sistema.ieshercar.com/Consulta_Boletas/index.php</w:t>
+      </w:r>
+    </w:p>
+    <w:p>
+      <w:pPr>
+        <w:pStyle w:val="ListBullet"/>
+        <w:spacing w:after="60" w:line="276" w:lineRule="auto"/>
+      </w:pPr>
+      <w:r>
+        <w:rPr>
+          <w:rFonts w:ascii="Arial" w:hAnsi="Arial"/>
+          <w:b/>
+          <w:color w:val="1E293B"/>
+          <w:sz w:val="21"/>
+        </w:rPr>
+        <w:t xml:space="preserve">Repositorio Oficial GitHub: </w:t>
+      </w:r>
+      <w:r>
+        <w:rPr>
+          <w:rFonts w:ascii="Arial" w:hAnsi="Arial"/>
+          <w:color w:val="1E293B"/>
+          <w:sz w:val="21"/>
+        </w:rPr>
+        <w:t>https://github.com/GMPH2007/HercarBOT</w:t>
+      </w:r>
+    </w:p>
+    <w:p>
+      <w:pPr>
+        <w:spacing w:before="360" w:after="120"/>
+      </w:pPr>
+      <w:r>
+        <w:rPr>
+          <w:rFonts w:ascii="Arial" w:hAnsi="Arial"/>
+          <w:b/>
+          <w:color w:val="13357B"/>
+          <w:sz w:val="28"/>
+        </w:rPr>
+        <w:t>11. CONCLUSIONES</w:t>
+      </w:r>
+    </w:p>
+    <w:p>
+      <w:pPr>
+        <w:spacing w:after="120" w:line="276" w:lineRule="auto"/>
+      </w:pPr>
+      <w:r>
+        <w:rPr>
+          <w:rFonts w:ascii="Arial" w:hAnsi="Arial"/>
+          <w:color w:val="1E293B"/>
+          <w:sz w:val="21"/>
+        </w:rPr>
+        <w:t>1. La implementación de una Red Neuronal Perceptrón Multicapa (MLP) ejecutada 100% en el cliente posiciona a HercarIA y a la carrera de APSTI a la vanguardia de la innovación tecnológica en la Región Piura, demostrando que la Inteligencia Artificial de alto rendimiento es viable en navegadores web sin incurrir en costos de infraestructura.</w:t>
+      </w:r>
+    </w:p>
+    <w:p>
+      <w:pPr>
+        <w:spacing w:after="120" w:line="276" w:lineRule="auto"/>
+      </w:pPr>
+      <w:r>
+        <w:rPr>
+          <w:rFonts w:ascii="Arial" w:hAnsi="Arial"/>
+          <w:color w:val="1E293B"/>
+          <w:sz w:val="21"/>
+        </w:rPr>
+        <w:t>2. Las herramientas integradas de Simulador TUPA 2026, Mapa del Campus, Inspector Neuronal y Orientador Vocacional ofrecen una experiencia pedagógica e interactiva integral, transformando a HercarIA en una plataforma institucional de referencia para el IESTP Hermanos Cárcamo.</w:t>
+      </w:r>
+    </w:p>
+    <w:p>
+      <w:pPr>
+        <w:spacing w:after="120" w:line="276" w:lineRule="auto"/>
+      </w:pPr>
+      <w:r>
+        <w:rPr>
+          <w:rFonts w:ascii="Arial" w:hAnsi="Arial"/>
+          <w:color w:val="1E293B"/>
+          <w:sz w:val="21"/>
+        </w:rPr>
+        <w:t>3. La calibración acústica femenina dulce, libre de sintaxis Markdown, combinada con la interfaz sobria inspirada en ChatGPT, asegura un trato cálido, humano y profesional para toda la juventud estudiantil paiteña.</w:t>
       </w:r>
     </w:p>
     <w:sectPr>

</xml_diff>

<commit_message>
v5.1: Conocimiento enciclopedico (mallas, titulacion, becas), interfaz limpia sin indicadores invasivos y red neuronal ampliada (INFORME_TECNICO_HERCARBOT.docx)
</commit_message>
<xml_diff>
--- a/INFORME_TECNICO_HERCARBOT.docx
+++ b/INFORME_TECNICO_HERCARBOT.docx
@@ -152,7 +152,7 @@
           <w:color w:val="7C3AED"/>
           <w:sz w:val="21"/>
         </w:rPr>
-        <w:t>Versión 5.0 Neuronal APSTI (Producción Estable)</w:t>
+        <w:t>Versión 5.1 Neuronal APSTI Ampliada (Producción Estable)</w:t>
         <w:br/>
         <w:br/>
       </w:r>
@@ -230,7 +230,7 @@
           <w:color w:val="1E293B"/>
           <w:sz w:val="21"/>
         </w:rPr>
-        <w:t>El presente informe técnico expone la fundamentación de ingeniería, diseño arquitectónico, desarrollo algorítmico y despliegue del sistema "HercarIA v5.0", una plataforma de Inteligencia Artificial conversacional de última generación concebida para el Instituto de Educación Superior Tecnológico Público "Hermanos Cárcamo" de Paita.</w:t>
+        <w:t>El presente informe técnico expone la fundamentación de ingeniería, diseño arquitectónico, desarrollo algorítmico y despliegue del sistema "HercarIA v5.1", una plataforma de Inteligencia Artificial conversacional de última generación concebida para el Instituto de Educación Superior Tecnológico Público "Hermanos Cárcamo" de Paita.</w:t>
       </w:r>
     </w:p>
     <w:p>
@@ -243,7 +243,7 @@
           <w:color w:val="1E293B"/>
           <w:sz w:val="21"/>
         </w:rPr>
-        <w:t>Desarrollado en el seno formativo de la Carrera Profesional Técnica de Arquitectura de Plataformas y Servicios de Tecnologías de la Información (APSTI), HercarIA integra por primera vez en la educación técnica regional una Red Neuronal Artificial Perceptrón Multicapa (MLP) ejecutada íntegramente en el cliente (Browser Client-Side Deep Learning), con vectorización TF-IDF, activación LeakyReLU y Tanh, y distribución Softmax de intenciones con latencia inferior a 5 milisegundos.</w:t>
+        <w:t>Desarrollado en el seno formativo de la Carrera Profesional Técnica de Arquitectura de Plataformas y Servicios de Tecnologías de la Información (APSTI), HercarIA integra una Red Neuronal Artificial Perceptrón Multicapa (MLP) ejecutada íntegramente en el cliente (Browser Client-Side Deep Learning) con vectorización TF-IDF, activación LeakyReLU y Tanh, distribución Softmax de intenciones con latencia inferior a 5 milisegundos, y un motor de recuperación semántica enciclopédico.</w:t>
       </w:r>
     </w:p>
     <w:p>
@@ -256,7 +256,7 @@
           <w:color w:val="1E293B"/>
           <w:sz w:val="21"/>
         </w:rPr>
-        <w:t>Asimismo, el sistema cuenta con síntesis vocal femenina neural dulce y humana, un Orientador Vocacional Psicométrico de 6 reactivos ponderados, un Simulador Interactivo de Matrícula y Tasas TUPA 2026, un Mapa Arquitectónico Digital del Campus, un Inspector Visual de Red Neuronal con Playground de inferencia en tiempo real, chips contextuales inteligentes de seguimiento y descarga de historiales en formato formal.</w:t>
+        <w:t>La versión 5.1 expande masivamente el conocimiento institucional para responder consultas detalladas sobre mallas curriculares ciclo por ciclo, temarios del examen de admisión, trámites de titulación y prácticas EFSRT, Beca 18 (PRONABEC), carné de medio pasaje, rutas de transporte desde Piura y Sullana, el sistema SIGA web y la biblioteca virtual. Asimismo, refina ergonómicamente la interfaz ocultando indicadores o botones toscos de IA para brindar una experiencia de usuario limpia, sobria, humana y profesional similar a ChatGPT.</w:t>
       </w:r>
     </w:p>
     <w:p>

</xml_diff>

<commit_message>
v6.0: Panel de Administracion & Arquitectura Hibrida Multi-API (Gemini, OpenAI, Groq), Local Neural Fallback, Custom KB y Metricas (INFORME_TECNICO_HERCARBOT.docx)
</commit_message>
<xml_diff>
--- a/INFORME_TECNICO_HERCARBOT.docx
+++ b/INFORME_TECNICO_HERCARBOT.docx
@@ -93,9 +93,9 @@
         </w:rPr>
         <w:t>Desarrollo e Implementación del Asistente Virtual Inteligente "HercarIA"</w:t>
         <w:br/>
-        <w:t>Dotado de Red Neuronal Artificial Multicapa (MLP), Síntesis Vocal Femenina Humana,</w:t>
+        <w:t>Dotado de Arquitectura Híbrida Multi-API (Gemini, OpenAI, Groq), Red Neuronal Local APSTI (MLP),</w:t>
         <w:br/>
-        <w:t>Simulador TUPA 2026 y Mapa Arquitectónico Interactivo</w:t>
+        <w:t>Panel de Administración con Métricas, Síntesis Vocal Femenina Humana y Simulador TUPA 2026</w:t>
       </w:r>
     </w:p>
     <w:p>
@@ -152,7 +152,7 @@
           <w:color w:val="7C3AED"/>
           <w:sz w:val="21"/>
         </w:rPr>
-        <w:t>Versión 5.1 Neuronal APSTI Ampliada (Producción Estable)</w:t>
+        <w:t>Versión 6.0 Arquitectura Híbrida Multi-API &amp; Red Neuronal APSTI (Producción Estable)</w:t>
         <w:br/>
         <w:br/>
       </w:r>
@@ -1508,6 +1508,171 @@
     </w:p>
     <w:p>
       <w:pPr>
+        <w:spacing w:before="240" w:after="80"/>
+      </w:pPr>
+      <w:r>
+        <w:rPr>
+          <w:rFonts w:ascii="Arial" w:hAnsi="Arial"/>
+          <w:b/>
+          <w:color w:val="2563EB"/>
+          <w:sz w:val="24"/>
+        </w:rPr>
+        <w:t>6.5. Panel de Administración &amp; Arquitectura Híbrida Multi-API (v6.0 APSTI)</w:t>
+      </w:r>
+    </w:p>
+    <w:p>
+      <w:pPr>
+        <w:spacing w:after="120" w:line="276" w:lineRule="auto"/>
+      </w:pPr>
+      <w:r>
+        <w:rPr>
+          <w:rFonts w:ascii="Arial" w:hAnsi="Arial"/>
+          <w:color w:val="1E293B"/>
+          <w:sz w:val="21"/>
+        </w:rPr>
+        <w:t>Para dotar a la institución y a los evaluadores de APSTI de control total sobre el motor de inteligencia, la versión 6.0 introduce un completo Panel de Administración y Configuración institucional, accesible desde el botón "⚙️ Panel Admin" del menú lateral o mediante el comando directo "/admin":</w:t>
+      </w:r>
+    </w:p>
+    <w:p>
+      <w:pPr>
+        <w:pStyle w:val="ListBullet"/>
+        <w:spacing w:after="60" w:line="276" w:lineRule="auto"/>
+      </w:pPr>
+      <w:r>
+        <w:rPr>
+          <w:rFonts w:ascii="Arial" w:hAnsi="Arial"/>
+          <w:b/>
+          <w:color w:val="1E293B"/>
+          <w:sz w:val="21"/>
+        </w:rPr>
+        <w:t xml:space="preserve">Soporte Multi-Proveedor de Modelos Cloud: </w:t>
+      </w:r>
+      <w:r>
+        <w:rPr>
+          <w:rFonts w:ascii="Arial" w:hAnsi="Arial"/>
+          <w:color w:val="1E293B"/>
+          <w:sz w:val="21"/>
+        </w:rPr>
+        <w:t>Conexión nativa mediante Fetch API en el navegador a Google Gemini (gemini-1.5-flash, gemini-1.5-pro, gemini-2.0-flash), OpenAI (gpt-4o, gpt-4o-mini, gpt-3.5-turbo), Groq (Llama 3.1 8B, Llama 3.3 70B, Mixtral 8x7B), OpenRouter y DeepSeek API.</w:t>
+      </w:r>
+    </w:p>
+    <w:p>
+      <w:pPr>
+        <w:pStyle w:val="ListBullet"/>
+        <w:spacing w:after="60" w:line="276" w:lineRule="auto"/>
+      </w:pPr>
+      <w:r>
+        <w:rPr>
+          <w:rFonts w:ascii="Arial" w:hAnsi="Arial"/>
+          <w:b/>
+          <w:color w:val="1E293B"/>
+          <w:sz w:val="21"/>
+        </w:rPr>
+        <w:t xml:space="preserve">Modo Híbrido Resiliente con Fallback Automático: </w:t>
+      </w:r>
+      <w:r>
+        <w:rPr>
+          <w:rFonts w:ascii="Arial" w:hAnsi="Arial"/>
+          <w:color w:val="1E293B"/>
+          <w:sz w:val="21"/>
+        </w:rPr>
+        <w:t>Si se provee una API Key, el sistema aprovecha el modelo generativo en la nube para consultas complejas. Ante caídas de conexión externa o agotamiento de cuota (HTTP 429), conmuta de inmediato a la Red Neuronal Local APSTI (MLP) sin que el usuario experimente interrupción alguna.</w:t>
+      </w:r>
+    </w:p>
+    <w:p>
+      <w:pPr>
+        <w:pStyle w:val="ListBullet"/>
+        <w:spacing w:after="60" w:line="276" w:lineRule="auto"/>
+      </w:pPr>
+      <w:r>
+        <w:rPr>
+          <w:rFonts w:ascii="Arial" w:hAnsi="Arial"/>
+          <w:b/>
+          <w:color w:val="1E293B"/>
+          <w:sz w:val="21"/>
+        </w:rPr>
+        <w:t xml:space="preserve">Prueba de Conexión en Tiempo Real: </w:t>
+      </w:r>
+      <w:r>
+        <w:rPr>
+          <w:rFonts w:ascii="Arial" w:hAnsi="Arial"/>
+          <w:color w:val="1E293B"/>
+          <w:sz w:val="21"/>
+        </w:rPr>
+        <w:t>Verificación instantánea del estado de la clave API con cálculo de latencia de red en milisegundos y retroalimentación mediante insignias visuales.</w:t>
+      </w:r>
+    </w:p>
+    <w:p>
+      <w:pPr>
+        <w:pStyle w:val="ListBullet"/>
+        <w:spacing w:after="60" w:line="276" w:lineRule="auto"/>
+      </w:pPr>
+      <w:r>
+        <w:rPr>
+          <w:rFonts w:ascii="Arial" w:hAnsi="Arial"/>
+          <w:b/>
+          <w:color w:val="1E293B"/>
+          <w:sz w:val="21"/>
+        </w:rPr>
+        <w:t xml:space="preserve">Tablero de Métricas y Registro Forense de Auditoría: </w:t>
+      </w:r>
+      <w:r>
+        <w:rPr>
+          <w:rFonts w:ascii="Arial" w:hAnsi="Arial"/>
+          <w:color w:val="1E293B"/>
+          <w:sz w:val="21"/>
+        </w:rPr>
+        <w:t>Cuadro de mando en vivo con total de consultas, ratio Cloud vs. Local, índice de satisfacción estudiantil (👍/👎), distribución porcentual por carrera y tabla cronológica de consultas con opción de descarga de reporte en formato JSON.</w:t>
+      </w:r>
+    </w:p>
+    <w:p>
+      <w:pPr>
+        <w:pStyle w:val="ListBullet"/>
+        <w:spacing w:after="60" w:line="276" w:lineRule="auto"/>
+      </w:pPr>
+      <w:r>
+        <w:rPr>
+          <w:rFonts w:ascii="Arial" w:hAnsi="Arial"/>
+          <w:b/>
+          <w:color w:val="1E293B"/>
+          <w:sz w:val="21"/>
+        </w:rPr>
+        <w:t xml:space="preserve">Base de Conocimiento Personalizada (Custom KB): </w:t>
+      </w:r>
+      <w:r>
+        <w:rPr>
+          <w:rFonts w:ascii="Arial" w:hAnsi="Arial"/>
+          <w:color w:val="1E293B"/>
+          <w:sz w:val="21"/>
+        </w:rPr>
+        <w:t>Módulo para ingresar preguntas y respuestas oficiales ad hoc (ej. fechas de sustentación, eventos institucionales) almacenadas en LocalStorage con máxima prioridad de respuesta.</w:t>
+      </w:r>
+    </w:p>
+    <w:p>
+      <w:pPr>
+        <w:pStyle w:val="ListBullet"/>
+        <w:spacing w:after="60" w:line="276" w:lineRule="auto"/>
+      </w:pPr>
+      <w:r>
+        <w:rPr>
+          <w:rFonts w:ascii="Arial" w:hAnsi="Arial"/>
+          <w:b/>
+          <w:color w:val="1E293B"/>
+          <w:sz w:val="21"/>
+        </w:rPr>
+        <w:t xml:space="preserve">Editor de Prompt del Sistema Institucional: </w:t>
+      </w:r>
+      <w:r>
+        <w:rPr>
+          <w:rFonts w:ascii="Arial" w:hAnsi="Arial"/>
+          <w:color w:val="1E293B"/>
+          <w:sz w:val="21"/>
+        </w:rPr>
+        <w:t>Área de edición de directrices de identidad y restricciones del asistente, con botón de restauración al texto institucional predeterminado de APSTI con un solo clic.</w:t>
+      </w:r>
+    </w:p>
+    <w:p>
+      <w:pPr>
         <w:spacing w:before="360" w:after="120"/>
       </w:pPr>
       <w:r>
@@ -1979,6 +2144,192 @@
                 <w:sz w:val="19"/>
               </w:rPr>
               <w:t>Perceptrón Multicapa (220-36-18-22) con LeakyReLU, Tanh, Softmax y Backpropagation en browser.</w:t>
+            </w:r>
+          </w:p>
+        </w:tc>
+      </w:tr>
+      <w:tr>
+        <w:tc>
+          <w:tcPr>
+            <w:tcW w:type="dxa" w:w="3120"/>
+            <w:tcMar>
+              <w:top w:w="100" w:type="dxa"/>
+              <w:bottom w:w="100" w:type="dxa"/>
+              <w:left w:w="120" w:type="dxa"/>
+              <w:right w:w="120" w:type="dxa"/>
+            </w:tcMar>
+          </w:tcPr>
+          <w:p>
+            <w:r>
+              <w:rPr>
+                <w:rFonts w:ascii="Arial" w:hAnsi="Arial"/>
+                <w:sz w:val="19"/>
+              </w:rPr>
+              <w:t>Panel de Administración Multi-API</w:t>
+            </w:r>
+          </w:p>
+        </w:tc>
+        <w:tc>
+          <w:tcPr>
+            <w:tcW w:type="dxa" w:w="3120"/>
+            <w:tcMar>
+              <w:top w:w="100" w:type="dxa"/>
+              <w:bottom w:w="100" w:type="dxa"/>
+              <w:left w:w="120" w:type="dxa"/>
+              <w:right w:w="120" w:type="dxa"/>
+            </w:tcMar>
+          </w:tcPr>
+          <w:p>
+            <w:r>
+              <w:rPr>
+                <w:rFonts w:ascii="Arial" w:hAnsi="Arial"/>
+                <w:sz w:val="19"/>
+              </w:rPr>
+              <w:t>Fetch API Nativo (CORS Directo)</w:t>
+            </w:r>
+          </w:p>
+        </w:tc>
+        <w:tc>
+          <w:tcPr>
+            <w:tcW w:type="dxa" w:w="3120"/>
+            <w:tcMar>
+              <w:top w:w="100" w:type="dxa"/>
+              <w:bottom w:w="100" w:type="dxa"/>
+              <w:left w:w="120" w:type="dxa"/>
+              <w:right w:w="120" w:type="dxa"/>
+            </w:tcMar>
+          </w:tcPr>
+          <w:p>
+            <w:r>
+              <w:rPr>
+                <w:rFonts w:ascii="Arial" w:hAnsi="Arial"/>
+                <w:sz w:val="19"/>
+              </w:rPr>
+              <w:t>Integración client-side directa sin servidores intermedios para Google Gemini, OpenAI, Groq, OpenRouter y DeepSeek.</w:t>
+            </w:r>
+          </w:p>
+        </w:tc>
+      </w:tr>
+      <w:tr>
+        <w:tc>
+          <w:tcPr>
+            <w:tcW w:type="dxa" w:w="3120"/>
+            <w:tcMar>
+              <w:top w:w="100" w:type="dxa"/>
+              <w:bottom w:w="100" w:type="dxa"/>
+              <w:left w:w="120" w:type="dxa"/>
+              <w:right w:w="120" w:type="dxa"/>
+            </w:tcMar>
+          </w:tcPr>
+          <w:p>
+            <w:r>
+              <w:rPr>
+                <w:rFonts w:ascii="Arial" w:hAnsi="Arial"/>
+                <w:sz w:val="19"/>
+              </w:rPr>
+              <w:t>Métricas y Registro de Auditoría</w:t>
+            </w:r>
+          </w:p>
+        </w:tc>
+        <w:tc>
+          <w:tcPr>
+            <w:tcW w:type="dxa" w:w="3120"/>
+            <w:tcMar>
+              <w:top w:w="100" w:type="dxa"/>
+              <w:bottom w:w="100" w:type="dxa"/>
+              <w:left w:w="120" w:type="dxa"/>
+              <w:right w:w="120" w:type="dxa"/>
+            </w:tcMar>
+          </w:tcPr>
+          <w:p>
+            <w:r>
+              <w:rPr>
+                <w:rFonts w:ascii="Arial" w:hAnsi="Arial"/>
+                <w:sz w:val="19"/>
+              </w:rPr>
+              <w:t>HTML5 LocalStorage + JSON Export</w:t>
+            </w:r>
+          </w:p>
+        </w:tc>
+        <w:tc>
+          <w:tcPr>
+            <w:tcW w:type="dxa" w:w="3120"/>
+            <w:tcMar>
+              <w:top w:w="100" w:type="dxa"/>
+              <w:bottom w:w="100" w:type="dxa"/>
+              <w:left w:w="120" w:type="dxa"/>
+              <w:right w:w="120" w:type="dxa"/>
+            </w:tcMar>
+          </w:tcPr>
+          <w:p>
+            <w:r>
+              <w:rPr>
+                <w:rFonts w:ascii="Arial" w:hAnsi="Arial"/>
+                <w:sz w:val="19"/>
+              </w:rPr>
+              <w:t>Panel de métricas en tiempo real, trazabilidad forense de consultas e índice de satisfacción del usuario.</w:t>
+            </w:r>
+          </w:p>
+        </w:tc>
+      </w:tr>
+      <w:tr>
+        <w:tc>
+          <w:tcPr>
+            <w:tcW w:type="dxa" w:w="3120"/>
+            <w:tcMar>
+              <w:top w:w="100" w:type="dxa"/>
+              <w:bottom w:w="100" w:type="dxa"/>
+              <w:left w:w="120" w:type="dxa"/>
+              <w:right w:w="120" w:type="dxa"/>
+            </w:tcMar>
+          </w:tcPr>
+          <w:p>
+            <w:r>
+              <w:rPr>
+                <w:rFonts w:ascii="Arial" w:hAnsi="Arial"/>
+                <w:sz w:val="19"/>
+              </w:rPr>
+              <w:t>Base de Conocimiento y Respaldo</w:t>
+            </w:r>
+          </w:p>
+        </w:tc>
+        <w:tc>
+          <w:tcPr>
+            <w:tcW w:type="dxa" w:w="3120"/>
+            <w:tcMar>
+              <w:top w:w="100" w:type="dxa"/>
+              <w:bottom w:w="100" w:type="dxa"/>
+              <w:left w:w="120" w:type="dxa"/>
+              <w:right w:w="120" w:type="dxa"/>
+            </w:tcMar>
+          </w:tcPr>
+          <w:p>
+            <w:r>
+              <w:rPr>
+                <w:rFonts w:ascii="Arial" w:hAnsi="Arial"/>
+                <w:sz w:val="19"/>
+              </w:rPr>
+              <w:t>Memoria Institucional + Custom KB</w:t>
+            </w:r>
+          </w:p>
+        </w:tc>
+        <w:tc>
+          <w:tcPr>
+            <w:tcW w:type="dxa" w:w="3120"/>
+            <w:tcMar>
+              <w:top w:w="100" w:type="dxa"/>
+              <w:bottom w:w="100" w:type="dxa"/>
+              <w:left w:w="120" w:type="dxa"/>
+              <w:right w:w="120" w:type="dxa"/>
+            </w:tcMar>
+          </w:tcPr>
+          <w:p>
+            <w:r>
+              <w:rPr>
+                <w:rFonts w:ascii="Arial" w:hAnsi="Arial"/>
+                <w:sz w:val="19"/>
+              </w:rPr>
+              <w:t>Respuestas inmediatas oficiales, banco de preguntas personalizables y fallback instantáneo ante fallas externas.</w:t>
             </w:r>
           </w:p>
         </w:tc>

</xml_diff>

<commit_message>
v7.6: Cuentas Banco de la Nación (00-631-018241 y CCI), eliminación de botón flotante y chip interactivo (INFORME_TECNICO_HERCARBOT.docx)
</commit_message>
<xml_diff>
--- a/INFORME_TECNICO_HERCARBOT.docx
+++ b/INFORME_TECNICO_HERCARBOT.docx
@@ -1687,7 +1687,7 @@
           <w:color w:val="2563EB"/>
           <w:sz w:val="24"/>
         </w:rPr>
-        <w:t>3.3. Módulo 2: Centro de Herramientas Flotantes (Hub APSTI)</w:t>
+        <w:t>3.3. Módulo 2: Centro de Herramientas APSTI y Datos Bancarios Oficiales</w:t>
       </w:r>
     </w:p>
     <w:p>
@@ -1702,7 +1702,31 @@
           <w:color w:val="1E293B"/>
           <w:sz w:val="21"/>
         </w:rPr>
-        <w:t>Para evitar saturar el menú lateral izquierdo, todas las herramientas interactivas fueron unificadas en un moderno Centro de Control Flotante (#modal-tools-hub), accesible desde un botón flotante en pantalla, la cabecera superior o la barra lateral:</w:t>
+        <w:t>Para garantizar una interfaz 100% despejada y sin botones invasivos que obstruyan el campo de escritura o las sugerencias, el Centro de Herramientas (#modal-tools-hub) se diseñó con acceso ergonómico desde la barra superior de navegación y el menú lateral, incorporando los módulos clave para postulantes y alumnos:</w:t>
+      </w:r>
+    </w:p>
+    <w:p>
+      <w:pPr>
+        <w:pStyle w:val="ListBullet"/>
+        <w:spacing w:after="60" w:line="288" w:lineRule="auto"/>
+        <w:jc w:val="both"/>
+      </w:pPr>
+      <w:r>
+        <w:rPr>
+          <w:rFonts w:ascii="Arial" w:hAnsi="Arial"/>
+          <w:b/>
+          <w:color w:val="13357B"/>
+          <w:sz w:val="21"/>
+        </w:rPr>
+        <w:t xml:space="preserve">🏦 Módulo de Cuentas Bancarias Oficiales (Banco de la Nación): </w:t>
+      </w:r>
+      <w:r>
+        <w:rPr>
+          <w:rFonts w:ascii="Arial" w:hAnsi="Arial"/>
+          <w:color w:val="1E293B"/>
+          <w:sz w:val="21"/>
+        </w:rPr>
+        <w:t>Integración de las credenciales de recaudo formal del instituto (Cuenta Corriente N° 00-631-018241, CCI N° 018-631-000631018241-73 y RUC 20197087091). HercarIA responde inmediatamente al comando "¿Pásame el número de cuenta?" con tarjetas interactivas dotadas de botones de copiado en un solo toque, enlaces directos a la plataforma de validación de comprobantes (pagos.ieshercar.edu.pe) y descarga de boletas electrónicas.</w:t>
       </w:r>
     </w:p>
     <w:p>
@@ -1726,7 +1750,7 @@
           <w:color w:val="1E293B"/>
           <w:sz w:val="21"/>
         </w:rPr>
-        <w:t>Calculadora interactiva en soles (S/) con desglose para Cachimbos (S/ 150 matrícula + S/ 20 carné + S/ 25 carpeta), Regulares y Trámites de Titulación Modular. Permite copiar el presupuesto formal para llevarlo al Banco de la Nación.</w:t>
+        <w:t>Calculadora interactiva en soles (S/) con desglose para Cachimbos (S/ 100 matrícula + S/ 20 carné + carpeta), Regulares y Trámites de Titulación Modular. Incluye banner institucional con copiado directo de número de cuenta y CCI para el Banco de la Nación.</w:t>
       </w:r>
     </w:p>
     <w:p>

</xml_diff>

<commit_message>
v7.7: Tasas y códigos TUPA de Carpeta Modular (S/ 25 - CARP-25), Inglés Técnico (S/ 400 - ING-400), Matrícula y Simulador (INFORME_TECNICO_HERCARBOT.docx)
</commit_message>
<xml_diff>
--- a/INFORME_TECNICO_HERCARBOT.docx
+++ b/INFORME_TECNICO_HERCARBOT.docx
@@ -1742,6 +1742,30 @@
           <w:color w:val="13357B"/>
           <w:sz w:val="21"/>
         </w:rPr>
+        <w:t xml:space="preserve">📁 Aranceles TUPA de Carpeta Modular (S/ 25.00) e Inglés Técnico (S/ 400.00): </w:t>
+      </w:r>
+      <w:r>
+        <w:rPr>
+          <w:rFonts w:ascii="Arial" w:hAnsi="Arial"/>
+          <w:color w:val="1E293B"/>
+          <w:sz w:val="21"/>
+        </w:rPr>
+        <w:t>Documentación y codificación de las tasas más consultadas por los estudiantes: la Carpeta Modular Pedagógica (S/ 25.00, código CARP-25) exigida para la emisión de certificaciones modulares progresivas, y el Programa de Certificación de Suficiencia en Inglés Técnico (S/ 400.00, código ING-400), requisito legal obligatorio estipulado por la Ley N° 30512 del MINEDU para la obtención del Título Profesional Técnico a Nombre de la Nación.</w:t>
+      </w:r>
+    </w:p>
+    <w:p>
+      <w:pPr>
+        <w:pStyle w:val="ListBullet"/>
+        <w:spacing w:after="60" w:line="288" w:lineRule="auto"/>
+        <w:jc w:val="both"/>
+      </w:pPr>
+      <w:r>
+        <w:rPr>
+          <w:rFonts w:ascii="Arial" w:hAnsi="Arial"/>
+          <w:b/>
+          <w:color w:val="13357B"/>
+          <w:sz w:val="21"/>
+        </w:rPr>
         <w:t xml:space="preserve">🧮 Simulador de Matrícula y Tasas TUPA 2026: </w:t>
       </w:r>
       <w:r>
@@ -1750,7 +1774,7 @@
           <w:color w:val="1E293B"/>
           <w:sz w:val="21"/>
         </w:rPr>
-        <w:t>Calculadora interactiva en soles (S/) con desglose para Cachimbos (S/ 100 matrícula + S/ 20 carné + carpeta), Regulares y Trámites de Titulación Modular. Incluye banner institucional con copiado directo de número de cuenta y CCI para el Banco de la Nación.</w:t>
+        <w:t>Calculadora interactiva en soles (S/) con desglose transparente: Matrícula Semestral Regular (S/ 100.00), Carpeta Modular (S/ 25.00), Inglés Técnico (S/ 400.00), Carnet de Estudiante (S/ 20.00) y Certificado Modular (S/ 35.00). Incluye banner institucional con copiado directo de número de cuenta y CCI para el Banco de la Nación.</w:t>
       </w:r>
     </w:p>
     <w:p>

</xml_diff>